<commit_message>
hampir banget ini beres
</commit_message>
<xml_diff>
--- a/laporan/Implementasi Algoritma Random Forest untuk Prediksi Tingkat Burnout Mahasiswa Berdasarkan Faktor Akademik dan Gaya Hidup.docx
+++ b/laporan/Implementasi Algoritma Random Forest untuk Prediksi Tingkat Burnout Mahasiswa Berdasarkan Faktor Akademik dan Gaya Hidup.docx
@@ -31,7 +31,27 @@
           <w:sz w:val="30"/>
           <w:szCs w:val="30"/>
         </w:rPr>
-        <w:t>Implementasi Algoritma Random Forest untuk Memprediksi Tingkat Burnout Mahasiswa Berdasarkan Faktor Akademik dan Gaya Hidup</w:t>
+        <w:t xml:space="preserve">Implementasi Algoritma Random Forest untuk Prediksi Tingkat Burnout </w:t>
+      </w:r>
+      <w:r>
+        <w:rPr>
+          <w:rFonts w:ascii="Times New Roman" w:eastAsia="Times New Roman" w:hAnsi="Times New Roman" w:cs="Times New Roman"/>
+          <w:b/>
+          <w:bCs/>
+          <w:sz w:val="30"/>
+          <w:szCs w:val="30"/>
+        </w:rPr>
+        <w:t>Mahasiswa</w:t>
+      </w:r>
+      <w:r>
+        <w:rPr>
+          <w:rFonts w:ascii="Times New Roman" w:eastAsia="Times New Roman" w:hAnsi="Times New Roman" w:cs="Times New Roman"/>
+          <w:b/>
+          <w:bCs/>
+          <w:sz w:val="30"/>
+          <w:szCs w:val="30"/>
+        </w:rPr>
+        <w:t xml:space="preserve"> Berdasarkan Faktor Akademik dan Gaya Hidup</w:t>
       </w:r>
     </w:p>
     <w:p>
@@ -58,13 +78,13 @@
           <w:noProof/>
         </w:rPr>
         <w:drawing>
-          <wp:anchor distT="114300" distB="114300" distL="114300" distR="114300" simplePos="0" relativeHeight="251658240" behindDoc="0" locked="0" layoutInCell="1" hidden="0" allowOverlap="1" wp14:anchorId="3B31BCE4" wp14:editId="2FBD2339">
+          <wp:anchor distT="114300" distB="114300" distL="114300" distR="114300" simplePos="0" relativeHeight="251658240" behindDoc="0" locked="0" layoutInCell="1" hidden="0" allowOverlap="1" wp14:anchorId="3B31BCE4" wp14:editId="1AE7F611">
             <wp:simplePos x="0" y="0"/>
             <wp:positionH relativeFrom="margin">
               <wp:align>center</wp:align>
             </wp:positionH>
             <wp:positionV relativeFrom="paragraph">
-              <wp:posOffset>3810</wp:posOffset>
+              <wp:posOffset>22437</wp:posOffset>
             </wp:positionV>
             <wp:extent cx="2711288" cy="2711288"/>
             <wp:effectExtent l="0" t="0" r="0" b="0"/>
@@ -79,7 +99,7 @@
                     <pic:cNvPicPr preferRelativeResize="0"/>
                   </pic:nvPicPr>
                   <pic:blipFill>
-                    <a:blip r:embed="rId6"/>
+                    <a:blip r:embed="rId8"/>
                     <a:srcRect/>
                     <a:stretch>
                       <a:fillRect/>
@@ -184,7 +204,15 @@
     </w:p>
     <w:p>
       <w:pPr>
-        <w:jc w:val="center"/>
+        <w:rPr>
+          <w:rFonts w:ascii="Times New Roman" w:eastAsia="Times New Roman" w:hAnsi="Times New Roman" w:cs="Times New Roman"/>
+          <w:sz w:val="26"/>
+          <w:szCs w:val="26"/>
+        </w:rPr>
+      </w:pPr>
+    </w:p>
+    <w:p>
+      <w:pPr>
         <w:rPr>
           <w:rFonts w:ascii="Times New Roman" w:eastAsia="Times New Roman" w:hAnsi="Times New Roman" w:cs="Times New Roman"/>
           <w:sz w:val="26"/>
@@ -394,7 +422,23 @@
           <w:sz w:val="26"/>
           <w:szCs w:val="26"/>
         </w:rPr>
-        <w:t>1. Farisa Hilmi 20240040060</w:t>
+        <w:t>1. Farisa Hilmi</w:t>
+      </w:r>
+      <w:r>
+        <w:rPr>
+          <w:rFonts w:ascii="Times New Roman" w:eastAsia="Times New Roman" w:hAnsi="Times New Roman" w:cs="Times New Roman"/>
+          <w:sz w:val="26"/>
+          <w:szCs w:val="26"/>
+        </w:rPr>
+        <w:t>_</w:t>
+      </w:r>
+      <w:r>
+        <w:rPr>
+          <w:rFonts w:ascii="Times New Roman" w:eastAsia="Times New Roman" w:hAnsi="Times New Roman" w:cs="Times New Roman"/>
+          <w:sz w:val="26"/>
+          <w:szCs w:val="26"/>
+        </w:rPr>
+        <w:t>20240040060</w:t>
       </w:r>
     </w:p>
     <w:p>
@@ -412,7 +456,23 @@
           <w:sz w:val="26"/>
           <w:szCs w:val="26"/>
         </w:rPr>
-        <w:t>2. Yusac Ardian Dwi Chandra 20240040189</w:t>
+        <w:t>2. Yusac Ardian Dwi Chandra</w:t>
+      </w:r>
+      <w:r>
+        <w:rPr>
+          <w:rFonts w:ascii="Times New Roman" w:eastAsia="Times New Roman" w:hAnsi="Times New Roman" w:cs="Times New Roman"/>
+          <w:sz w:val="26"/>
+          <w:szCs w:val="26"/>
+        </w:rPr>
+        <w:t>_</w:t>
+      </w:r>
+      <w:r>
+        <w:rPr>
+          <w:rFonts w:ascii="Times New Roman" w:eastAsia="Times New Roman" w:hAnsi="Times New Roman" w:cs="Times New Roman"/>
+          <w:sz w:val="26"/>
+          <w:szCs w:val="26"/>
+        </w:rPr>
+        <w:t>20240040189</w:t>
       </w:r>
     </w:p>
     <w:p>
@@ -480,36 +540,6 @@
         </w:rPr>
         <w:t>2026</w:t>
       </w:r>
-    </w:p>
-    <w:p>
-      <w:pPr>
-        <w:jc w:val="center"/>
-        <w:rPr>
-          <w:rFonts w:ascii="Times New Roman" w:eastAsia="Times New Roman" w:hAnsi="Times New Roman" w:cs="Times New Roman"/>
-          <w:sz w:val="26"/>
-          <w:szCs w:val="26"/>
-        </w:rPr>
-      </w:pPr>
-    </w:p>
-    <w:p>
-      <w:pPr>
-        <w:jc w:val="center"/>
-        <w:rPr>
-          <w:rFonts w:ascii="Times New Roman" w:eastAsia="Times New Roman" w:hAnsi="Times New Roman" w:cs="Times New Roman"/>
-          <w:sz w:val="26"/>
-          <w:szCs w:val="26"/>
-        </w:rPr>
-      </w:pPr>
-    </w:p>
-    <w:p>
-      <w:pPr>
-        <w:jc w:val="center"/>
-        <w:rPr>
-          <w:rFonts w:ascii="Times New Roman" w:eastAsia="Times New Roman" w:hAnsi="Times New Roman" w:cs="Times New Roman"/>
-          <w:sz w:val="26"/>
-          <w:szCs w:val="26"/>
-        </w:rPr>
-      </w:pPr>
     </w:p>
     <w:p>
       <w:pPr>
@@ -553,6 +583,7 @@
           <w:szCs w:val="26"/>
           <w:lang w:val="en-ID"/>
         </w:rPr>
+        <w:lastRenderedPageBreak/>
         <w:t>KATA PENGANTAR</w:t>
       </w:r>
     </w:p>
@@ -786,15 +817,15 @@
           <w:rFonts w:ascii="Times New Roman" w:eastAsia="Times New Roman" w:hAnsi="Times New Roman" w:cs="Times New Roman"/>
           <w:lang w:val="en-ID"/>
         </w:rPr>
-        <w:t>proyek</w:t>
-      </w:r>
-      <w:proofErr w:type="spellEnd"/>
-      <w:r>
-        <w:rPr>
-          <w:rFonts w:ascii="Times New Roman" w:eastAsia="Times New Roman" w:hAnsi="Times New Roman" w:cs="Times New Roman"/>
-          <w:lang w:val="en-ID"/>
-        </w:rPr>
-        <w:t xml:space="preserve"> Machine Learning yang </w:t>
+        <w:t>penelitian</w:t>
+      </w:r>
+      <w:proofErr w:type="spellEnd"/>
+      <w:r>
+        <w:rPr>
+          <w:rFonts w:ascii="Times New Roman" w:eastAsia="Times New Roman" w:hAnsi="Times New Roman" w:cs="Times New Roman"/>
+          <w:lang w:val="en-ID"/>
+        </w:rPr>
+        <w:t xml:space="preserve"> yang </w:t>
       </w:r>
       <w:proofErr w:type="spellStart"/>
       <w:r>
@@ -899,7 +930,7 @@
           <w:bCs/>
           <w:lang w:val="en-ID"/>
         </w:rPr>
-        <w:t xml:space="preserve"> Tingkat Burnout </w:t>
+        <w:t xml:space="preserve"> Tingkat Burnout pada </w:t>
       </w:r>
       <w:proofErr w:type="spellStart"/>
       <w:r>
@@ -1092,23 +1123,23 @@
           <w:rFonts w:ascii="Times New Roman" w:eastAsia="Times New Roman" w:hAnsi="Times New Roman" w:cs="Times New Roman"/>
           <w:lang w:val="en-ID"/>
         </w:rPr>
-        <w:t>pemenuhan</w:t>
-      </w:r>
-      <w:proofErr w:type="spellEnd"/>
-      <w:r>
-        <w:rPr>
-          <w:rFonts w:ascii="Times New Roman" w:eastAsia="Times New Roman" w:hAnsi="Times New Roman" w:cs="Times New Roman"/>
-          <w:lang w:val="en-ID"/>
-        </w:rPr>
-        <w:t xml:space="preserve"> </w:t>
-      </w:r>
-      <w:proofErr w:type="spellStart"/>
-      <w:r>
-        <w:rPr>
-          <w:rFonts w:ascii="Times New Roman" w:eastAsia="Times New Roman" w:hAnsi="Times New Roman" w:cs="Times New Roman"/>
-          <w:lang w:val="en-ID"/>
-        </w:rPr>
-        <w:t>tugas</w:t>
+        <w:t>pelaksanaan</w:t>
+      </w:r>
+      <w:proofErr w:type="spellEnd"/>
+      <w:r>
+        <w:rPr>
+          <w:rFonts w:ascii="Times New Roman" w:eastAsia="Times New Roman" w:hAnsi="Times New Roman" w:cs="Times New Roman"/>
+          <w:lang w:val="en-ID"/>
+        </w:rPr>
+        <w:t xml:space="preserve"> </w:t>
+      </w:r>
+      <w:proofErr w:type="spellStart"/>
+      <w:r>
+        <w:rPr>
+          <w:rFonts w:ascii="Times New Roman" w:eastAsia="Times New Roman" w:hAnsi="Times New Roman" w:cs="Times New Roman"/>
+          <w:lang w:val="en-ID"/>
+        </w:rPr>
+        <w:t>penelitian</w:t>
       </w:r>
       <w:proofErr w:type="spellEnd"/>
       <w:r>
@@ -1124,23 +1155,167 @@
           <w:rFonts w:ascii="Times New Roman" w:eastAsia="Times New Roman" w:hAnsi="Times New Roman" w:cs="Times New Roman"/>
           <w:lang w:val="en-ID"/>
         </w:rPr>
-        <w:t>mata</w:t>
-      </w:r>
-      <w:proofErr w:type="spellEnd"/>
-      <w:r>
-        <w:rPr>
-          <w:rFonts w:ascii="Times New Roman" w:eastAsia="Times New Roman" w:hAnsi="Times New Roman" w:cs="Times New Roman"/>
-          <w:lang w:val="en-ID"/>
-        </w:rPr>
-        <w:t xml:space="preserve"> </w:t>
-      </w:r>
-      <w:proofErr w:type="spellStart"/>
-      <w:r>
-        <w:rPr>
-          <w:rFonts w:ascii="Times New Roman" w:eastAsia="Times New Roman" w:hAnsi="Times New Roman" w:cs="Times New Roman"/>
-          <w:lang w:val="en-ID"/>
-        </w:rPr>
-        <w:t>kuliah</w:t>
+        <w:t>bidang</w:t>
+      </w:r>
+      <w:proofErr w:type="spellEnd"/>
+      <w:r>
+        <w:rPr>
+          <w:rFonts w:ascii="Times New Roman" w:eastAsia="Times New Roman" w:hAnsi="Times New Roman" w:cs="Times New Roman"/>
+          <w:lang w:val="en-ID"/>
+        </w:rPr>
+        <w:t xml:space="preserve"> </w:t>
+      </w:r>
+      <w:r>
+        <w:rPr>
+          <w:rFonts w:ascii="Times New Roman" w:eastAsia="Times New Roman" w:hAnsi="Times New Roman" w:cs="Times New Roman"/>
+          <w:i/>
+          <w:iCs/>
+          <w:lang w:val="en-ID"/>
+        </w:rPr>
+        <w:t>Machine Learning</w:t>
+      </w:r>
+      <w:r>
+        <w:rPr>
+          <w:rFonts w:ascii="Times New Roman" w:eastAsia="Times New Roman" w:hAnsi="Times New Roman" w:cs="Times New Roman"/>
+          <w:lang w:val="en-ID"/>
+        </w:rPr>
+        <w:t xml:space="preserve">. </w:t>
+      </w:r>
+      <w:proofErr w:type="spellStart"/>
+      <w:r>
+        <w:rPr>
+          <w:rFonts w:ascii="Times New Roman" w:eastAsia="Times New Roman" w:hAnsi="Times New Roman" w:cs="Times New Roman"/>
+          <w:lang w:val="en-ID"/>
+        </w:rPr>
+        <w:t>Melalui</w:t>
+      </w:r>
+      <w:proofErr w:type="spellEnd"/>
+      <w:r>
+        <w:rPr>
+          <w:rFonts w:ascii="Times New Roman" w:eastAsia="Times New Roman" w:hAnsi="Times New Roman" w:cs="Times New Roman"/>
+          <w:lang w:val="en-ID"/>
+        </w:rPr>
+        <w:t xml:space="preserve"> </w:t>
+      </w:r>
+      <w:proofErr w:type="spellStart"/>
+      <w:r>
+        <w:rPr>
+          <w:rFonts w:ascii="Times New Roman" w:eastAsia="Times New Roman" w:hAnsi="Times New Roman" w:cs="Times New Roman"/>
+          <w:lang w:val="en-ID"/>
+        </w:rPr>
+        <w:t>penelitian</w:t>
+      </w:r>
+      <w:proofErr w:type="spellEnd"/>
+      <w:r>
+        <w:rPr>
+          <w:rFonts w:ascii="Times New Roman" w:eastAsia="Times New Roman" w:hAnsi="Times New Roman" w:cs="Times New Roman"/>
+          <w:lang w:val="en-ID"/>
+        </w:rPr>
+        <w:t xml:space="preserve"> </w:t>
+      </w:r>
+      <w:proofErr w:type="spellStart"/>
+      <w:r>
+        <w:rPr>
+          <w:rFonts w:ascii="Times New Roman" w:eastAsia="Times New Roman" w:hAnsi="Times New Roman" w:cs="Times New Roman"/>
+          <w:lang w:val="en-ID"/>
+        </w:rPr>
+        <w:t>ini</w:t>
+      </w:r>
+      <w:proofErr w:type="spellEnd"/>
+      <w:r>
+        <w:rPr>
+          <w:rFonts w:ascii="Times New Roman" w:eastAsia="Times New Roman" w:hAnsi="Times New Roman" w:cs="Times New Roman"/>
+          <w:lang w:val="en-ID"/>
+        </w:rPr>
+        <w:t xml:space="preserve">, </w:t>
+      </w:r>
+      <w:proofErr w:type="spellStart"/>
+      <w:r>
+        <w:rPr>
+          <w:rFonts w:ascii="Times New Roman" w:eastAsia="Times New Roman" w:hAnsi="Times New Roman" w:cs="Times New Roman"/>
+          <w:lang w:val="en-ID"/>
+        </w:rPr>
+        <w:t>penulis</w:t>
+      </w:r>
+      <w:proofErr w:type="spellEnd"/>
+      <w:r>
+        <w:rPr>
+          <w:rFonts w:ascii="Times New Roman" w:eastAsia="Times New Roman" w:hAnsi="Times New Roman" w:cs="Times New Roman"/>
+          <w:lang w:val="en-ID"/>
+        </w:rPr>
+        <w:t xml:space="preserve"> </w:t>
+      </w:r>
+      <w:proofErr w:type="spellStart"/>
+      <w:r>
+        <w:rPr>
+          <w:rFonts w:ascii="Times New Roman" w:eastAsia="Times New Roman" w:hAnsi="Times New Roman" w:cs="Times New Roman"/>
+          <w:lang w:val="en-ID"/>
+        </w:rPr>
+        <w:t>menerapkan</w:t>
+      </w:r>
+      <w:proofErr w:type="spellEnd"/>
+      <w:r>
+        <w:rPr>
+          <w:rFonts w:ascii="Times New Roman" w:eastAsia="Times New Roman" w:hAnsi="Times New Roman" w:cs="Times New Roman"/>
+          <w:lang w:val="en-ID"/>
+        </w:rPr>
+        <w:t xml:space="preserve"> </w:t>
+      </w:r>
+      <w:proofErr w:type="spellStart"/>
+      <w:r>
+        <w:rPr>
+          <w:rFonts w:ascii="Times New Roman" w:eastAsia="Times New Roman" w:hAnsi="Times New Roman" w:cs="Times New Roman"/>
+          <w:lang w:val="en-ID"/>
+        </w:rPr>
+        <w:t>konsep</w:t>
+      </w:r>
+      <w:proofErr w:type="spellEnd"/>
+      <w:r>
+        <w:rPr>
+          <w:rFonts w:ascii="Times New Roman" w:eastAsia="Times New Roman" w:hAnsi="Times New Roman" w:cs="Times New Roman"/>
+          <w:lang w:val="en-ID"/>
+        </w:rPr>
+        <w:t xml:space="preserve"> </w:t>
+      </w:r>
+      <w:r>
+        <w:rPr>
+          <w:rFonts w:ascii="Times New Roman" w:eastAsia="Times New Roman" w:hAnsi="Times New Roman" w:cs="Times New Roman"/>
+          <w:i/>
+          <w:iCs/>
+          <w:lang w:val="en-ID"/>
+        </w:rPr>
+        <w:t>supervised learning</w:t>
+      </w:r>
+      <w:r>
+        <w:rPr>
+          <w:rFonts w:ascii="Times New Roman" w:eastAsia="Times New Roman" w:hAnsi="Times New Roman" w:cs="Times New Roman"/>
+          <w:lang w:val="en-ID"/>
+        </w:rPr>
+        <w:t xml:space="preserve"> </w:t>
+      </w:r>
+      <w:proofErr w:type="spellStart"/>
+      <w:r>
+        <w:rPr>
+          <w:rFonts w:ascii="Times New Roman" w:eastAsia="Times New Roman" w:hAnsi="Times New Roman" w:cs="Times New Roman"/>
+          <w:lang w:val="en-ID"/>
+        </w:rPr>
+        <w:t>menggunakan</w:t>
+      </w:r>
+      <w:proofErr w:type="spellEnd"/>
+      <w:r>
+        <w:rPr>
+          <w:rFonts w:ascii="Times New Roman" w:eastAsia="Times New Roman" w:hAnsi="Times New Roman" w:cs="Times New Roman"/>
+          <w:lang w:val="en-ID"/>
+        </w:rPr>
+        <w:t xml:space="preserve"> </w:t>
+      </w:r>
+      <w:proofErr w:type="spellStart"/>
+      <w:r>
+        <w:rPr>
+          <w:rFonts w:ascii="Times New Roman" w:eastAsia="Times New Roman" w:hAnsi="Times New Roman" w:cs="Times New Roman"/>
+          <w:lang w:val="en-ID"/>
+        </w:rPr>
+        <w:t>algoritma</w:t>
       </w:r>
       <w:proofErr w:type="spellEnd"/>
       <w:r>
@@ -1157,56 +1332,248 @@
           <w:bCs/>
           <w:lang w:val="en-ID"/>
         </w:rPr>
-        <w:t>Machine Learning</w:t>
-      </w:r>
-      <w:r>
-        <w:rPr>
-          <w:rFonts w:ascii="Times New Roman" w:eastAsia="Times New Roman" w:hAnsi="Times New Roman" w:cs="Times New Roman"/>
-          <w:lang w:val="en-ID"/>
-        </w:rPr>
-        <w:t xml:space="preserve">. </w:t>
-      </w:r>
-      <w:proofErr w:type="spellStart"/>
-      <w:r>
-        <w:rPr>
-          <w:rFonts w:ascii="Times New Roman" w:eastAsia="Times New Roman" w:hAnsi="Times New Roman" w:cs="Times New Roman"/>
-          <w:lang w:val="en-ID"/>
-        </w:rPr>
-        <w:t>Melalui</w:t>
-      </w:r>
-      <w:proofErr w:type="spellEnd"/>
-      <w:r>
-        <w:rPr>
-          <w:rFonts w:ascii="Times New Roman" w:eastAsia="Times New Roman" w:hAnsi="Times New Roman" w:cs="Times New Roman"/>
-          <w:lang w:val="en-ID"/>
-        </w:rPr>
-        <w:t xml:space="preserve"> </w:t>
-      </w:r>
-      <w:proofErr w:type="spellStart"/>
-      <w:r>
-        <w:rPr>
-          <w:rFonts w:ascii="Times New Roman" w:eastAsia="Times New Roman" w:hAnsi="Times New Roman" w:cs="Times New Roman"/>
-          <w:lang w:val="en-ID"/>
-        </w:rPr>
-        <w:t>proyek</w:t>
-      </w:r>
-      <w:proofErr w:type="spellEnd"/>
-      <w:r>
-        <w:rPr>
-          <w:rFonts w:ascii="Times New Roman" w:eastAsia="Times New Roman" w:hAnsi="Times New Roman" w:cs="Times New Roman"/>
-          <w:lang w:val="en-ID"/>
-        </w:rPr>
-        <w:t xml:space="preserve"> </w:t>
-      </w:r>
-      <w:proofErr w:type="spellStart"/>
-      <w:r>
-        <w:rPr>
-          <w:rFonts w:ascii="Times New Roman" w:eastAsia="Times New Roman" w:hAnsi="Times New Roman" w:cs="Times New Roman"/>
-          <w:lang w:val="en-ID"/>
-        </w:rPr>
-        <w:t>ini</w:t>
-      </w:r>
-      <w:proofErr w:type="spellEnd"/>
+        <w:t>Random Forest</w:t>
+      </w:r>
+      <w:r>
+        <w:rPr>
+          <w:rFonts w:ascii="Times New Roman" w:eastAsia="Times New Roman" w:hAnsi="Times New Roman" w:cs="Times New Roman"/>
+          <w:lang w:val="en-ID"/>
+        </w:rPr>
+        <w:t xml:space="preserve"> </w:t>
+      </w:r>
+      <w:proofErr w:type="spellStart"/>
+      <w:r>
+        <w:rPr>
+          <w:rFonts w:ascii="Times New Roman" w:eastAsia="Times New Roman" w:hAnsi="Times New Roman" w:cs="Times New Roman"/>
+          <w:lang w:val="en-ID"/>
+        </w:rPr>
+        <w:t>untuk</w:t>
+      </w:r>
+      <w:proofErr w:type="spellEnd"/>
+      <w:r>
+        <w:rPr>
+          <w:rFonts w:ascii="Times New Roman" w:eastAsia="Times New Roman" w:hAnsi="Times New Roman" w:cs="Times New Roman"/>
+          <w:lang w:val="en-ID"/>
+        </w:rPr>
+        <w:t xml:space="preserve"> </w:t>
+      </w:r>
+      <w:proofErr w:type="spellStart"/>
+      <w:r>
+        <w:rPr>
+          <w:rFonts w:ascii="Times New Roman" w:eastAsia="Times New Roman" w:hAnsi="Times New Roman" w:cs="Times New Roman"/>
+          <w:lang w:val="en-ID"/>
+        </w:rPr>
+        <w:t>membangun</w:t>
+      </w:r>
+      <w:proofErr w:type="spellEnd"/>
+      <w:r>
+        <w:rPr>
+          <w:rFonts w:ascii="Times New Roman" w:eastAsia="Times New Roman" w:hAnsi="Times New Roman" w:cs="Times New Roman"/>
+          <w:lang w:val="en-ID"/>
+        </w:rPr>
+        <w:t xml:space="preserve"> model </w:t>
+      </w:r>
+      <w:proofErr w:type="spellStart"/>
+      <w:r>
+        <w:rPr>
+          <w:rFonts w:ascii="Times New Roman" w:eastAsia="Times New Roman" w:hAnsi="Times New Roman" w:cs="Times New Roman"/>
+          <w:lang w:val="en-ID"/>
+        </w:rPr>
+        <w:t>prediksi</w:t>
+      </w:r>
+      <w:proofErr w:type="spellEnd"/>
+      <w:r>
+        <w:rPr>
+          <w:rFonts w:ascii="Times New Roman" w:eastAsia="Times New Roman" w:hAnsi="Times New Roman" w:cs="Times New Roman"/>
+          <w:lang w:val="en-ID"/>
+        </w:rPr>
+        <w:t xml:space="preserve"> </w:t>
+      </w:r>
+      <w:proofErr w:type="spellStart"/>
+      <w:r>
+        <w:rPr>
+          <w:rFonts w:ascii="Times New Roman" w:eastAsia="Times New Roman" w:hAnsi="Times New Roman" w:cs="Times New Roman"/>
+          <w:lang w:val="en-ID"/>
+        </w:rPr>
+        <w:t>tingkat</w:t>
+      </w:r>
+      <w:proofErr w:type="spellEnd"/>
+      <w:r>
+        <w:rPr>
+          <w:rFonts w:ascii="Times New Roman" w:eastAsia="Times New Roman" w:hAnsi="Times New Roman" w:cs="Times New Roman"/>
+          <w:lang w:val="en-ID"/>
+        </w:rPr>
+        <w:t xml:space="preserve"> burnout pada </w:t>
+      </w:r>
+      <w:proofErr w:type="spellStart"/>
+      <w:r>
+        <w:rPr>
+          <w:rFonts w:ascii="Times New Roman" w:eastAsia="Times New Roman" w:hAnsi="Times New Roman" w:cs="Times New Roman"/>
+          <w:lang w:val="en-ID"/>
+        </w:rPr>
+        <w:t>siswa</w:t>
+      </w:r>
+      <w:proofErr w:type="spellEnd"/>
+      <w:r>
+        <w:rPr>
+          <w:rFonts w:ascii="Times New Roman" w:eastAsia="Times New Roman" w:hAnsi="Times New Roman" w:cs="Times New Roman"/>
+          <w:lang w:val="en-ID"/>
+        </w:rPr>
+        <w:t xml:space="preserve"> </w:t>
+      </w:r>
+      <w:proofErr w:type="spellStart"/>
+      <w:r>
+        <w:rPr>
+          <w:rFonts w:ascii="Times New Roman" w:eastAsia="Times New Roman" w:hAnsi="Times New Roman" w:cs="Times New Roman"/>
+          <w:lang w:val="en-ID"/>
+        </w:rPr>
+        <w:t>berdasarkan</w:t>
+      </w:r>
+      <w:proofErr w:type="spellEnd"/>
+      <w:r>
+        <w:rPr>
+          <w:rFonts w:ascii="Times New Roman" w:eastAsia="Times New Roman" w:hAnsi="Times New Roman" w:cs="Times New Roman"/>
+          <w:lang w:val="en-ID"/>
+        </w:rPr>
+        <w:t xml:space="preserve"> </w:t>
+      </w:r>
+      <w:proofErr w:type="spellStart"/>
+      <w:r>
+        <w:rPr>
+          <w:rFonts w:ascii="Times New Roman" w:eastAsia="Times New Roman" w:hAnsi="Times New Roman" w:cs="Times New Roman"/>
+          <w:lang w:val="en-ID"/>
+        </w:rPr>
+        <w:t>berbagai</w:t>
+      </w:r>
+      <w:proofErr w:type="spellEnd"/>
+      <w:r>
+        <w:rPr>
+          <w:rFonts w:ascii="Times New Roman" w:eastAsia="Times New Roman" w:hAnsi="Times New Roman" w:cs="Times New Roman"/>
+          <w:lang w:val="en-ID"/>
+        </w:rPr>
+        <w:t xml:space="preserve"> </w:t>
+      </w:r>
+      <w:proofErr w:type="spellStart"/>
+      <w:r>
+        <w:rPr>
+          <w:rFonts w:ascii="Times New Roman" w:eastAsia="Times New Roman" w:hAnsi="Times New Roman" w:cs="Times New Roman"/>
+          <w:lang w:val="en-ID"/>
+        </w:rPr>
+        <w:t>faktor</w:t>
+      </w:r>
+      <w:proofErr w:type="spellEnd"/>
+      <w:r>
+        <w:rPr>
+          <w:rFonts w:ascii="Times New Roman" w:eastAsia="Times New Roman" w:hAnsi="Times New Roman" w:cs="Times New Roman"/>
+          <w:lang w:val="en-ID"/>
+        </w:rPr>
+        <w:t xml:space="preserve"> </w:t>
+      </w:r>
+      <w:proofErr w:type="spellStart"/>
+      <w:r>
+        <w:rPr>
+          <w:rFonts w:ascii="Times New Roman" w:eastAsia="Times New Roman" w:hAnsi="Times New Roman" w:cs="Times New Roman"/>
+          <w:lang w:val="en-ID"/>
+        </w:rPr>
+        <w:t>akademik</w:t>
+      </w:r>
+      <w:proofErr w:type="spellEnd"/>
+      <w:r>
+        <w:rPr>
+          <w:rFonts w:ascii="Times New Roman" w:eastAsia="Times New Roman" w:hAnsi="Times New Roman" w:cs="Times New Roman"/>
+          <w:lang w:val="en-ID"/>
+        </w:rPr>
+        <w:t xml:space="preserve"> dan </w:t>
+      </w:r>
+      <w:proofErr w:type="spellStart"/>
+      <w:r>
+        <w:rPr>
+          <w:rFonts w:ascii="Times New Roman" w:eastAsia="Times New Roman" w:hAnsi="Times New Roman" w:cs="Times New Roman"/>
+          <w:lang w:val="en-ID"/>
+        </w:rPr>
+        <w:t>gaya</w:t>
+      </w:r>
+      <w:proofErr w:type="spellEnd"/>
+      <w:r>
+        <w:rPr>
+          <w:rFonts w:ascii="Times New Roman" w:eastAsia="Times New Roman" w:hAnsi="Times New Roman" w:cs="Times New Roman"/>
+          <w:lang w:val="en-ID"/>
+        </w:rPr>
+        <w:t xml:space="preserve"> </w:t>
+      </w:r>
+      <w:proofErr w:type="spellStart"/>
+      <w:r>
+        <w:rPr>
+          <w:rFonts w:ascii="Times New Roman" w:eastAsia="Times New Roman" w:hAnsi="Times New Roman" w:cs="Times New Roman"/>
+          <w:lang w:val="en-ID"/>
+        </w:rPr>
+        <w:t>hidup</w:t>
+      </w:r>
+      <w:proofErr w:type="spellEnd"/>
+      <w:r>
+        <w:rPr>
+          <w:rFonts w:ascii="Times New Roman" w:eastAsia="Times New Roman" w:hAnsi="Times New Roman" w:cs="Times New Roman"/>
+          <w:lang w:val="en-ID"/>
+        </w:rPr>
+        <w:t xml:space="preserve">. Proses </w:t>
+      </w:r>
+      <w:proofErr w:type="spellStart"/>
+      <w:r>
+        <w:rPr>
+          <w:rFonts w:ascii="Times New Roman" w:eastAsia="Times New Roman" w:hAnsi="Times New Roman" w:cs="Times New Roman"/>
+          <w:lang w:val="en-ID"/>
+        </w:rPr>
+        <w:t>penelitian</w:t>
+      </w:r>
+      <w:proofErr w:type="spellEnd"/>
+      <w:r>
+        <w:rPr>
+          <w:rFonts w:ascii="Times New Roman" w:eastAsia="Times New Roman" w:hAnsi="Times New Roman" w:cs="Times New Roman"/>
+          <w:lang w:val="en-ID"/>
+        </w:rPr>
+        <w:t xml:space="preserve"> </w:t>
+      </w:r>
+      <w:proofErr w:type="spellStart"/>
+      <w:r>
+        <w:rPr>
+          <w:rFonts w:ascii="Times New Roman" w:eastAsia="Times New Roman" w:hAnsi="Times New Roman" w:cs="Times New Roman"/>
+          <w:lang w:val="en-ID"/>
+        </w:rPr>
+        <w:t>meliputi</w:t>
+      </w:r>
+      <w:proofErr w:type="spellEnd"/>
+      <w:r>
+        <w:rPr>
+          <w:rFonts w:ascii="Times New Roman" w:eastAsia="Times New Roman" w:hAnsi="Times New Roman" w:cs="Times New Roman"/>
+          <w:lang w:val="en-ID"/>
+        </w:rPr>
+        <w:t xml:space="preserve"> </w:t>
+      </w:r>
+      <w:proofErr w:type="spellStart"/>
+      <w:r>
+        <w:rPr>
+          <w:rFonts w:ascii="Times New Roman" w:eastAsia="Times New Roman" w:hAnsi="Times New Roman" w:cs="Times New Roman"/>
+          <w:lang w:val="en-ID"/>
+        </w:rPr>
+        <w:t>pengumpulan</w:t>
+      </w:r>
+      <w:proofErr w:type="spellEnd"/>
+      <w:r>
+        <w:rPr>
+          <w:rFonts w:ascii="Times New Roman" w:eastAsia="Times New Roman" w:hAnsi="Times New Roman" w:cs="Times New Roman"/>
+          <w:lang w:val="en-ID"/>
+        </w:rPr>
+        <w:t xml:space="preserve"> dataset, </w:t>
+      </w:r>
+      <w:r>
+        <w:rPr>
+          <w:rFonts w:ascii="Times New Roman" w:eastAsia="Times New Roman" w:hAnsi="Times New Roman" w:cs="Times New Roman"/>
+          <w:i/>
+          <w:iCs/>
+          <w:lang w:val="en-ID"/>
+        </w:rPr>
+        <w:t>data preprocessing</w:t>
+      </w:r>
       <w:r>
         <w:rPr>
           <w:rFonts w:ascii="Times New Roman" w:eastAsia="Times New Roman" w:hAnsi="Times New Roman" w:cs="Times New Roman"/>
@@ -1220,103 +1587,103 @@
           <w:rFonts w:ascii="Times New Roman" w:eastAsia="Times New Roman" w:hAnsi="Times New Roman" w:cs="Times New Roman"/>
           <w:lang w:val="en-ID"/>
         </w:rPr>
-        <w:t>penulis</w:t>
-      </w:r>
-      <w:proofErr w:type="spellEnd"/>
-      <w:r>
-        <w:rPr>
-          <w:rFonts w:ascii="Times New Roman" w:eastAsia="Times New Roman" w:hAnsi="Times New Roman" w:cs="Times New Roman"/>
-          <w:lang w:val="en-ID"/>
-        </w:rPr>
-        <w:t xml:space="preserve"> </w:t>
-      </w:r>
-      <w:proofErr w:type="spellStart"/>
-      <w:r>
-        <w:rPr>
-          <w:rFonts w:ascii="Times New Roman" w:eastAsia="Times New Roman" w:hAnsi="Times New Roman" w:cs="Times New Roman"/>
-          <w:lang w:val="en-ID"/>
-        </w:rPr>
-        <w:t>menerapkan</w:t>
-      </w:r>
-      <w:proofErr w:type="spellEnd"/>
-      <w:r>
-        <w:rPr>
-          <w:rFonts w:ascii="Times New Roman" w:eastAsia="Times New Roman" w:hAnsi="Times New Roman" w:cs="Times New Roman"/>
-          <w:lang w:val="en-ID"/>
-        </w:rPr>
-        <w:t xml:space="preserve"> </w:t>
-      </w:r>
-      <w:proofErr w:type="spellStart"/>
-      <w:r>
-        <w:rPr>
-          <w:rFonts w:ascii="Times New Roman" w:eastAsia="Times New Roman" w:hAnsi="Times New Roman" w:cs="Times New Roman"/>
-          <w:lang w:val="en-ID"/>
-        </w:rPr>
-        <w:t>konsep</w:t>
-      </w:r>
-      <w:proofErr w:type="spellEnd"/>
-      <w:r>
-        <w:rPr>
-          <w:rFonts w:ascii="Times New Roman" w:eastAsia="Times New Roman" w:hAnsi="Times New Roman" w:cs="Times New Roman"/>
-          <w:lang w:val="en-ID"/>
-        </w:rPr>
-        <w:t xml:space="preserve"> supervised learning </w:t>
-      </w:r>
-      <w:proofErr w:type="spellStart"/>
-      <w:r>
-        <w:rPr>
-          <w:rFonts w:ascii="Times New Roman" w:eastAsia="Times New Roman" w:hAnsi="Times New Roman" w:cs="Times New Roman"/>
-          <w:lang w:val="en-ID"/>
-        </w:rPr>
-        <w:t>menggunakan</w:t>
-      </w:r>
-      <w:proofErr w:type="spellEnd"/>
-      <w:r>
-        <w:rPr>
-          <w:rFonts w:ascii="Times New Roman" w:eastAsia="Times New Roman" w:hAnsi="Times New Roman" w:cs="Times New Roman"/>
-          <w:lang w:val="en-ID"/>
-        </w:rPr>
-        <w:t xml:space="preserve"> </w:t>
-      </w:r>
-      <w:proofErr w:type="spellStart"/>
-      <w:r>
-        <w:rPr>
-          <w:rFonts w:ascii="Times New Roman" w:eastAsia="Times New Roman" w:hAnsi="Times New Roman" w:cs="Times New Roman"/>
-          <w:lang w:val="en-ID"/>
-        </w:rPr>
-        <w:t>algoritma</w:t>
-      </w:r>
-      <w:proofErr w:type="spellEnd"/>
-      <w:r>
-        <w:rPr>
-          <w:rFonts w:ascii="Times New Roman" w:eastAsia="Times New Roman" w:hAnsi="Times New Roman" w:cs="Times New Roman"/>
-          <w:lang w:val="en-ID"/>
-        </w:rPr>
-        <w:t xml:space="preserve"> Random Forest </w:t>
-      </w:r>
-      <w:proofErr w:type="spellStart"/>
-      <w:r>
-        <w:rPr>
-          <w:rFonts w:ascii="Times New Roman" w:eastAsia="Times New Roman" w:hAnsi="Times New Roman" w:cs="Times New Roman"/>
-          <w:lang w:val="en-ID"/>
-        </w:rPr>
-        <w:t>untuk</w:t>
-      </w:r>
-      <w:proofErr w:type="spellEnd"/>
-      <w:r>
-        <w:rPr>
-          <w:rFonts w:ascii="Times New Roman" w:eastAsia="Times New Roman" w:hAnsi="Times New Roman" w:cs="Times New Roman"/>
-          <w:lang w:val="en-ID"/>
-        </w:rPr>
-        <w:t xml:space="preserve"> </w:t>
-      </w:r>
-      <w:proofErr w:type="spellStart"/>
-      <w:r>
-        <w:rPr>
-          <w:rFonts w:ascii="Times New Roman" w:eastAsia="Times New Roman" w:hAnsi="Times New Roman" w:cs="Times New Roman"/>
-          <w:lang w:val="en-ID"/>
-        </w:rPr>
-        <w:t>membangun</w:t>
+        <w:t>eksplorasi</w:t>
+      </w:r>
+      <w:proofErr w:type="spellEnd"/>
+      <w:r>
+        <w:rPr>
+          <w:rFonts w:ascii="Times New Roman" w:eastAsia="Times New Roman" w:hAnsi="Times New Roman" w:cs="Times New Roman"/>
+          <w:lang w:val="en-ID"/>
+        </w:rPr>
+        <w:t xml:space="preserve"> data (</w:t>
+      </w:r>
+      <w:r>
+        <w:rPr>
+          <w:rFonts w:ascii="Times New Roman" w:eastAsia="Times New Roman" w:hAnsi="Times New Roman" w:cs="Times New Roman"/>
+          <w:i/>
+          <w:iCs/>
+          <w:lang w:val="en-ID"/>
+        </w:rPr>
+        <w:t>Exploratory Data Analysis/EDA</w:t>
+      </w:r>
+      <w:r>
+        <w:rPr>
+          <w:rFonts w:ascii="Times New Roman" w:eastAsia="Times New Roman" w:hAnsi="Times New Roman" w:cs="Times New Roman"/>
+          <w:lang w:val="en-ID"/>
+        </w:rPr>
+        <w:t xml:space="preserve">), </w:t>
+      </w:r>
+      <w:proofErr w:type="spellStart"/>
+      <w:r>
+        <w:rPr>
+          <w:rFonts w:ascii="Times New Roman" w:eastAsia="Times New Roman" w:hAnsi="Times New Roman" w:cs="Times New Roman"/>
+          <w:lang w:val="en-ID"/>
+        </w:rPr>
+        <w:t>pembangunan</w:t>
+      </w:r>
+      <w:proofErr w:type="spellEnd"/>
+      <w:r>
+        <w:rPr>
+          <w:rFonts w:ascii="Times New Roman" w:eastAsia="Times New Roman" w:hAnsi="Times New Roman" w:cs="Times New Roman"/>
+          <w:lang w:val="en-ID"/>
+        </w:rPr>
+        <w:t xml:space="preserve"> model, </w:t>
+      </w:r>
+      <w:proofErr w:type="spellStart"/>
+      <w:r>
+        <w:rPr>
+          <w:rFonts w:ascii="Times New Roman" w:eastAsia="Times New Roman" w:hAnsi="Times New Roman" w:cs="Times New Roman"/>
+          <w:lang w:val="en-ID"/>
+        </w:rPr>
+        <w:t>evaluasi</w:t>
+      </w:r>
+      <w:proofErr w:type="spellEnd"/>
+      <w:r>
+        <w:rPr>
+          <w:rFonts w:ascii="Times New Roman" w:eastAsia="Times New Roman" w:hAnsi="Times New Roman" w:cs="Times New Roman"/>
+          <w:lang w:val="en-ID"/>
+        </w:rPr>
+        <w:t xml:space="preserve"> </w:t>
+      </w:r>
+      <w:proofErr w:type="spellStart"/>
+      <w:r>
+        <w:rPr>
+          <w:rFonts w:ascii="Times New Roman" w:eastAsia="Times New Roman" w:hAnsi="Times New Roman" w:cs="Times New Roman"/>
+          <w:lang w:val="en-ID"/>
+        </w:rPr>
+        <w:t>kinerja</w:t>
+      </w:r>
+      <w:proofErr w:type="spellEnd"/>
+      <w:r>
+        <w:rPr>
+          <w:rFonts w:ascii="Times New Roman" w:eastAsia="Times New Roman" w:hAnsi="Times New Roman" w:cs="Times New Roman"/>
+          <w:lang w:val="en-ID"/>
+        </w:rPr>
+        <w:t xml:space="preserve"> model, </w:t>
+      </w:r>
+      <w:proofErr w:type="spellStart"/>
+      <w:r>
+        <w:rPr>
+          <w:rFonts w:ascii="Times New Roman" w:eastAsia="Times New Roman" w:hAnsi="Times New Roman" w:cs="Times New Roman"/>
+          <w:lang w:val="en-ID"/>
+        </w:rPr>
+        <w:t>hingga</w:t>
+      </w:r>
+      <w:proofErr w:type="spellEnd"/>
+      <w:r>
+        <w:rPr>
+          <w:rFonts w:ascii="Times New Roman" w:eastAsia="Times New Roman" w:hAnsi="Times New Roman" w:cs="Times New Roman"/>
+          <w:lang w:val="en-ID"/>
+        </w:rPr>
+        <w:t xml:space="preserve"> </w:t>
+      </w:r>
+      <w:proofErr w:type="spellStart"/>
+      <w:r>
+        <w:rPr>
+          <w:rFonts w:ascii="Times New Roman" w:eastAsia="Times New Roman" w:hAnsi="Times New Roman" w:cs="Times New Roman"/>
+          <w:lang w:val="en-ID"/>
+        </w:rPr>
+        <w:t>implementasi</w:t>
       </w:r>
       <w:proofErr w:type="spellEnd"/>
       <w:r>
@@ -1332,294 +1699,6 @@
           <w:rFonts w:ascii="Times New Roman" w:eastAsia="Times New Roman" w:hAnsi="Times New Roman" w:cs="Times New Roman"/>
           <w:lang w:val="en-ID"/>
         </w:rPr>
-        <w:t>prediksi</w:t>
-      </w:r>
-      <w:proofErr w:type="spellEnd"/>
-      <w:r>
-        <w:rPr>
-          <w:rFonts w:ascii="Times New Roman" w:eastAsia="Times New Roman" w:hAnsi="Times New Roman" w:cs="Times New Roman"/>
-          <w:lang w:val="en-ID"/>
-        </w:rPr>
-        <w:t xml:space="preserve"> </w:t>
-      </w:r>
-      <w:proofErr w:type="spellStart"/>
-      <w:r>
-        <w:rPr>
-          <w:rFonts w:ascii="Times New Roman" w:eastAsia="Times New Roman" w:hAnsi="Times New Roman" w:cs="Times New Roman"/>
-          <w:lang w:val="en-ID"/>
-        </w:rPr>
-        <w:t>tingkat</w:t>
-      </w:r>
-      <w:proofErr w:type="spellEnd"/>
-      <w:r>
-        <w:rPr>
-          <w:rFonts w:ascii="Times New Roman" w:eastAsia="Times New Roman" w:hAnsi="Times New Roman" w:cs="Times New Roman"/>
-          <w:lang w:val="en-ID"/>
-        </w:rPr>
-        <w:t xml:space="preserve"> burnout </w:t>
-      </w:r>
-      <w:proofErr w:type="spellStart"/>
-      <w:r>
-        <w:rPr>
-          <w:rFonts w:ascii="Times New Roman" w:eastAsia="Times New Roman" w:hAnsi="Times New Roman" w:cs="Times New Roman"/>
-          <w:lang w:val="en-ID"/>
-        </w:rPr>
-        <w:t>mahasiswa</w:t>
-      </w:r>
-      <w:proofErr w:type="spellEnd"/>
-      <w:r>
-        <w:rPr>
-          <w:rFonts w:ascii="Times New Roman" w:eastAsia="Times New Roman" w:hAnsi="Times New Roman" w:cs="Times New Roman"/>
-          <w:lang w:val="en-ID"/>
-        </w:rPr>
-        <w:t xml:space="preserve"> </w:t>
-      </w:r>
-      <w:proofErr w:type="spellStart"/>
-      <w:r>
-        <w:rPr>
-          <w:rFonts w:ascii="Times New Roman" w:eastAsia="Times New Roman" w:hAnsi="Times New Roman" w:cs="Times New Roman"/>
-          <w:lang w:val="en-ID"/>
-        </w:rPr>
-        <w:t>berdasarkan</w:t>
-      </w:r>
-      <w:proofErr w:type="spellEnd"/>
-      <w:r>
-        <w:rPr>
-          <w:rFonts w:ascii="Times New Roman" w:eastAsia="Times New Roman" w:hAnsi="Times New Roman" w:cs="Times New Roman"/>
-          <w:lang w:val="en-ID"/>
-        </w:rPr>
-        <w:t xml:space="preserve"> </w:t>
-      </w:r>
-      <w:proofErr w:type="spellStart"/>
-      <w:r>
-        <w:rPr>
-          <w:rFonts w:ascii="Times New Roman" w:eastAsia="Times New Roman" w:hAnsi="Times New Roman" w:cs="Times New Roman"/>
-          <w:lang w:val="en-ID"/>
-        </w:rPr>
-        <w:t>berbagai</w:t>
-      </w:r>
-      <w:proofErr w:type="spellEnd"/>
-      <w:r>
-        <w:rPr>
-          <w:rFonts w:ascii="Times New Roman" w:eastAsia="Times New Roman" w:hAnsi="Times New Roman" w:cs="Times New Roman"/>
-          <w:lang w:val="en-ID"/>
-        </w:rPr>
-        <w:t xml:space="preserve"> </w:t>
-      </w:r>
-      <w:proofErr w:type="spellStart"/>
-      <w:r>
-        <w:rPr>
-          <w:rFonts w:ascii="Times New Roman" w:eastAsia="Times New Roman" w:hAnsi="Times New Roman" w:cs="Times New Roman"/>
-          <w:lang w:val="en-ID"/>
-        </w:rPr>
-        <w:t>faktor</w:t>
-      </w:r>
-      <w:proofErr w:type="spellEnd"/>
-      <w:r>
-        <w:rPr>
-          <w:rFonts w:ascii="Times New Roman" w:eastAsia="Times New Roman" w:hAnsi="Times New Roman" w:cs="Times New Roman"/>
-          <w:lang w:val="en-ID"/>
-        </w:rPr>
-        <w:t xml:space="preserve"> </w:t>
-      </w:r>
-      <w:proofErr w:type="spellStart"/>
-      <w:r>
-        <w:rPr>
-          <w:rFonts w:ascii="Times New Roman" w:eastAsia="Times New Roman" w:hAnsi="Times New Roman" w:cs="Times New Roman"/>
-          <w:lang w:val="en-ID"/>
-        </w:rPr>
-        <w:t>akademik</w:t>
-      </w:r>
-      <w:proofErr w:type="spellEnd"/>
-      <w:r>
-        <w:rPr>
-          <w:rFonts w:ascii="Times New Roman" w:eastAsia="Times New Roman" w:hAnsi="Times New Roman" w:cs="Times New Roman"/>
-          <w:lang w:val="en-ID"/>
-        </w:rPr>
-        <w:t xml:space="preserve"> dan </w:t>
-      </w:r>
-      <w:proofErr w:type="spellStart"/>
-      <w:r>
-        <w:rPr>
-          <w:rFonts w:ascii="Times New Roman" w:eastAsia="Times New Roman" w:hAnsi="Times New Roman" w:cs="Times New Roman"/>
-          <w:lang w:val="en-ID"/>
-        </w:rPr>
-        <w:t>gaya</w:t>
-      </w:r>
-      <w:proofErr w:type="spellEnd"/>
-      <w:r>
-        <w:rPr>
-          <w:rFonts w:ascii="Times New Roman" w:eastAsia="Times New Roman" w:hAnsi="Times New Roman" w:cs="Times New Roman"/>
-          <w:lang w:val="en-ID"/>
-        </w:rPr>
-        <w:t xml:space="preserve"> </w:t>
-      </w:r>
-      <w:proofErr w:type="spellStart"/>
-      <w:r>
-        <w:rPr>
-          <w:rFonts w:ascii="Times New Roman" w:eastAsia="Times New Roman" w:hAnsi="Times New Roman" w:cs="Times New Roman"/>
-          <w:lang w:val="en-ID"/>
-        </w:rPr>
-        <w:t>hidup</w:t>
-      </w:r>
-      <w:proofErr w:type="spellEnd"/>
-      <w:r>
-        <w:rPr>
-          <w:rFonts w:ascii="Times New Roman" w:eastAsia="Times New Roman" w:hAnsi="Times New Roman" w:cs="Times New Roman"/>
-          <w:lang w:val="en-ID"/>
-        </w:rPr>
-        <w:t xml:space="preserve">. Proses </w:t>
-      </w:r>
-      <w:proofErr w:type="spellStart"/>
-      <w:r>
-        <w:rPr>
-          <w:rFonts w:ascii="Times New Roman" w:eastAsia="Times New Roman" w:hAnsi="Times New Roman" w:cs="Times New Roman"/>
-          <w:lang w:val="en-ID"/>
-        </w:rPr>
-        <w:t>penelitian</w:t>
-      </w:r>
-      <w:proofErr w:type="spellEnd"/>
-      <w:r>
-        <w:rPr>
-          <w:rFonts w:ascii="Times New Roman" w:eastAsia="Times New Roman" w:hAnsi="Times New Roman" w:cs="Times New Roman"/>
-          <w:lang w:val="en-ID"/>
-        </w:rPr>
-        <w:t xml:space="preserve"> </w:t>
-      </w:r>
-      <w:proofErr w:type="spellStart"/>
-      <w:r>
-        <w:rPr>
-          <w:rFonts w:ascii="Times New Roman" w:eastAsia="Times New Roman" w:hAnsi="Times New Roman" w:cs="Times New Roman"/>
-          <w:lang w:val="en-ID"/>
-        </w:rPr>
-        <w:t>meliputi</w:t>
-      </w:r>
-      <w:proofErr w:type="spellEnd"/>
-      <w:r>
-        <w:rPr>
-          <w:rFonts w:ascii="Times New Roman" w:eastAsia="Times New Roman" w:hAnsi="Times New Roman" w:cs="Times New Roman"/>
-          <w:lang w:val="en-ID"/>
-        </w:rPr>
-        <w:t xml:space="preserve"> </w:t>
-      </w:r>
-      <w:proofErr w:type="spellStart"/>
-      <w:r>
-        <w:rPr>
-          <w:rFonts w:ascii="Times New Roman" w:eastAsia="Times New Roman" w:hAnsi="Times New Roman" w:cs="Times New Roman"/>
-          <w:lang w:val="en-ID"/>
-        </w:rPr>
-        <w:t>pengumpulan</w:t>
-      </w:r>
-      <w:proofErr w:type="spellEnd"/>
-      <w:r>
-        <w:rPr>
-          <w:rFonts w:ascii="Times New Roman" w:eastAsia="Times New Roman" w:hAnsi="Times New Roman" w:cs="Times New Roman"/>
-          <w:lang w:val="en-ID"/>
-        </w:rPr>
-        <w:t xml:space="preserve"> dataset, preprocessing data, </w:t>
-      </w:r>
-      <w:proofErr w:type="spellStart"/>
-      <w:r>
-        <w:rPr>
-          <w:rFonts w:ascii="Times New Roman" w:eastAsia="Times New Roman" w:hAnsi="Times New Roman" w:cs="Times New Roman"/>
-          <w:lang w:val="en-ID"/>
-        </w:rPr>
-        <w:t>eksplorasi</w:t>
-      </w:r>
-      <w:proofErr w:type="spellEnd"/>
-      <w:r>
-        <w:rPr>
-          <w:rFonts w:ascii="Times New Roman" w:eastAsia="Times New Roman" w:hAnsi="Times New Roman" w:cs="Times New Roman"/>
-          <w:lang w:val="en-ID"/>
-        </w:rPr>
-        <w:t xml:space="preserve"> data, </w:t>
-      </w:r>
-      <w:proofErr w:type="spellStart"/>
-      <w:r>
-        <w:rPr>
-          <w:rFonts w:ascii="Times New Roman" w:eastAsia="Times New Roman" w:hAnsi="Times New Roman" w:cs="Times New Roman"/>
-          <w:lang w:val="en-ID"/>
-        </w:rPr>
-        <w:t>pembangunan</w:t>
-      </w:r>
-      <w:proofErr w:type="spellEnd"/>
-      <w:r>
-        <w:rPr>
-          <w:rFonts w:ascii="Times New Roman" w:eastAsia="Times New Roman" w:hAnsi="Times New Roman" w:cs="Times New Roman"/>
-          <w:lang w:val="en-ID"/>
-        </w:rPr>
-        <w:t xml:space="preserve"> model, </w:t>
-      </w:r>
-      <w:proofErr w:type="spellStart"/>
-      <w:r>
-        <w:rPr>
-          <w:rFonts w:ascii="Times New Roman" w:eastAsia="Times New Roman" w:hAnsi="Times New Roman" w:cs="Times New Roman"/>
-          <w:lang w:val="en-ID"/>
-        </w:rPr>
-        <w:t>evaluasi</w:t>
-      </w:r>
-      <w:proofErr w:type="spellEnd"/>
-      <w:r>
-        <w:rPr>
-          <w:rFonts w:ascii="Times New Roman" w:eastAsia="Times New Roman" w:hAnsi="Times New Roman" w:cs="Times New Roman"/>
-          <w:lang w:val="en-ID"/>
-        </w:rPr>
-        <w:t xml:space="preserve"> </w:t>
-      </w:r>
-      <w:proofErr w:type="spellStart"/>
-      <w:r>
-        <w:rPr>
-          <w:rFonts w:ascii="Times New Roman" w:eastAsia="Times New Roman" w:hAnsi="Times New Roman" w:cs="Times New Roman"/>
-          <w:lang w:val="en-ID"/>
-        </w:rPr>
-        <w:t>performa</w:t>
-      </w:r>
-      <w:proofErr w:type="spellEnd"/>
-      <w:r>
-        <w:rPr>
-          <w:rFonts w:ascii="Times New Roman" w:eastAsia="Times New Roman" w:hAnsi="Times New Roman" w:cs="Times New Roman"/>
-          <w:lang w:val="en-ID"/>
-        </w:rPr>
-        <w:t xml:space="preserve"> model, </w:t>
-      </w:r>
-      <w:proofErr w:type="spellStart"/>
-      <w:r>
-        <w:rPr>
-          <w:rFonts w:ascii="Times New Roman" w:eastAsia="Times New Roman" w:hAnsi="Times New Roman" w:cs="Times New Roman"/>
-          <w:lang w:val="en-ID"/>
-        </w:rPr>
-        <w:t>hingga</w:t>
-      </w:r>
-      <w:proofErr w:type="spellEnd"/>
-      <w:r>
-        <w:rPr>
-          <w:rFonts w:ascii="Times New Roman" w:eastAsia="Times New Roman" w:hAnsi="Times New Roman" w:cs="Times New Roman"/>
-          <w:lang w:val="en-ID"/>
-        </w:rPr>
-        <w:t xml:space="preserve"> </w:t>
-      </w:r>
-      <w:proofErr w:type="spellStart"/>
-      <w:r>
-        <w:rPr>
-          <w:rFonts w:ascii="Times New Roman" w:eastAsia="Times New Roman" w:hAnsi="Times New Roman" w:cs="Times New Roman"/>
-          <w:lang w:val="en-ID"/>
-        </w:rPr>
-        <w:t>implementasi</w:t>
-      </w:r>
-      <w:proofErr w:type="spellEnd"/>
-      <w:r>
-        <w:rPr>
-          <w:rFonts w:ascii="Times New Roman" w:eastAsia="Times New Roman" w:hAnsi="Times New Roman" w:cs="Times New Roman"/>
-          <w:lang w:val="en-ID"/>
-        </w:rPr>
-        <w:t xml:space="preserve"> model </w:t>
-      </w:r>
-      <w:proofErr w:type="spellStart"/>
-      <w:r>
-        <w:rPr>
-          <w:rFonts w:ascii="Times New Roman" w:eastAsia="Times New Roman" w:hAnsi="Times New Roman" w:cs="Times New Roman"/>
-          <w:lang w:val="en-ID"/>
-        </w:rPr>
         <w:t>dalam</w:t>
       </w:r>
       <w:proofErr w:type="spellEnd"/>
@@ -1682,6 +1761,8 @@
       <w:r>
         <w:rPr>
           <w:rFonts w:ascii="Times New Roman" w:eastAsia="Times New Roman" w:hAnsi="Times New Roman" w:cs="Times New Roman"/>
+          <w:b/>
+          <w:bCs/>
           <w:lang w:val="en-ID"/>
         </w:rPr>
         <w:t>Streamlit</w:t>
@@ -2061,7 +2142,7 @@
       <w:pPr>
         <w:numPr>
           <w:ilvl w:val="0"/>
-          <w:numId w:val="1"/>
+          <w:numId w:val="13"/>
         </w:numPr>
         <w:spacing w:before="240" w:after="240"/>
         <w:jc w:val="both"/>
@@ -2099,6 +2180,22 @@
           <w:rFonts w:ascii="Times New Roman" w:eastAsia="Times New Roman" w:hAnsi="Times New Roman" w:cs="Times New Roman"/>
           <w:lang w:val="en-ID"/>
         </w:rPr>
+        <w:t>segala</w:t>
+      </w:r>
+      <w:proofErr w:type="spellEnd"/>
+      <w:r>
+        <w:rPr>
+          <w:rFonts w:ascii="Times New Roman" w:eastAsia="Times New Roman" w:hAnsi="Times New Roman" w:cs="Times New Roman"/>
+          <w:lang w:val="en-ID"/>
+        </w:rPr>
+        <w:t xml:space="preserve"> </w:t>
+      </w:r>
+      <w:proofErr w:type="spellStart"/>
+      <w:r>
+        <w:rPr>
+          <w:rFonts w:ascii="Times New Roman" w:eastAsia="Times New Roman" w:hAnsi="Times New Roman" w:cs="Times New Roman"/>
+          <w:lang w:val="en-ID"/>
+        </w:rPr>
         <w:t>rahmat</w:t>
       </w:r>
       <w:proofErr w:type="spellEnd"/>
@@ -2107,7 +2204,7 @@
           <w:rFonts w:ascii="Times New Roman" w:eastAsia="Times New Roman" w:hAnsi="Times New Roman" w:cs="Times New Roman"/>
           <w:lang w:val="en-ID"/>
         </w:rPr>
-        <w:t xml:space="preserve"> dan </w:t>
+        <w:t xml:space="preserve">, </w:t>
       </w:r>
       <w:proofErr w:type="spellStart"/>
       <w:r>
@@ -2123,14 +2220,142 @@
           <w:rFonts w:ascii="Times New Roman" w:eastAsia="Times New Roman" w:hAnsi="Times New Roman" w:cs="Times New Roman"/>
           <w:lang w:val="en-ID"/>
         </w:rPr>
-        <w:t>-Nya.</w:t>
+        <w:t xml:space="preserve">, dan </w:t>
+      </w:r>
+      <w:proofErr w:type="spellStart"/>
+      <w:r>
+        <w:rPr>
+          <w:rFonts w:ascii="Times New Roman" w:eastAsia="Times New Roman" w:hAnsi="Times New Roman" w:cs="Times New Roman"/>
+          <w:lang w:val="en-ID"/>
+        </w:rPr>
+        <w:t>penyertaan</w:t>
+      </w:r>
+      <w:proofErr w:type="spellEnd"/>
+      <w:r>
+        <w:rPr>
+          <w:rFonts w:ascii="Times New Roman" w:eastAsia="Times New Roman" w:hAnsi="Times New Roman" w:cs="Times New Roman"/>
+          <w:lang w:val="en-ID"/>
+        </w:rPr>
+        <w:t xml:space="preserve">-Nya </w:t>
+      </w:r>
+      <w:proofErr w:type="spellStart"/>
+      <w:r>
+        <w:rPr>
+          <w:rFonts w:ascii="Times New Roman" w:eastAsia="Times New Roman" w:hAnsi="Times New Roman" w:cs="Times New Roman"/>
+          <w:lang w:val="en-ID"/>
+        </w:rPr>
+        <w:t>sehingga</w:t>
+      </w:r>
+      <w:proofErr w:type="spellEnd"/>
+      <w:r>
+        <w:rPr>
+          <w:rFonts w:ascii="Times New Roman" w:eastAsia="Times New Roman" w:hAnsi="Times New Roman" w:cs="Times New Roman"/>
+          <w:lang w:val="en-ID"/>
+        </w:rPr>
+        <w:t xml:space="preserve"> </w:t>
+      </w:r>
+      <w:proofErr w:type="spellStart"/>
+      <w:r>
+        <w:rPr>
+          <w:rFonts w:ascii="Times New Roman" w:eastAsia="Times New Roman" w:hAnsi="Times New Roman" w:cs="Times New Roman"/>
+          <w:lang w:val="en-ID"/>
+        </w:rPr>
+        <w:t>penelitian</w:t>
+      </w:r>
+      <w:proofErr w:type="spellEnd"/>
+      <w:r>
+        <w:rPr>
+          <w:rFonts w:ascii="Times New Roman" w:eastAsia="Times New Roman" w:hAnsi="Times New Roman" w:cs="Times New Roman"/>
+          <w:lang w:val="en-ID"/>
+        </w:rPr>
+        <w:t xml:space="preserve"> </w:t>
+      </w:r>
+      <w:proofErr w:type="spellStart"/>
+      <w:r>
+        <w:rPr>
+          <w:rFonts w:ascii="Times New Roman" w:eastAsia="Times New Roman" w:hAnsi="Times New Roman" w:cs="Times New Roman"/>
+          <w:lang w:val="en-ID"/>
+        </w:rPr>
+        <w:t>ini</w:t>
+      </w:r>
+      <w:proofErr w:type="spellEnd"/>
+      <w:r>
+        <w:rPr>
+          <w:rFonts w:ascii="Times New Roman" w:eastAsia="Times New Roman" w:hAnsi="Times New Roman" w:cs="Times New Roman"/>
+          <w:lang w:val="en-ID"/>
+        </w:rPr>
+        <w:t xml:space="preserve"> </w:t>
+      </w:r>
+      <w:proofErr w:type="spellStart"/>
+      <w:r>
+        <w:rPr>
+          <w:rFonts w:ascii="Times New Roman" w:eastAsia="Times New Roman" w:hAnsi="Times New Roman" w:cs="Times New Roman"/>
+          <w:lang w:val="en-ID"/>
+        </w:rPr>
+        <w:t>dapat</w:t>
+      </w:r>
+      <w:proofErr w:type="spellEnd"/>
+      <w:r>
+        <w:rPr>
+          <w:rFonts w:ascii="Times New Roman" w:eastAsia="Times New Roman" w:hAnsi="Times New Roman" w:cs="Times New Roman"/>
+          <w:lang w:val="en-ID"/>
+        </w:rPr>
+        <w:t xml:space="preserve"> </w:t>
+      </w:r>
+      <w:proofErr w:type="spellStart"/>
+      <w:r>
+        <w:rPr>
+          <w:rFonts w:ascii="Times New Roman" w:eastAsia="Times New Roman" w:hAnsi="Times New Roman" w:cs="Times New Roman"/>
+          <w:lang w:val="en-ID"/>
+        </w:rPr>
+        <w:t>diselesaikan</w:t>
+      </w:r>
+      <w:proofErr w:type="spellEnd"/>
+      <w:r>
+        <w:rPr>
+          <w:rFonts w:ascii="Times New Roman" w:eastAsia="Times New Roman" w:hAnsi="Times New Roman" w:cs="Times New Roman"/>
+          <w:lang w:val="en-ID"/>
+        </w:rPr>
+        <w:t xml:space="preserve"> </w:t>
+      </w:r>
+      <w:proofErr w:type="spellStart"/>
+      <w:r>
+        <w:rPr>
+          <w:rFonts w:ascii="Times New Roman" w:eastAsia="Times New Roman" w:hAnsi="Times New Roman" w:cs="Times New Roman"/>
+          <w:lang w:val="en-ID"/>
+        </w:rPr>
+        <w:t>dengan</w:t>
+      </w:r>
+      <w:proofErr w:type="spellEnd"/>
+      <w:r>
+        <w:rPr>
+          <w:rFonts w:ascii="Times New Roman" w:eastAsia="Times New Roman" w:hAnsi="Times New Roman" w:cs="Times New Roman"/>
+          <w:lang w:val="en-ID"/>
+        </w:rPr>
+        <w:t xml:space="preserve"> </w:t>
+      </w:r>
+      <w:proofErr w:type="spellStart"/>
+      <w:r>
+        <w:rPr>
+          <w:rFonts w:ascii="Times New Roman" w:eastAsia="Times New Roman" w:hAnsi="Times New Roman" w:cs="Times New Roman"/>
+          <w:lang w:val="en-ID"/>
+        </w:rPr>
+        <w:t>baik</w:t>
+      </w:r>
+      <w:proofErr w:type="spellEnd"/>
+      <w:r>
+        <w:rPr>
+          <w:rFonts w:ascii="Times New Roman" w:eastAsia="Times New Roman" w:hAnsi="Times New Roman" w:cs="Times New Roman"/>
+          <w:lang w:val="en-ID"/>
+        </w:rPr>
+        <w:t>.</w:t>
       </w:r>
     </w:p>
     <w:p>
       <w:pPr>
         <w:numPr>
           <w:ilvl w:val="0"/>
-          <w:numId w:val="1"/>
+          <w:numId w:val="13"/>
         </w:numPr>
         <w:spacing w:before="240" w:after="240"/>
         <w:jc w:val="both"/>
@@ -2168,6 +2393,38 @@
           <w:rFonts w:ascii="Times New Roman" w:eastAsia="Times New Roman" w:hAnsi="Times New Roman" w:cs="Times New Roman"/>
           <w:lang w:val="en-ID"/>
         </w:rPr>
+        <w:t>pembimbing</w:t>
+      </w:r>
+      <w:proofErr w:type="spellEnd"/>
+      <w:r>
+        <w:rPr>
+          <w:rFonts w:ascii="Times New Roman" w:eastAsia="Times New Roman" w:hAnsi="Times New Roman" w:cs="Times New Roman"/>
+          <w:lang w:val="en-ID"/>
+        </w:rPr>
+        <w:t xml:space="preserve"> dan </w:t>
+      </w:r>
+      <w:proofErr w:type="spellStart"/>
+      <w:r>
+        <w:rPr>
+          <w:rFonts w:ascii="Times New Roman" w:eastAsia="Times New Roman" w:hAnsi="Times New Roman" w:cs="Times New Roman"/>
+          <w:lang w:val="en-ID"/>
+        </w:rPr>
+        <w:t>dosen</w:t>
+      </w:r>
+      <w:proofErr w:type="spellEnd"/>
+      <w:r>
+        <w:rPr>
+          <w:rFonts w:ascii="Times New Roman" w:eastAsia="Times New Roman" w:hAnsi="Times New Roman" w:cs="Times New Roman"/>
+          <w:lang w:val="en-ID"/>
+        </w:rPr>
+        <w:t xml:space="preserve"> </w:t>
+      </w:r>
+      <w:proofErr w:type="spellStart"/>
+      <w:r>
+        <w:rPr>
+          <w:rFonts w:ascii="Times New Roman" w:eastAsia="Times New Roman" w:hAnsi="Times New Roman" w:cs="Times New Roman"/>
+          <w:lang w:val="en-ID"/>
+        </w:rPr>
         <w:t>pengampu</w:t>
       </w:r>
       <w:proofErr w:type="spellEnd"/>
@@ -2176,39 +2433,7 @@
           <w:rFonts w:ascii="Times New Roman" w:eastAsia="Times New Roman" w:hAnsi="Times New Roman" w:cs="Times New Roman"/>
           <w:lang w:val="en-ID"/>
         </w:rPr>
-        <w:t xml:space="preserve"> </w:t>
-      </w:r>
-      <w:proofErr w:type="spellStart"/>
-      <w:r>
-        <w:rPr>
-          <w:rFonts w:ascii="Times New Roman" w:eastAsia="Times New Roman" w:hAnsi="Times New Roman" w:cs="Times New Roman"/>
-          <w:lang w:val="en-ID"/>
-        </w:rPr>
-        <w:t>mata</w:t>
-      </w:r>
-      <w:proofErr w:type="spellEnd"/>
-      <w:r>
-        <w:rPr>
-          <w:rFonts w:ascii="Times New Roman" w:eastAsia="Times New Roman" w:hAnsi="Times New Roman" w:cs="Times New Roman"/>
-          <w:lang w:val="en-ID"/>
-        </w:rPr>
-        <w:t xml:space="preserve"> </w:t>
-      </w:r>
-      <w:proofErr w:type="spellStart"/>
-      <w:r>
-        <w:rPr>
-          <w:rFonts w:ascii="Times New Roman" w:eastAsia="Times New Roman" w:hAnsi="Times New Roman" w:cs="Times New Roman"/>
-          <w:lang w:val="en-ID"/>
-        </w:rPr>
-        <w:t>kuliah</w:t>
-      </w:r>
-      <w:proofErr w:type="spellEnd"/>
-      <w:r>
-        <w:rPr>
-          <w:rFonts w:ascii="Times New Roman" w:eastAsia="Times New Roman" w:hAnsi="Times New Roman" w:cs="Times New Roman"/>
-          <w:lang w:val="en-ID"/>
-        </w:rPr>
-        <w:t xml:space="preserve"> Machine Learning yang </w:t>
+        <w:t xml:space="preserve"> yang </w:t>
       </w:r>
       <w:proofErr w:type="spellStart"/>
       <w:r>
@@ -2248,6 +2473,54 @@
           <w:rFonts w:ascii="Times New Roman" w:eastAsia="Times New Roman" w:hAnsi="Times New Roman" w:cs="Times New Roman"/>
           <w:lang w:val="en-ID"/>
         </w:rPr>
+        <w:t>arahan</w:t>
+      </w:r>
+      <w:proofErr w:type="spellEnd"/>
+      <w:r>
+        <w:rPr>
+          <w:rFonts w:ascii="Times New Roman" w:eastAsia="Times New Roman" w:hAnsi="Times New Roman" w:cs="Times New Roman"/>
+          <w:lang w:val="en-ID"/>
+        </w:rPr>
+        <w:t xml:space="preserve">, </w:t>
+      </w:r>
+      <w:proofErr w:type="spellStart"/>
+      <w:r>
+        <w:rPr>
+          <w:rFonts w:ascii="Times New Roman" w:eastAsia="Times New Roman" w:hAnsi="Times New Roman" w:cs="Times New Roman"/>
+          <w:lang w:val="en-ID"/>
+        </w:rPr>
+        <w:t>bimbingan</w:t>
+      </w:r>
+      <w:proofErr w:type="spellEnd"/>
+      <w:r>
+        <w:rPr>
+          <w:rFonts w:ascii="Times New Roman" w:eastAsia="Times New Roman" w:hAnsi="Times New Roman" w:cs="Times New Roman"/>
+          <w:lang w:val="en-ID"/>
+        </w:rPr>
+        <w:t xml:space="preserve">, </w:t>
+      </w:r>
+      <w:proofErr w:type="spellStart"/>
+      <w:r>
+        <w:rPr>
+          <w:rFonts w:ascii="Times New Roman" w:eastAsia="Times New Roman" w:hAnsi="Times New Roman" w:cs="Times New Roman"/>
+          <w:lang w:val="en-ID"/>
+        </w:rPr>
+        <w:t>serta</w:t>
+      </w:r>
+      <w:proofErr w:type="spellEnd"/>
+      <w:r>
+        <w:rPr>
+          <w:rFonts w:ascii="Times New Roman" w:eastAsia="Times New Roman" w:hAnsi="Times New Roman" w:cs="Times New Roman"/>
+          <w:lang w:val="en-ID"/>
+        </w:rPr>
+        <w:t xml:space="preserve"> </w:t>
+      </w:r>
+      <w:proofErr w:type="spellStart"/>
+      <w:r>
+        <w:rPr>
+          <w:rFonts w:ascii="Times New Roman" w:eastAsia="Times New Roman" w:hAnsi="Times New Roman" w:cs="Times New Roman"/>
+          <w:lang w:val="en-ID"/>
+        </w:rPr>
         <w:t>ilmu</w:t>
       </w:r>
       <w:proofErr w:type="spellEnd"/>
@@ -2256,31 +2529,15 @@
           <w:rFonts w:ascii="Times New Roman" w:eastAsia="Times New Roman" w:hAnsi="Times New Roman" w:cs="Times New Roman"/>
           <w:lang w:val="en-ID"/>
         </w:rPr>
-        <w:t xml:space="preserve">, </w:t>
-      </w:r>
-      <w:proofErr w:type="spellStart"/>
-      <w:r>
-        <w:rPr>
-          <w:rFonts w:ascii="Times New Roman" w:eastAsia="Times New Roman" w:hAnsi="Times New Roman" w:cs="Times New Roman"/>
-          <w:lang w:val="en-ID"/>
-        </w:rPr>
-        <w:t>arahan</w:t>
-      </w:r>
-      <w:proofErr w:type="spellEnd"/>
-      <w:r>
-        <w:rPr>
-          <w:rFonts w:ascii="Times New Roman" w:eastAsia="Times New Roman" w:hAnsi="Times New Roman" w:cs="Times New Roman"/>
-          <w:lang w:val="en-ID"/>
-        </w:rPr>
-        <w:t xml:space="preserve">, dan </w:t>
-      </w:r>
-      <w:proofErr w:type="spellStart"/>
-      <w:r>
-        <w:rPr>
-          <w:rFonts w:ascii="Times New Roman" w:eastAsia="Times New Roman" w:hAnsi="Times New Roman" w:cs="Times New Roman"/>
-          <w:lang w:val="en-ID"/>
-        </w:rPr>
-        <w:t>bimbingan</w:t>
+        <w:t xml:space="preserve"> </w:t>
+      </w:r>
+      <w:proofErr w:type="spellStart"/>
+      <w:r>
+        <w:rPr>
+          <w:rFonts w:ascii="Times New Roman" w:eastAsia="Times New Roman" w:hAnsi="Times New Roman" w:cs="Times New Roman"/>
+          <w:lang w:val="en-ID"/>
+        </w:rPr>
+        <w:t>pengetahuan</w:t>
       </w:r>
       <w:proofErr w:type="spellEnd"/>
       <w:r>
@@ -2312,7 +2569,23 @@
           <w:rFonts w:ascii="Times New Roman" w:eastAsia="Times New Roman" w:hAnsi="Times New Roman" w:cs="Times New Roman"/>
           <w:lang w:val="en-ID"/>
         </w:rPr>
-        <w:t>pembelajaran</w:t>
+        <w:t>penyusunan</w:t>
+      </w:r>
+      <w:proofErr w:type="spellEnd"/>
+      <w:r>
+        <w:rPr>
+          <w:rFonts w:ascii="Times New Roman" w:eastAsia="Times New Roman" w:hAnsi="Times New Roman" w:cs="Times New Roman"/>
+          <w:lang w:val="en-ID"/>
+        </w:rPr>
+        <w:t xml:space="preserve"> </w:t>
+      </w:r>
+      <w:proofErr w:type="spellStart"/>
+      <w:r>
+        <w:rPr>
+          <w:rFonts w:ascii="Times New Roman" w:eastAsia="Times New Roman" w:hAnsi="Times New Roman" w:cs="Times New Roman"/>
+          <w:lang w:val="en-ID"/>
+        </w:rPr>
+        <w:t>penelitian</w:t>
       </w:r>
       <w:proofErr w:type="spellEnd"/>
       <w:r>
@@ -2327,7 +2600,7 @@
       <w:pPr>
         <w:numPr>
           <w:ilvl w:val="0"/>
-          <w:numId w:val="1"/>
+          <w:numId w:val="13"/>
         </w:numPr>
         <w:spacing w:before="240" w:after="240"/>
         <w:jc w:val="both"/>
@@ -2462,6 +2735,38 @@
           <w:lang w:val="en-ID"/>
         </w:rPr>
         <w:t>motivasi</w:t>
+      </w:r>
+      <w:proofErr w:type="spellEnd"/>
+      <w:r>
+        <w:rPr>
+          <w:rFonts w:ascii="Times New Roman" w:eastAsia="Times New Roman" w:hAnsi="Times New Roman" w:cs="Times New Roman"/>
+          <w:lang w:val="en-ID"/>
+        </w:rPr>
+        <w:t xml:space="preserve"> </w:t>
+      </w:r>
+      <w:proofErr w:type="spellStart"/>
+      <w:r>
+        <w:rPr>
+          <w:rFonts w:ascii="Times New Roman" w:eastAsia="Times New Roman" w:hAnsi="Times New Roman" w:cs="Times New Roman"/>
+          <w:lang w:val="en-ID"/>
+        </w:rPr>
+        <w:t>kepada</w:t>
+      </w:r>
+      <w:proofErr w:type="spellEnd"/>
+      <w:r>
+        <w:rPr>
+          <w:rFonts w:ascii="Times New Roman" w:eastAsia="Times New Roman" w:hAnsi="Times New Roman" w:cs="Times New Roman"/>
+          <w:lang w:val="en-ID"/>
+        </w:rPr>
+        <w:t xml:space="preserve"> </w:t>
+      </w:r>
+      <w:proofErr w:type="spellStart"/>
+      <w:r>
+        <w:rPr>
+          <w:rFonts w:ascii="Times New Roman" w:eastAsia="Times New Roman" w:hAnsi="Times New Roman" w:cs="Times New Roman"/>
+          <w:lang w:val="en-ID"/>
+        </w:rPr>
+        <w:t>penulis</w:t>
       </w:r>
       <w:proofErr w:type="spellEnd"/>
       <w:r>
@@ -2476,7 +2781,7 @@
       <w:pPr>
         <w:numPr>
           <w:ilvl w:val="0"/>
-          <w:numId w:val="1"/>
+          <w:numId w:val="13"/>
         </w:numPr>
         <w:spacing w:before="240" w:after="240"/>
         <w:jc w:val="both"/>
@@ -2554,7 +2859,23 @@
           <w:rFonts w:ascii="Times New Roman" w:eastAsia="Times New Roman" w:hAnsi="Times New Roman" w:cs="Times New Roman"/>
           <w:lang w:val="en-ID"/>
         </w:rPr>
-        <w:t xml:space="preserve"> dan </w:t>
+        <w:t xml:space="preserve">, </w:t>
+      </w:r>
+      <w:proofErr w:type="spellStart"/>
+      <w:r>
+        <w:rPr>
+          <w:rFonts w:ascii="Times New Roman" w:eastAsia="Times New Roman" w:hAnsi="Times New Roman" w:cs="Times New Roman"/>
+          <w:lang w:val="en-ID"/>
+        </w:rPr>
+        <w:t>bantuan</w:t>
+      </w:r>
+      <w:proofErr w:type="spellEnd"/>
+      <w:r>
+        <w:rPr>
+          <w:rFonts w:ascii="Times New Roman" w:eastAsia="Times New Roman" w:hAnsi="Times New Roman" w:cs="Times New Roman"/>
+          <w:lang w:val="en-ID"/>
+        </w:rPr>
+        <w:t xml:space="preserve">, dan </w:t>
       </w:r>
       <w:proofErr w:type="spellStart"/>
       <w:r>
@@ -2586,7 +2907,7 @@
           <w:rFonts w:ascii="Times New Roman" w:eastAsia="Times New Roman" w:hAnsi="Times New Roman" w:cs="Times New Roman"/>
           <w:lang w:val="en-ID"/>
         </w:rPr>
-        <w:t xml:space="preserve"> </w:t>
+        <w:t xml:space="preserve"> proses </w:t>
       </w:r>
       <w:proofErr w:type="spellStart"/>
       <w:r>
@@ -2610,23 +2931,7 @@
           <w:rFonts w:ascii="Times New Roman" w:eastAsia="Times New Roman" w:hAnsi="Times New Roman" w:cs="Times New Roman"/>
           <w:lang w:val="en-ID"/>
         </w:rPr>
-        <w:t>proyek</w:t>
-      </w:r>
-      <w:proofErr w:type="spellEnd"/>
-      <w:r>
-        <w:rPr>
-          <w:rFonts w:ascii="Times New Roman" w:eastAsia="Times New Roman" w:hAnsi="Times New Roman" w:cs="Times New Roman"/>
-          <w:lang w:val="en-ID"/>
-        </w:rPr>
-        <w:t xml:space="preserve"> </w:t>
-      </w:r>
-      <w:proofErr w:type="spellStart"/>
-      <w:r>
-        <w:rPr>
-          <w:rFonts w:ascii="Times New Roman" w:eastAsia="Times New Roman" w:hAnsi="Times New Roman" w:cs="Times New Roman"/>
-          <w:lang w:val="en-ID"/>
-        </w:rPr>
-        <w:t>ini</w:t>
+        <w:t>penelitian</w:t>
       </w:r>
       <w:proofErr w:type="spellEnd"/>
       <w:r>
@@ -2641,7 +2946,7 @@
       <w:pPr>
         <w:numPr>
           <w:ilvl w:val="0"/>
-          <w:numId w:val="1"/>
+          <w:numId w:val="13"/>
         </w:numPr>
         <w:spacing w:before="240" w:after="240"/>
         <w:jc w:val="both"/>
@@ -2800,39 +3105,23 @@
           <w:rFonts w:ascii="Times New Roman" w:eastAsia="Times New Roman" w:hAnsi="Times New Roman" w:cs="Times New Roman"/>
           <w:lang w:val="en-ID"/>
         </w:rPr>
-        <w:t>dalam</w:t>
-      </w:r>
-      <w:proofErr w:type="spellEnd"/>
-      <w:r>
-        <w:rPr>
-          <w:rFonts w:ascii="Times New Roman" w:eastAsia="Times New Roman" w:hAnsi="Times New Roman" w:cs="Times New Roman"/>
-          <w:lang w:val="en-ID"/>
-        </w:rPr>
-        <w:t xml:space="preserve"> </w:t>
-      </w:r>
-      <w:proofErr w:type="spellStart"/>
-      <w:r>
-        <w:rPr>
-          <w:rFonts w:ascii="Times New Roman" w:eastAsia="Times New Roman" w:hAnsi="Times New Roman" w:cs="Times New Roman"/>
-          <w:lang w:val="en-ID"/>
-        </w:rPr>
-        <w:t>penyelesaian</w:t>
-      </w:r>
-      <w:proofErr w:type="spellEnd"/>
-      <w:r>
-        <w:rPr>
-          <w:rFonts w:ascii="Times New Roman" w:eastAsia="Times New Roman" w:hAnsi="Times New Roman" w:cs="Times New Roman"/>
-          <w:lang w:val="en-ID"/>
-        </w:rPr>
-        <w:t xml:space="preserve"> </w:t>
-      </w:r>
-      <w:proofErr w:type="spellStart"/>
-      <w:r>
-        <w:rPr>
-          <w:rFonts w:ascii="Times New Roman" w:eastAsia="Times New Roman" w:hAnsi="Times New Roman" w:cs="Times New Roman"/>
-          <w:lang w:val="en-ID"/>
-        </w:rPr>
-        <w:t>laporan</w:t>
+        <w:t>hingga</w:t>
+      </w:r>
+      <w:proofErr w:type="spellEnd"/>
+      <w:r>
+        <w:rPr>
+          <w:rFonts w:ascii="Times New Roman" w:eastAsia="Times New Roman" w:hAnsi="Times New Roman" w:cs="Times New Roman"/>
+          <w:lang w:val="en-ID"/>
+        </w:rPr>
+        <w:t xml:space="preserve"> </w:t>
+      </w:r>
+      <w:proofErr w:type="spellStart"/>
+      <w:r>
+        <w:rPr>
+          <w:rFonts w:ascii="Times New Roman" w:eastAsia="Times New Roman" w:hAnsi="Times New Roman" w:cs="Times New Roman"/>
+          <w:lang w:val="en-ID"/>
+        </w:rPr>
+        <w:t>penelitian</w:t>
       </w:r>
       <w:proofErr w:type="spellEnd"/>
       <w:r>
@@ -2849,6 +3138,38 @@
           <w:lang w:val="en-ID"/>
         </w:rPr>
         <w:t>ini</w:t>
+      </w:r>
+      <w:proofErr w:type="spellEnd"/>
+      <w:r>
+        <w:rPr>
+          <w:rFonts w:ascii="Times New Roman" w:eastAsia="Times New Roman" w:hAnsi="Times New Roman" w:cs="Times New Roman"/>
+          <w:lang w:val="en-ID"/>
+        </w:rPr>
+        <w:t xml:space="preserve"> </w:t>
+      </w:r>
+      <w:proofErr w:type="spellStart"/>
+      <w:r>
+        <w:rPr>
+          <w:rFonts w:ascii="Times New Roman" w:eastAsia="Times New Roman" w:hAnsi="Times New Roman" w:cs="Times New Roman"/>
+          <w:lang w:val="en-ID"/>
+        </w:rPr>
+        <w:t>dapat</w:t>
+      </w:r>
+      <w:proofErr w:type="spellEnd"/>
+      <w:r>
+        <w:rPr>
+          <w:rFonts w:ascii="Times New Roman" w:eastAsia="Times New Roman" w:hAnsi="Times New Roman" w:cs="Times New Roman"/>
+          <w:lang w:val="en-ID"/>
+        </w:rPr>
+        <w:t xml:space="preserve"> </w:t>
+      </w:r>
+      <w:proofErr w:type="spellStart"/>
+      <w:r>
+        <w:rPr>
+          <w:rFonts w:ascii="Times New Roman" w:eastAsia="Times New Roman" w:hAnsi="Times New Roman" w:cs="Times New Roman"/>
+          <w:lang w:val="en-ID"/>
+        </w:rPr>
+        <w:t>diselesaikan</w:t>
       </w:r>
       <w:proofErr w:type="spellEnd"/>
       <w:r>
@@ -2938,6 +3259,22 @@
           <w:rFonts w:ascii="Times New Roman" w:eastAsia="Times New Roman" w:hAnsi="Times New Roman" w:cs="Times New Roman"/>
           <w:lang w:val="en-ID"/>
         </w:rPr>
+        <w:t>penelitian</w:t>
+      </w:r>
+      <w:proofErr w:type="spellEnd"/>
+      <w:r>
+        <w:rPr>
+          <w:rFonts w:ascii="Times New Roman" w:eastAsia="Times New Roman" w:hAnsi="Times New Roman" w:cs="Times New Roman"/>
+          <w:lang w:val="en-ID"/>
+        </w:rPr>
+        <w:t xml:space="preserve"> </w:t>
+      </w:r>
+      <w:proofErr w:type="spellStart"/>
+      <w:r>
+        <w:rPr>
+          <w:rFonts w:ascii="Times New Roman" w:eastAsia="Times New Roman" w:hAnsi="Times New Roman" w:cs="Times New Roman"/>
+          <w:lang w:val="en-ID"/>
+        </w:rPr>
         <w:t>ini</w:t>
       </w:r>
       <w:proofErr w:type="spellEnd"/>
@@ -2986,22 +3323,6 @@
           <w:rFonts w:ascii="Times New Roman" w:eastAsia="Times New Roman" w:hAnsi="Times New Roman" w:cs="Times New Roman"/>
           <w:lang w:val="en-ID"/>
         </w:rPr>
-        <w:t>berbagai</w:t>
-      </w:r>
-      <w:proofErr w:type="spellEnd"/>
-      <w:r>
-        <w:rPr>
-          <w:rFonts w:ascii="Times New Roman" w:eastAsia="Times New Roman" w:hAnsi="Times New Roman" w:cs="Times New Roman"/>
-          <w:lang w:val="en-ID"/>
-        </w:rPr>
-        <w:t xml:space="preserve"> </w:t>
-      </w:r>
-      <w:proofErr w:type="spellStart"/>
-      <w:r>
-        <w:rPr>
-          <w:rFonts w:ascii="Times New Roman" w:eastAsia="Times New Roman" w:hAnsi="Times New Roman" w:cs="Times New Roman"/>
-          <w:lang w:val="en-ID"/>
-        </w:rPr>
         <w:t>keterbatasan</w:t>
       </w:r>
       <w:proofErr w:type="spellEnd"/>
@@ -3122,15 +3443,47 @@
           <w:rFonts w:ascii="Times New Roman" w:eastAsia="Times New Roman" w:hAnsi="Times New Roman" w:cs="Times New Roman"/>
           <w:lang w:val="en-ID"/>
         </w:rPr>
-        <w:t xml:space="preserve"> demi </w:t>
-      </w:r>
-      <w:proofErr w:type="spellStart"/>
-      <w:r>
-        <w:rPr>
-          <w:rFonts w:ascii="Times New Roman" w:eastAsia="Times New Roman" w:hAnsi="Times New Roman" w:cs="Times New Roman"/>
-          <w:lang w:val="en-ID"/>
-        </w:rPr>
-        <w:t>perbaikan</w:t>
+        <w:t xml:space="preserve"> </w:t>
+      </w:r>
+      <w:proofErr w:type="spellStart"/>
+      <w:r>
+        <w:rPr>
+          <w:rFonts w:ascii="Times New Roman" w:eastAsia="Times New Roman" w:hAnsi="Times New Roman" w:cs="Times New Roman"/>
+          <w:lang w:val="en-ID"/>
+        </w:rPr>
+        <w:t>sebagai</w:t>
+      </w:r>
+      <w:proofErr w:type="spellEnd"/>
+      <w:r>
+        <w:rPr>
+          <w:rFonts w:ascii="Times New Roman" w:eastAsia="Times New Roman" w:hAnsi="Times New Roman" w:cs="Times New Roman"/>
+          <w:lang w:val="en-ID"/>
+        </w:rPr>
+        <w:t xml:space="preserve"> </w:t>
+      </w:r>
+      <w:proofErr w:type="spellStart"/>
+      <w:r>
+        <w:rPr>
+          <w:rFonts w:ascii="Times New Roman" w:eastAsia="Times New Roman" w:hAnsi="Times New Roman" w:cs="Times New Roman"/>
+          <w:lang w:val="en-ID"/>
+        </w:rPr>
+        <w:t>bahan</w:t>
+      </w:r>
+      <w:proofErr w:type="spellEnd"/>
+      <w:r>
+        <w:rPr>
+          <w:rFonts w:ascii="Times New Roman" w:eastAsia="Times New Roman" w:hAnsi="Times New Roman" w:cs="Times New Roman"/>
+          <w:lang w:val="en-ID"/>
+        </w:rPr>
+        <w:t xml:space="preserve"> </w:t>
+      </w:r>
+      <w:proofErr w:type="spellStart"/>
+      <w:r>
+        <w:rPr>
+          <w:rFonts w:ascii="Times New Roman" w:eastAsia="Times New Roman" w:hAnsi="Times New Roman" w:cs="Times New Roman"/>
+          <w:lang w:val="en-ID"/>
+        </w:rPr>
+        <w:t>evaluasi</w:t>
       </w:r>
       <w:proofErr w:type="spellEnd"/>
       <w:r>
@@ -3162,23 +3515,7 @@
           <w:rFonts w:ascii="Times New Roman" w:eastAsia="Times New Roman" w:hAnsi="Times New Roman" w:cs="Times New Roman"/>
           <w:lang w:val="en-ID"/>
         </w:rPr>
-        <w:t>karya</w:t>
-      </w:r>
-      <w:proofErr w:type="spellEnd"/>
-      <w:r>
-        <w:rPr>
-          <w:rFonts w:ascii="Times New Roman" w:eastAsia="Times New Roman" w:hAnsi="Times New Roman" w:cs="Times New Roman"/>
-          <w:lang w:val="en-ID"/>
-        </w:rPr>
-        <w:t xml:space="preserve"> </w:t>
-      </w:r>
-      <w:proofErr w:type="spellStart"/>
-      <w:r>
-        <w:rPr>
-          <w:rFonts w:ascii="Times New Roman" w:eastAsia="Times New Roman" w:hAnsi="Times New Roman" w:cs="Times New Roman"/>
-          <w:lang w:val="en-ID"/>
-        </w:rPr>
-        <w:t>ini</w:t>
+        <w:t>penelitian</w:t>
       </w:r>
       <w:proofErr w:type="spellEnd"/>
       <w:r>
@@ -3291,6 +3628,22 @@
           <w:rFonts w:ascii="Times New Roman" w:eastAsia="Times New Roman" w:hAnsi="Times New Roman" w:cs="Times New Roman"/>
           <w:lang w:val="en-ID"/>
         </w:rPr>
+        <w:t>penelitian</w:t>
+      </w:r>
+      <w:proofErr w:type="spellEnd"/>
+      <w:r>
+        <w:rPr>
+          <w:rFonts w:ascii="Times New Roman" w:eastAsia="Times New Roman" w:hAnsi="Times New Roman" w:cs="Times New Roman"/>
+          <w:lang w:val="en-ID"/>
+        </w:rPr>
+        <w:t xml:space="preserve"> </w:t>
+      </w:r>
+      <w:proofErr w:type="spellStart"/>
+      <w:r>
+        <w:rPr>
+          <w:rFonts w:ascii="Times New Roman" w:eastAsia="Times New Roman" w:hAnsi="Times New Roman" w:cs="Times New Roman"/>
+          <w:lang w:val="en-ID"/>
+        </w:rPr>
         <w:t>ini</w:t>
       </w:r>
       <w:proofErr w:type="spellEnd"/>
@@ -3475,7 +3828,23 @@
           <w:rFonts w:ascii="Times New Roman" w:eastAsia="Times New Roman" w:hAnsi="Times New Roman" w:cs="Times New Roman"/>
           <w:lang w:val="en-ID"/>
         </w:rPr>
-        <w:t xml:space="preserve"> machine learning </w:t>
+        <w:t xml:space="preserve"> </w:t>
+      </w:r>
+      <w:r>
+        <w:rPr>
+          <w:rFonts w:ascii="Times New Roman" w:eastAsia="Times New Roman" w:hAnsi="Times New Roman" w:cs="Times New Roman"/>
+          <w:i/>
+          <w:iCs/>
+          <w:lang w:val="en-ID"/>
+        </w:rPr>
+        <w:t>machine learning</w:t>
+      </w:r>
+      <w:r>
+        <w:rPr>
+          <w:rFonts w:ascii="Times New Roman" w:eastAsia="Times New Roman" w:hAnsi="Times New Roman" w:cs="Times New Roman"/>
+          <w:lang w:val="en-ID"/>
+        </w:rPr>
+        <w:t xml:space="preserve"> </w:t>
       </w:r>
       <w:proofErr w:type="spellStart"/>
       <w:r>
@@ -3632,17 +4001,6 @@
           <w:szCs w:val="26"/>
         </w:rPr>
       </w:pPr>
-    </w:p>
-    <w:p>
-      <w:pPr>
-        <w:spacing w:before="240" w:after="240"/>
-        <w:jc w:val="both"/>
-        <w:rPr>
-          <w:rFonts w:ascii="Times New Roman" w:eastAsia="Times New Roman" w:hAnsi="Times New Roman" w:cs="Times New Roman"/>
-          <w:sz w:val="26"/>
-          <w:szCs w:val="26"/>
-        </w:rPr>
-      </w:pPr>
       <w:r>
         <w:rPr>
           <w:rFonts w:ascii="Times New Roman" w:eastAsia="Times New Roman" w:hAnsi="Times New Roman" w:cs="Times New Roman"/>
@@ -3653,15 +4011,15 @@
         <mc:AlternateContent>
           <mc:Choice Requires="wps">
             <w:drawing>
-              <wp:anchor distT="0" distB="0" distL="114300" distR="114300" simplePos="0" relativeHeight="251659264" behindDoc="0" locked="0" layoutInCell="1" allowOverlap="1" wp14:anchorId="3F47FEC4" wp14:editId="3ADC7E86">
+              <wp:anchor distT="0" distB="0" distL="114300" distR="114300" simplePos="0" relativeHeight="251659264" behindDoc="0" locked="0" layoutInCell="1" allowOverlap="1" wp14:anchorId="3F47FEC4" wp14:editId="65645542">
                 <wp:simplePos x="0" y="0"/>
                 <wp:positionH relativeFrom="margin">
                   <wp:align>right</wp:align>
                 </wp:positionH>
                 <wp:positionV relativeFrom="paragraph">
-                  <wp:posOffset>286385</wp:posOffset>
+                  <wp:posOffset>146637</wp:posOffset>
                 </wp:positionV>
-                <wp:extent cx="1805940" cy="876300"/>
+                <wp:extent cx="1805940" cy="1072662"/>
                 <wp:effectExtent l="0" t="0" r="0" b="0"/>
                 <wp:wrapNone/>
                 <wp:docPr id="457766112" name="Text Box 1"/>
@@ -3673,7 +4031,7 @@
                       <wps:spPr>
                         <a:xfrm>
                           <a:off x="0" y="0"/>
-                          <a:ext cx="1805940" cy="876300"/>
+                          <a:ext cx="1805940" cy="1072662"/>
                         </a:xfrm>
                         <a:prstGeom prst="rect">
                           <a:avLst/>
@@ -3697,6 +4055,13 @@
                               </w:rPr>
                               <w:t>Sukabumi, 29 juni 2026</w:t>
                             </w:r>
+                          </w:p>
+                          <w:p>
+                            <w:pPr>
+                              <w:rPr>
+                                <w:rFonts w:ascii="Times New Roman" w:hAnsi="Times New Roman" w:cs="Times New Roman"/>
+                              </w:rPr>
+                            </w:pPr>
                           </w:p>
                           <w:p>
                             <w:pPr>
@@ -3751,7 +4116,7 @@
                 <v:stroke joinstyle="miter"/>
                 <v:path gradientshapeok="t" o:connecttype="rect"/>
               </v:shapetype>
-              <v:shape id="Text Box 1" o:spid="_x0000_s1026" type="#_x0000_t202" style="position:absolute;left:0;text-align:left;margin-left:91pt;margin-top:22.55pt;width:142.2pt;height:69pt;z-index:251659264;visibility:visible;mso-wrap-style:square;mso-width-percent:0;mso-height-percent:0;mso-wrap-distance-left:9pt;mso-wrap-distance-top:0;mso-wrap-distance-right:9pt;mso-wrap-distance-bottom:0;mso-position-horizontal:right;mso-position-horizontal-relative:margin;mso-position-vertical:absolute;mso-position-vertical-relative:text;mso-width-percent:0;mso-height-percent:0;mso-width-relative:margin;mso-height-relative:margin;v-text-anchor:top" o:gfxdata="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" filled="f" stroked="f" strokeweight=".5pt">
+              <v:shape id="Text Box 1" o:spid="_x0000_s1026" type="#_x0000_t202" style="position:absolute;left:0;text-align:left;margin-left:91pt;margin-top:11.55pt;width:142.2pt;height:84.45pt;z-index:251659264;visibility:visible;mso-wrap-style:square;mso-width-percent:0;mso-height-percent:0;mso-wrap-distance-left:9pt;mso-wrap-distance-top:0;mso-wrap-distance-right:9pt;mso-wrap-distance-bottom:0;mso-position-horizontal:right;mso-position-horizontal-relative:margin;mso-position-vertical:absolute;mso-position-vertical-relative:text;mso-width-percent:0;mso-height-percent:0;mso-width-relative:margin;mso-height-relative:margin;v-text-anchor:top" o:gfxdata="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" filled="f" stroked="f" strokeweight=".5pt">
                 <v:textbox>
                   <w:txbxContent>
                     <w:p>
@@ -3787,6 +4152,13 @@
                           <w:rFonts w:ascii="Times New Roman" w:hAnsi="Times New Roman" w:cs="Times New Roman"/>
                         </w:rPr>
                       </w:pPr>
+                    </w:p>
+                    <w:p>
+                      <w:pPr>
+                        <w:rPr>
+                          <w:rFonts w:ascii="Times New Roman" w:hAnsi="Times New Roman" w:cs="Times New Roman"/>
+                        </w:rPr>
+                      </w:pPr>
                       <w:r>
                         <w:rPr>
                           <w:rFonts w:ascii="Times New Roman" w:hAnsi="Times New Roman" w:cs="Times New Roman"/>
@@ -3805,6 +4177,28 @@
     </w:p>
     <w:p>
       <w:pPr>
+        <w:spacing w:before="240" w:after="240"/>
+        <w:jc w:val="both"/>
+        <w:rPr>
+          <w:rFonts w:ascii="Times New Roman" w:eastAsia="Times New Roman" w:hAnsi="Times New Roman" w:cs="Times New Roman"/>
+          <w:sz w:val="26"/>
+          <w:szCs w:val="26"/>
+        </w:rPr>
+      </w:pPr>
+    </w:p>
+    <w:p>
+      <w:pPr>
+        <w:spacing w:before="240" w:after="240"/>
+        <w:jc w:val="both"/>
+        <w:rPr>
+          <w:rFonts w:ascii="Times New Roman" w:eastAsia="Times New Roman" w:hAnsi="Times New Roman" w:cs="Times New Roman"/>
+          <w:sz w:val="26"/>
+          <w:szCs w:val="26"/>
+        </w:rPr>
+      </w:pPr>
+    </w:p>
+    <w:p>
+      <w:pPr>
         <w:jc w:val="center"/>
         <w:rPr>
           <w:rFonts w:ascii="Times New Roman" w:eastAsia="Times New Roman" w:hAnsi="Times New Roman" w:cs="Times New Roman"/>
@@ -5118,7 +5512,17 @@
           <w:sz w:val="24"/>
           <w:szCs w:val="24"/>
         </w:rPr>
-        <w:t>Latar Belakang</w:t>
+        <w:t xml:space="preserve">Latar </w:t>
+      </w:r>
+      <w:r>
+        <w:rPr>
+          <w:rFonts w:ascii="Times New Roman" w:eastAsia="Times New Roman" w:hAnsi="Times New Roman" w:cs="Times New Roman"/>
+          <w:b/>
+          <w:bCs/>
+          <w:sz w:val="24"/>
+          <w:szCs w:val="24"/>
+        </w:rPr>
+        <w:t>Pendahuluan</w:t>
       </w:r>
     </w:p>
     <w:p>
@@ -5127,6 +5531,7 @@
           <w:tab w:val="left" w:pos="567"/>
           <w:tab w:val="right" w:leader="dot" w:pos="9072"/>
         </w:tabs>
+        <w:ind w:left="284"/>
         <w:jc w:val="both"/>
         <w:rPr>
           <w:rFonts w:ascii="Times New Roman" w:eastAsia="Times New Roman" w:hAnsi="Times New Roman" w:cs="Times New Roman"/>
@@ -5620,6 +6025,7 @@
           <w:tab w:val="left" w:pos="567"/>
           <w:tab w:val="right" w:leader="dot" w:pos="9072"/>
         </w:tabs>
+        <w:ind w:left="284"/>
         <w:jc w:val="both"/>
         <w:rPr>
           <w:rFonts w:ascii="Times New Roman" w:eastAsia="Times New Roman" w:hAnsi="Times New Roman" w:cs="Times New Roman"/>
@@ -5668,6 +6074,7 @@
           <w:tab w:val="left" w:pos="567"/>
           <w:tab w:val="right" w:leader="dot" w:pos="9072"/>
         </w:tabs>
+        <w:ind w:left="284"/>
         <w:jc w:val="both"/>
         <w:rPr>
           <w:rFonts w:ascii="Times New Roman" w:eastAsia="Times New Roman" w:hAnsi="Times New Roman" w:cs="Times New Roman"/>
@@ -9467,6 +9874,36 @@
         </w:rPr>
         <w:t>?</w:t>
       </w:r>
+    </w:p>
+    <w:p>
+      <w:pPr>
+        <w:tabs>
+          <w:tab w:val="left" w:pos="567"/>
+          <w:tab w:val="right" w:leader="dot" w:pos="9072"/>
+        </w:tabs>
+        <w:jc w:val="both"/>
+        <w:rPr>
+          <w:rFonts w:ascii="Times New Roman" w:eastAsia="Times New Roman" w:hAnsi="Times New Roman" w:cs="Times New Roman"/>
+          <w:sz w:val="24"/>
+          <w:szCs w:val="24"/>
+          <w:lang w:val="en-ID"/>
+        </w:rPr>
+      </w:pPr>
+    </w:p>
+    <w:p>
+      <w:pPr>
+        <w:tabs>
+          <w:tab w:val="left" w:pos="567"/>
+          <w:tab w:val="right" w:leader="dot" w:pos="9072"/>
+        </w:tabs>
+        <w:jc w:val="both"/>
+        <w:rPr>
+          <w:rFonts w:ascii="Times New Roman" w:eastAsia="Times New Roman" w:hAnsi="Times New Roman" w:cs="Times New Roman"/>
+          <w:sz w:val="24"/>
+          <w:szCs w:val="24"/>
+          <w:lang w:val="en-ID"/>
+        </w:rPr>
+      </w:pPr>
     </w:p>
     <w:p>
       <w:pPr>
@@ -9515,6 +9952,7 @@
           <w:szCs w:val="24"/>
           <w:lang w:val="en-ID"/>
         </w:rPr>
+        <w:lastRenderedPageBreak/>
         <w:t xml:space="preserve">Tujuan </w:t>
       </w:r>
       <w:proofErr w:type="spellStart"/>
@@ -9563,7 +10001,6 @@
           <w:szCs w:val="24"/>
           <w:lang w:val="en-ID"/>
         </w:rPr>
-        <w:lastRenderedPageBreak/>
         <w:tab/>
       </w:r>
       <w:proofErr w:type="spellStart"/>
@@ -14556,7 +14993,7 @@
           <w:lang w:val="en-ID"/>
         </w:rPr>
         <w:lastRenderedPageBreak/>
-        <w:t xml:space="preserve">BAB II </w:t>
+        <w:t>BAB II</w:t>
       </w:r>
     </w:p>
     <w:p>
@@ -14664,7 +15101,51 @@
           <w:szCs w:val="24"/>
           <w:lang w:val="en-ID"/>
         </w:rPr>
-        <w:t>Terjadulu</w:t>
+        <w:t>Ter</w:t>
+      </w:r>
+      <w:r>
+        <w:rPr>
+          <w:rFonts w:ascii="Times New Roman" w:eastAsia="Times New Roman" w:hAnsi="Times New Roman" w:cs="Times New Roman"/>
+          <w:b/>
+          <w:bCs/>
+          <w:sz w:val="24"/>
+          <w:szCs w:val="24"/>
+          <w:lang w:val="en-ID"/>
+        </w:rPr>
+        <w:t>d</w:t>
+      </w:r>
+      <w:r>
+        <w:rPr>
+          <w:rFonts w:ascii="Times New Roman" w:eastAsia="Times New Roman" w:hAnsi="Times New Roman" w:cs="Times New Roman"/>
+          <w:b/>
+          <w:bCs/>
+          <w:sz w:val="24"/>
+          <w:szCs w:val="24"/>
+          <w:lang w:val="en-ID"/>
+        </w:rPr>
+        <w:t>a</w:t>
+      </w:r>
+      <w:r>
+        <w:rPr>
+          <w:rFonts w:ascii="Times New Roman" w:eastAsia="Times New Roman" w:hAnsi="Times New Roman" w:cs="Times New Roman"/>
+          <w:b/>
+          <w:bCs/>
+          <w:sz w:val="24"/>
+          <w:szCs w:val="24"/>
+          <w:lang w:val="en-ID"/>
+        </w:rPr>
+        <w:t>h</w:t>
+      </w:r>
+      <w:r>
+        <w:rPr>
+          <w:rFonts w:ascii="Times New Roman" w:eastAsia="Times New Roman" w:hAnsi="Times New Roman" w:cs="Times New Roman"/>
+          <w:b/>
+          <w:bCs/>
+          <w:sz w:val="24"/>
+          <w:szCs w:val="24"/>
+          <w:lang w:val="en-ID"/>
+        </w:rPr>
+        <w:t>ulu</w:t>
       </w:r>
       <w:proofErr w:type="spellEnd"/>
     </w:p>
@@ -23360,6 +23841,8 @@
         <w:jc w:val="both"/>
         <w:rPr>
           <w:rFonts w:ascii="Times New Roman" w:eastAsia="Times New Roman" w:hAnsi="Times New Roman" w:cs="Times New Roman"/>
+          <w:b/>
+          <w:bCs/>
           <w:sz w:val="24"/>
           <w:szCs w:val="24"/>
           <w:lang w:val="en-ID"/>
@@ -23368,6 +23851,8 @@
       <w:r>
         <w:rPr>
           <w:rFonts w:ascii="Times New Roman" w:eastAsia="Times New Roman" w:hAnsi="Times New Roman" w:cs="Times New Roman"/>
+          <w:b/>
+          <w:bCs/>
           <w:sz w:val="24"/>
           <w:szCs w:val="24"/>
           <w:lang w:val="en-ID"/>
@@ -30611,48 +31096,11 @@
         <w:jc w:val="both"/>
         <w:rPr>
           <w:rFonts w:ascii="Times New Roman" w:eastAsia="Times New Roman" w:hAnsi="Times New Roman" w:cs="Times New Roman"/>
-          <w:b/>
-          <w:bCs/>
           <w:sz w:val="24"/>
           <w:szCs w:val="24"/>
           <w:lang w:val="en-ID"/>
         </w:rPr>
       </w:pPr>
-      <w:r>
-        <w:rPr>
-          <w:rFonts w:ascii="Times New Roman" w:eastAsia="Times New Roman" w:hAnsi="Times New Roman" w:cs="Times New Roman"/>
-          <w:b/>
-          <w:bCs/>
-          <w:sz w:val="24"/>
-          <w:szCs w:val="24"/>
-          <w:lang w:val="en-ID"/>
-        </w:rPr>
-        <w:t xml:space="preserve">2.8 </w:t>
-      </w:r>
-      <w:proofErr w:type="spellStart"/>
-      <w:r>
-        <w:rPr>
-          <w:rFonts w:ascii="Times New Roman" w:eastAsia="Times New Roman" w:hAnsi="Times New Roman" w:cs="Times New Roman"/>
-          <w:b/>
-          <w:bCs/>
-          <w:sz w:val="24"/>
-          <w:szCs w:val="24"/>
-          <w:lang w:val="en-ID"/>
-        </w:rPr>
-        <w:t>Evaluasi</w:t>
-      </w:r>
-      <w:proofErr w:type="spellEnd"/>
-      <w:r>
-        <w:rPr>
-          <w:rFonts w:ascii="Times New Roman" w:eastAsia="Times New Roman" w:hAnsi="Times New Roman" w:cs="Times New Roman"/>
-          <w:b/>
-          <w:bCs/>
-          <w:sz w:val="24"/>
-          <w:szCs w:val="24"/>
-          <w:lang w:val="en-ID"/>
-        </w:rPr>
-        <w:t xml:space="preserve"> Model Klasifikasi </w:t>
-      </w:r>
     </w:p>
     <w:p>
       <w:pPr>
@@ -30670,6 +31118,95 @@
           <w:lang w:val="en-ID"/>
         </w:rPr>
       </w:pPr>
+    </w:p>
+    <w:p>
+      <w:pPr>
+        <w:pStyle w:val="ListParagraph"/>
+        <w:tabs>
+          <w:tab w:val="left" w:pos="426"/>
+          <w:tab w:val="right" w:leader="dot" w:pos="9072"/>
+        </w:tabs>
+        <w:ind w:left="0"/>
+        <w:jc w:val="both"/>
+        <w:rPr>
+          <w:rFonts w:ascii="Times New Roman" w:eastAsia="Times New Roman" w:hAnsi="Times New Roman" w:cs="Times New Roman"/>
+          <w:sz w:val="24"/>
+          <w:szCs w:val="24"/>
+          <w:lang w:val="en-ID"/>
+        </w:rPr>
+      </w:pPr>
+    </w:p>
+    <w:p>
+      <w:pPr>
+        <w:pStyle w:val="ListParagraph"/>
+        <w:tabs>
+          <w:tab w:val="left" w:pos="426"/>
+          <w:tab w:val="right" w:leader="dot" w:pos="9072"/>
+        </w:tabs>
+        <w:ind w:left="0"/>
+        <w:jc w:val="both"/>
+        <w:rPr>
+          <w:rFonts w:ascii="Times New Roman" w:eastAsia="Times New Roman" w:hAnsi="Times New Roman" w:cs="Times New Roman"/>
+          <w:b/>
+          <w:bCs/>
+          <w:sz w:val="24"/>
+          <w:szCs w:val="24"/>
+          <w:lang w:val="en-ID"/>
+        </w:rPr>
+      </w:pPr>
+      <w:r>
+        <w:rPr>
+          <w:rFonts w:ascii="Times New Roman" w:eastAsia="Times New Roman" w:hAnsi="Times New Roman" w:cs="Times New Roman"/>
+          <w:b/>
+          <w:bCs/>
+          <w:sz w:val="24"/>
+          <w:szCs w:val="24"/>
+          <w:lang w:val="en-ID"/>
+        </w:rPr>
+        <w:lastRenderedPageBreak/>
+        <w:t xml:space="preserve">2.8 </w:t>
+      </w:r>
+      <w:proofErr w:type="spellStart"/>
+      <w:r>
+        <w:rPr>
+          <w:rFonts w:ascii="Times New Roman" w:eastAsia="Times New Roman" w:hAnsi="Times New Roman" w:cs="Times New Roman"/>
+          <w:b/>
+          <w:bCs/>
+          <w:sz w:val="24"/>
+          <w:szCs w:val="24"/>
+          <w:lang w:val="en-ID"/>
+        </w:rPr>
+        <w:t>Evaluasi</w:t>
+      </w:r>
+      <w:proofErr w:type="spellEnd"/>
+      <w:r>
+        <w:rPr>
+          <w:rFonts w:ascii="Times New Roman" w:eastAsia="Times New Roman" w:hAnsi="Times New Roman" w:cs="Times New Roman"/>
+          <w:b/>
+          <w:bCs/>
+          <w:sz w:val="24"/>
+          <w:szCs w:val="24"/>
+          <w:lang w:val="en-ID"/>
+        </w:rPr>
+        <w:t xml:space="preserve"> Model Klasifikasi </w:t>
+      </w:r>
+    </w:p>
+    <w:p>
+      <w:pPr>
+        <w:pStyle w:val="ListParagraph"/>
+        <w:tabs>
+          <w:tab w:val="left" w:pos="426"/>
+          <w:tab w:val="right" w:leader="dot" w:pos="9072"/>
+        </w:tabs>
+        <w:ind w:left="0"/>
+        <w:jc w:val="both"/>
+        <w:rPr>
+          <w:rFonts w:ascii="Times New Roman" w:eastAsia="Times New Roman" w:hAnsi="Times New Roman" w:cs="Times New Roman"/>
+          <w:sz w:val="24"/>
+          <w:szCs w:val="24"/>
+          <w:lang w:val="en-ID"/>
+        </w:rPr>
+      </w:pPr>
       <w:r>
         <w:rPr>
           <w:rFonts w:ascii="Times New Roman" w:eastAsia="Times New Roman" w:hAnsi="Times New Roman" w:cs="Times New Roman"/>
@@ -30957,17 +31494,7 @@
           <w:szCs w:val="24"/>
           <w:lang w:val="en-ID"/>
         </w:rPr>
-        <w:t xml:space="preserve"> </w:t>
-      </w:r>
-      <w:r>
-        <w:rPr>
-          <w:rFonts w:ascii="Times New Roman" w:eastAsia="Times New Roman" w:hAnsi="Times New Roman" w:cs="Times New Roman"/>
-          <w:sz w:val="24"/>
-          <w:szCs w:val="24"/>
-          <w:lang w:val="en-ID"/>
-        </w:rPr>
-        <w:lastRenderedPageBreak/>
-        <w:t xml:space="preserve">data yang </w:t>
+        <w:t xml:space="preserve"> data yang </w:t>
       </w:r>
       <w:proofErr w:type="spellStart"/>
       <w:r>
@@ -34897,6 +35424,7 @@
           <w:szCs w:val="24"/>
           <w:lang w:val="en-ID"/>
         </w:rPr>
+        <w:lastRenderedPageBreak/>
         <w:t>Integrasi model machine learning</w:t>
       </w:r>
     </w:p>
@@ -35113,7 +35641,6 @@
           <w:szCs w:val="24"/>
           <w:lang w:val="en-ID"/>
         </w:rPr>
-        <w:lastRenderedPageBreak/>
         <w:t>Output real-time</w:t>
       </w:r>
     </w:p>
@@ -35729,6 +36256,15 @@
           <w:szCs w:val="24"/>
           <w:lang w:val="en-ID"/>
         </w:rPr>
+        <w:t xml:space="preserve"> personal,</w:t>
+      </w:r>
+      <w:r>
+        <w:rPr>
+          <w:rFonts w:ascii="Times New Roman" w:eastAsia="Times New Roman" w:hAnsi="Times New Roman" w:cs="Times New Roman"/>
+          <w:sz w:val="24"/>
+          <w:szCs w:val="24"/>
+          <w:lang w:val="en-ID"/>
+        </w:rPr>
         <w:t xml:space="preserve"> </w:t>
       </w:r>
       <w:proofErr w:type="spellStart"/>
@@ -36539,6 +37075,1652 @@
           <w:lang w:val="en-ID"/>
         </w:rPr>
         <w:t xml:space="preserve"> </w:t>
+      </w:r>
+    </w:p>
+    <w:p>
+      <w:pPr>
+        <w:tabs>
+          <w:tab w:val="left" w:pos="993"/>
+          <w:tab w:val="right" w:leader="dot" w:pos="9072"/>
+        </w:tabs>
+        <w:jc w:val="both"/>
+        <w:rPr>
+          <w:rFonts w:ascii="Times New Roman" w:eastAsia="Times New Roman" w:hAnsi="Times New Roman" w:cs="Times New Roman"/>
+          <w:sz w:val="24"/>
+          <w:szCs w:val="24"/>
+          <w:lang w:val="en-ID"/>
+        </w:rPr>
+      </w:pPr>
+    </w:p>
+    <w:p>
+      <w:pPr>
+        <w:rPr>
+          <w:rFonts w:ascii="Times New Roman" w:eastAsia="Times New Roman" w:hAnsi="Times New Roman" w:cs="Times New Roman"/>
+          <w:sz w:val="24"/>
+          <w:szCs w:val="24"/>
+          <w:lang w:val="en-ID"/>
+        </w:rPr>
+      </w:pPr>
+      <w:r>
+        <w:rPr>
+          <w:rFonts w:ascii="Times New Roman" w:eastAsia="Times New Roman" w:hAnsi="Times New Roman" w:cs="Times New Roman"/>
+          <w:sz w:val="24"/>
+          <w:szCs w:val="24"/>
+          <w:lang w:val="en-ID"/>
+        </w:rPr>
+        <w:br w:type="page"/>
+      </w:r>
+    </w:p>
+    <w:p>
+      <w:pPr>
+        <w:tabs>
+          <w:tab w:val="left" w:pos="993"/>
+          <w:tab w:val="right" w:leader="dot" w:pos="9072"/>
+        </w:tabs>
+        <w:jc w:val="center"/>
+        <w:rPr>
+          <w:rFonts w:ascii="Times New Roman" w:eastAsia="Times New Roman" w:hAnsi="Times New Roman" w:cs="Times New Roman"/>
+          <w:sz w:val="24"/>
+          <w:szCs w:val="24"/>
+          <w:lang w:val="en-ID"/>
+        </w:rPr>
+      </w:pPr>
+      <w:r>
+        <w:rPr>
+          <w:rFonts w:ascii="Times New Roman" w:eastAsia="Times New Roman" w:hAnsi="Times New Roman" w:cs="Times New Roman"/>
+          <w:sz w:val="24"/>
+          <w:szCs w:val="24"/>
+          <w:lang w:val="en-ID"/>
+        </w:rPr>
+        <w:lastRenderedPageBreak/>
+        <w:t xml:space="preserve">BAB III </w:t>
+      </w:r>
+    </w:p>
+    <w:p>
+      <w:pPr>
+        <w:tabs>
+          <w:tab w:val="left" w:pos="993"/>
+          <w:tab w:val="right" w:leader="dot" w:pos="9072"/>
+        </w:tabs>
+        <w:jc w:val="center"/>
+        <w:rPr>
+          <w:rFonts w:ascii="Times New Roman" w:eastAsia="Times New Roman" w:hAnsi="Times New Roman" w:cs="Times New Roman"/>
+          <w:sz w:val="24"/>
+          <w:szCs w:val="24"/>
+          <w:lang w:val="en-ID"/>
+        </w:rPr>
+      </w:pPr>
+    </w:p>
+    <w:p>
+      <w:pPr>
+        <w:tabs>
+          <w:tab w:val="left" w:pos="993"/>
+          <w:tab w:val="right" w:leader="dot" w:pos="9072"/>
+        </w:tabs>
+        <w:jc w:val="center"/>
+        <w:rPr>
+          <w:rFonts w:ascii="Times New Roman" w:eastAsia="Times New Roman" w:hAnsi="Times New Roman" w:cs="Times New Roman"/>
+          <w:sz w:val="24"/>
+          <w:szCs w:val="24"/>
+          <w:lang w:val="en-ID"/>
+        </w:rPr>
+      </w:pPr>
+      <w:r>
+        <w:rPr>
+          <w:rFonts w:ascii="Times New Roman" w:eastAsia="Times New Roman" w:hAnsi="Times New Roman" w:cs="Times New Roman"/>
+          <w:sz w:val="24"/>
+          <w:szCs w:val="24"/>
+          <w:lang w:val="en-ID"/>
+        </w:rPr>
+        <w:t>METODOLOGI PENELITIAN</w:t>
+      </w:r>
+    </w:p>
+    <w:p>
+      <w:pPr>
+        <w:tabs>
+          <w:tab w:val="left" w:pos="993"/>
+          <w:tab w:val="right" w:leader="dot" w:pos="9072"/>
+        </w:tabs>
+        <w:jc w:val="center"/>
+        <w:rPr>
+          <w:rFonts w:ascii="Times New Roman" w:eastAsia="Times New Roman" w:hAnsi="Times New Roman" w:cs="Times New Roman"/>
+          <w:sz w:val="24"/>
+          <w:szCs w:val="24"/>
+          <w:lang w:val="en-ID"/>
+        </w:rPr>
+      </w:pPr>
+    </w:p>
+    <w:p>
+      <w:pPr>
+        <w:tabs>
+          <w:tab w:val="left" w:pos="426"/>
+          <w:tab w:val="right" w:leader="dot" w:pos="9072"/>
+        </w:tabs>
+        <w:jc w:val="both"/>
+        <w:rPr>
+          <w:rFonts w:ascii="Times New Roman" w:eastAsia="Times New Roman" w:hAnsi="Times New Roman" w:cs="Times New Roman"/>
+          <w:sz w:val="24"/>
+          <w:szCs w:val="24"/>
+        </w:rPr>
+      </w:pPr>
+      <w:r>
+        <w:rPr>
+          <w:rFonts w:ascii="Times New Roman" w:eastAsia="Times New Roman" w:hAnsi="Times New Roman" w:cs="Times New Roman"/>
+          <w:sz w:val="24"/>
+          <w:szCs w:val="24"/>
+        </w:rPr>
+        <w:tab/>
+      </w:r>
+      <w:r>
+        <w:rPr>
+          <w:rFonts w:ascii="Times New Roman" w:eastAsia="Times New Roman" w:hAnsi="Times New Roman" w:cs="Times New Roman"/>
+          <w:sz w:val="24"/>
+          <w:szCs w:val="24"/>
+        </w:rPr>
+        <w:t>Bab ini menjelaskan metode penelitian yang digunakan sebagai pedoman dalam pelaksanaan penelitian. Tahapan penelitian dimulai dari penyusunan kerangka alur penelitian, pengumpulan dataset, analisis dataset, data preprocessing, pembagian dataset, pengembangan model menggunakan algoritma Random Forest, evaluasi kinerja model, hingga implementasi model ke dalam aplikasi berbasis web menggunakan Streamlit. Metodologi yang disusun bertujuan untuk menghasilkan model prediksi academic burnout mahasiswa yang memiliki tingkat akurasi dan performa yang baik serta dapat digunakan sebagai dasar dalam proses deteksi dini.</w:t>
+      </w:r>
+    </w:p>
+    <w:p>
+      <w:pPr>
+        <w:jc w:val="center"/>
+        <w:rPr>
+          <w:rFonts w:ascii="Times New Roman" w:eastAsia="Times New Roman" w:hAnsi="Times New Roman" w:cs="Times New Roman"/>
+          <w:sz w:val="24"/>
+          <w:szCs w:val="24"/>
+        </w:rPr>
+      </w:pPr>
+      <w:r>
+        <w:rPr>
+          <w:rFonts w:ascii="Times New Roman" w:eastAsia="Times New Roman" w:hAnsi="Times New Roman" w:cs="Times New Roman"/>
+          <w:noProof/>
+          <w:sz w:val="24"/>
+          <w:szCs w:val="24"/>
+        </w:rPr>
+        <mc:AlternateContent>
+          <mc:Choice Requires="wps">
+            <w:drawing>
+              <wp:anchor distT="0" distB="0" distL="114300" distR="114300" simplePos="0" relativeHeight="251661312" behindDoc="0" locked="0" layoutInCell="1" allowOverlap="1" wp14:anchorId="58F13381" wp14:editId="1EFE330B">
+                <wp:simplePos x="0" y="0"/>
+                <wp:positionH relativeFrom="margin">
+                  <wp:align>center</wp:align>
+                </wp:positionH>
+                <wp:positionV relativeFrom="paragraph">
+                  <wp:posOffset>6221730</wp:posOffset>
+                </wp:positionV>
+                <wp:extent cx="2965939" cy="298939"/>
+                <wp:effectExtent l="0" t="0" r="0" b="6350"/>
+                <wp:wrapNone/>
+                <wp:docPr id="336581449" name="Text Box 3"/>
+                <wp:cNvGraphicFramePr/>
+                <a:graphic xmlns:a="http://schemas.openxmlformats.org/drawingml/2006/main">
+                  <a:graphicData uri="http://schemas.microsoft.com/office/word/2010/wordprocessingShape">
+                    <wps:wsp>
+                      <wps:cNvSpPr txBox="1"/>
+                      <wps:spPr>
+                        <a:xfrm>
+                          <a:off x="0" y="0"/>
+                          <a:ext cx="2965939" cy="298939"/>
+                        </a:xfrm>
+                        <a:prstGeom prst="rect">
+                          <a:avLst/>
+                        </a:prstGeom>
+                        <a:noFill/>
+                        <a:ln w="6350">
+                          <a:noFill/>
+                        </a:ln>
+                      </wps:spPr>
+                      <wps:txbx>
+                        <w:txbxContent>
+                          <w:p>
+                            <w:pPr>
+                              <w:rPr>
+                                <w:rFonts w:ascii="Times New Roman" w:hAnsi="Times New Roman" w:cs="Times New Roman"/>
+                              </w:rPr>
+                            </w:pPr>
+                            <w:r>
+                              <w:rPr>
+                                <w:rFonts w:ascii="Times New Roman" w:hAnsi="Times New Roman" w:cs="Times New Roman"/>
+                              </w:rPr>
+                              <w:t>Gambar 3.1 Diagram alur metodologi penelitian</w:t>
+                            </w:r>
+                          </w:p>
+                        </w:txbxContent>
+                      </wps:txbx>
+                      <wps:bodyPr rot="0" spcFirstLastPara="0" vertOverflow="overflow" horzOverflow="overflow" vert="horz" wrap="square" lIns="91440" tIns="45720" rIns="91440" bIns="45720" numCol="1" spcCol="0" rtlCol="0" fromWordArt="0" anchor="t" anchorCtr="0" forceAA="0" compatLnSpc="1">
+                        <a:prstTxWarp prst="textNoShape">
+                          <a:avLst/>
+                        </a:prstTxWarp>
+                        <a:noAutofit/>
+                      </wps:bodyPr>
+                    </wps:wsp>
+                  </a:graphicData>
+                </a:graphic>
+                <wp14:sizeRelH relativeFrom="margin">
+                  <wp14:pctWidth>0</wp14:pctWidth>
+                </wp14:sizeRelH>
+              </wp:anchor>
+            </w:drawing>
+          </mc:Choice>
+          <mc:Fallback>
+            <w:pict>
+              <v:shape w14:anchorId="58F13381" id="Text Box 3" o:spid="_x0000_s1027" type="#_x0000_t202" style="position:absolute;left:0;text-align:left;margin-left:0;margin-top:489.9pt;width:233.55pt;height:23.55pt;z-index:251661312;visibility:visible;mso-wrap-style:square;mso-width-percent:0;mso-wrap-distance-left:9pt;mso-wrap-distance-top:0;mso-wrap-distance-right:9pt;mso-wrap-distance-bottom:0;mso-position-horizontal:center;mso-position-horizontal-relative:margin;mso-position-vertical:absolute;mso-position-vertical-relative:text;mso-width-percent:0;mso-width-relative:margin;v-text-anchor:top" o:gfxdata="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" filled="f" stroked="f" strokeweight=".5pt">
+                <v:textbox>
+                  <w:txbxContent>
+                    <w:p>
+                      <w:pPr>
+                        <w:rPr>
+                          <w:rFonts w:ascii="Times New Roman" w:hAnsi="Times New Roman" w:cs="Times New Roman"/>
+                        </w:rPr>
+                      </w:pPr>
+                      <w:r>
+                        <w:rPr>
+                          <w:rFonts w:ascii="Times New Roman" w:hAnsi="Times New Roman" w:cs="Times New Roman"/>
+                        </w:rPr>
+                        <w:t>Gambar 3.1 Diagram alur metodologi penelitian</w:t>
+                      </w:r>
+                    </w:p>
+                  </w:txbxContent>
+                </v:textbox>
+                <w10:wrap anchorx="margin"/>
+              </v:shape>
+            </w:pict>
+          </mc:Fallback>
+        </mc:AlternateContent>
+      </w:r>
+      <w:r>
+        <w:rPr>
+          <w:rFonts w:ascii="Times New Roman" w:eastAsia="Times New Roman" w:hAnsi="Times New Roman" w:cs="Times New Roman"/>
+          <w:noProof/>
+          <w:sz w:val="24"/>
+          <w:szCs w:val="24"/>
+        </w:rPr>
+        <w:drawing>
+          <wp:anchor distT="0" distB="0" distL="114300" distR="114300" simplePos="0" relativeHeight="251660288" behindDoc="0" locked="0" layoutInCell="1" allowOverlap="1" wp14:anchorId="4ED54652" wp14:editId="18F8F8E7">
+            <wp:simplePos x="0" y="0"/>
+            <wp:positionH relativeFrom="margin">
+              <wp:align>center</wp:align>
+            </wp:positionH>
+            <wp:positionV relativeFrom="paragraph">
+              <wp:posOffset>108197</wp:posOffset>
+            </wp:positionV>
+            <wp:extent cx="1178170" cy="5980792"/>
+            <wp:effectExtent l="0" t="0" r="3175" b="0"/>
+            <wp:wrapNone/>
+            <wp:docPr id="1692608161" name="Picture 2"/>
+            <wp:cNvGraphicFramePr>
+              <a:graphicFrameLocks xmlns:a="http://schemas.openxmlformats.org/drawingml/2006/main" noChangeAspect="1"/>
+            </wp:cNvGraphicFramePr>
+            <a:graphic xmlns:a="http://schemas.openxmlformats.org/drawingml/2006/main">
+              <a:graphicData uri="http://schemas.openxmlformats.org/drawingml/2006/picture">
+                <pic:pic xmlns:pic="http://schemas.openxmlformats.org/drawingml/2006/picture">
+                  <pic:nvPicPr>
+                    <pic:cNvPr id="1692608161" name="Picture 1692608161"/>
+                    <pic:cNvPicPr/>
+                  </pic:nvPicPr>
+                  <pic:blipFill>
+                    <a:blip r:embed="rId9" cstate="print">
+                      <a:extLst>
+                        <a:ext uri="{28A0092B-C50C-407E-A947-70E740481C1C}">
+                          <a14:useLocalDpi xmlns:a14="http://schemas.microsoft.com/office/drawing/2010/main" val="0"/>
+                        </a:ext>
+                      </a:extLst>
+                    </a:blip>
+                    <a:stretch>
+                      <a:fillRect/>
+                    </a:stretch>
+                  </pic:blipFill>
+                  <pic:spPr>
+                    <a:xfrm>
+                      <a:off x="0" y="0"/>
+                      <a:ext cx="1178170" cy="5980792"/>
+                    </a:xfrm>
+                    <a:prstGeom prst="rect">
+                      <a:avLst/>
+                    </a:prstGeom>
+                  </pic:spPr>
+                </pic:pic>
+              </a:graphicData>
+            </a:graphic>
+            <wp14:sizeRelH relativeFrom="page">
+              <wp14:pctWidth>0</wp14:pctWidth>
+            </wp14:sizeRelH>
+            <wp14:sizeRelV relativeFrom="page">
+              <wp14:pctHeight>0</wp14:pctHeight>
+            </wp14:sizeRelV>
+          </wp:anchor>
+        </w:drawing>
+      </w:r>
+      <w:r>
+        <w:rPr>
+          <w:rFonts w:ascii="Times New Roman" w:eastAsia="Times New Roman" w:hAnsi="Times New Roman" w:cs="Times New Roman"/>
+          <w:sz w:val="24"/>
+          <w:szCs w:val="24"/>
+        </w:rPr>
+        <w:br w:type="page"/>
+      </w:r>
+    </w:p>
+    <w:p>
+      <w:pPr>
+        <w:tabs>
+          <w:tab w:val="left" w:pos="426"/>
+          <w:tab w:val="right" w:leader="dot" w:pos="9072"/>
+        </w:tabs>
+        <w:jc w:val="both"/>
+        <w:rPr>
+          <w:rFonts w:ascii="Times New Roman" w:eastAsia="Times New Roman" w:hAnsi="Times New Roman" w:cs="Times New Roman"/>
+          <w:b/>
+          <w:bCs/>
+          <w:sz w:val="24"/>
+          <w:szCs w:val="24"/>
+        </w:rPr>
+      </w:pPr>
+      <w:r>
+        <w:rPr>
+          <w:rFonts w:ascii="Times New Roman" w:eastAsia="Times New Roman" w:hAnsi="Times New Roman" w:cs="Times New Roman"/>
+          <w:b/>
+          <w:bCs/>
+          <w:sz w:val="24"/>
+          <w:szCs w:val="24"/>
+        </w:rPr>
+        <w:lastRenderedPageBreak/>
+        <w:t>3.1 Kerangka alur penelitian</w:t>
+      </w:r>
+    </w:p>
+    <w:p>
+      <w:pPr>
+        <w:tabs>
+          <w:tab w:val="left" w:pos="426"/>
+          <w:tab w:val="right" w:leader="dot" w:pos="9072"/>
+        </w:tabs>
+        <w:jc w:val="both"/>
+        <w:rPr>
+          <w:rFonts w:ascii="Times New Roman" w:eastAsia="Times New Roman" w:hAnsi="Times New Roman" w:cs="Times New Roman"/>
+          <w:sz w:val="24"/>
+          <w:szCs w:val="24"/>
+        </w:rPr>
+      </w:pPr>
+      <w:r>
+        <w:rPr>
+          <w:rFonts w:ascii="Times New Roman" w:eastAsia="Times New Roman" w:hAnsi="Times New Roman" w:cs="Times New Roman"/>
+          <w:sz w:val="24"/>
+          <w:szCs w:val="24"/>
+        </w:rPr>
+        <w:tab/>
+      </w:r>
+      <w:r>
+        <w:rPr>
+          <w:rFonts w:ascii="Times New Roman" w:eastAsia="Times New Roman" w:hAnsi="Times New Roman" w:cs="Times New Roman"/>
+          <w:sz w:val="24"/>
+          <w:szCs w:val="24"/>
+        </w:rPr>
+        <w:t xml:space="preserve">Kerangka alur penelitian merupakan tahapan yang dilakukan dalam penelitian ini untuk membangun model prediksi </w:t>
+      </w:r>
+      <w:r>
+        <w:rPr>
+          <w:rFonts w:ascii="Times New Roman" w:eastAsia="Times New Roman" w:hAnsi="Times New Roman" w:cs="Times New Roman"/>
+          <w:i/>
+          <w:iCs/>
+          <w:sz w:val="24"/>
+          <w:szCs w:val="24"/>
+        </w:rPr>
+        <w:t>academic burnout</w:t>
+      </w:r>
+      <w:r>
+        <w:rPr>
+          <w:rFonts w:ascii="Times New Roman" w:eastAsia="Times New Roman" w:hAnsi="Times New Roman" w:cs="Times New Roman"/>
+          <w:sz w:val="24"/>
+          <w:szCs w:val="24"/>
+        </w:rPr>
+        <w:t xml:space="preserve"> pada mahasiswa menggunakan algoritma Random Forest. Setiap tahapan disusun secara sistematis, dimulai dari pengumpulan dataset, analisis dataset, data preprocessing, pembagian dataset, pengembangan model Random Forest, evaluasi model, hingga implementasi model dalam bentuk aplikasi berbasis web menggunakan Streamlit. Kerangka alur penelitian ini bertujuan untuk memberikan gambaran mengenai proses penelitian sehingga setiap tahapan dapat dilaksanakan secara terstruktur dan sesuai dengan tujuan penelitian yang telah ditetapkan. Tahapan penelitian yang dilakukan adalah sebagai berikut</w:t>
+      </w:r>
+      <w:r>
+        <w:rPr>
+          <w:rFonts w:ascii="Times New Roman" w:eastAsia="Times New Roman" w:hAnsi="Times New Roman" w:cs="Times New Roman"/>
+          <w:sz w:val="24"/>
+          <w:szCs w:val="24"/>
+        </w:rPr>
+        <w:t>.</w:t>
+      </w:r>
+    </w:p>
+    <w:p>
+      <w:pPr>
+        <w:pStyle w:val="ListParagraph"/>
+        <w:tabs>
+          <w:tab w:val="left" w:pos="426"/>
+          <w:tab w:val="right" w:leader="dot" w:pos="9072"/>
+        </w:tabs>
+        <w:ind w:left="360"/>
+        <w:jc w:val="both"/>
+        <w:rPr>
+          <w:rFonts w:ascii="Times New Roman" w:eastAsia="Times New Roman" w:hAnsi="Times New Roman" w:cs="Times New Roman"/>
+          <w:sz w:val="24"/>
+          <w:szCs w:val="24"/>
+        </w:rPr>
+      </w:pPr>
+      <w:r>
+        <w:rPr>
+          <w:rFonts w:ascii="Times New Roman" w:eastAsia="Times New Roman" w:hAnsi="Times New Roman" w:cs="Times New Roman"/>
+          <w:sz w:val="24"/>
+          <w:szCs w:val="24"/>
+        </w:rPr>
+        <w:t xml:space="preserve">3.1.1 </w:t>
+      </w:r>
+      <w:r>
+        <w:rPr>
+          <w:rFonts w:ascii="Times New Roman" w:eastAsia="Times New Roman" w:hAnsi="Times New Roman" w:cs="Times New Roman"/>
+          <w:sz w:val="24"/>
+          <w:szCs w:val="24"/>
+        </w:rPr>
+        <w:t>Pengumpulan Dataset</w:t>
+      </w:r>
+    </w:p>
+    <w:p>
+      <w:pPr>
+        <w:pStyle w:val="ListParagraph"/>
+        <w:tabs>
+          <w:tab w:val="left" w:pos="1276"/>
+          <w:tab w:val="right" w:leader="dot" w:pos="9072"/>
+        </w:tabs>
+        <w:ind w:left="993"/>
+        <w:jc w:val="both"/>
+        <w:rPr>
+          <w:rFonts w:ascii="Times New Roman" w:eastAsia="Times New Roman" w:hAnsi="Times New Roman" w:cs="Times New Roman"/>
+          <w:sz w:val="24"/>
+          <w:szCs w:val="24"/>
+        </w:rPr>
+      </w:pPr>
+      <w:r>
+        <w:rPr>
+          <w:rFonts w:ascii="Times New Roman" w:eastAsia="Times New Roman" w:hAnsi="Times New Roman" w:cs="Times New Roman"/>
+          <w:noProof/>
+          <w:sz w:val="24"/>
+          <w:szCs w:val="24"/>
+        </w:rPr>
+        <w:drawing>
+          <wp:anchor distT="0" distB="0" distL="114300" distR="114300" simplePos="0" relativeHeight="251665408" behindDoc="0" locked="0" layoutInCell="1" allowOverlap="1" wp14:anchorId="31F01485" wp14:editId="42ADCDA7">
+            <wp:simplePos x="0" y="0"/>
+            <wp:positionH relativeFrom="column">
+              <wp:posOffset>289560</wp:posOffset>
+            </wp:positionH>
+            <wp:positionV relativeFrom="paragraph">
+              <wp:posOffset>1922780</wp:posOffset>
+            </wp:positionV>
+            <wp:extent cx="5041900" cy="2047240"/>
+            <wp:effectExtent l="0" t="0" r="6350" b="0"/>
+            <wp:wrapTopAndBottom/>
+            <wp:docPr id="908952952" name="Picture 3"/>
+            <wp:cNvGraphicFramePr>
+              <a:graphicFrameLocks xmlns:a="http://schemas.openxmlformats.org/drawingml/2006/main" noChangeAspect="1"/>
+            </wp:cNvGraphicFramePr>
+            <a:graphic xmlns:a="http://schemas.openxmlformats.org/drawingml/2006/main">
+              <a:graphicData uri="http://schemas.openxmlformats.org/drawingml/2006/picture">
+                <pic:pic xmlns:pic="http://schemas.openxmlformats.org/drawingml/2006/picture">
+                  <pic:nvPicPr>
+                    <pic:cNvPr id="908952952" name="Picture 908952952"/>
+                    <pic:cNvPicPr/>
+                  </pic:nvPicPr>
+                  <pic:blipFill>
+                    <a:blip r:embed="rId10">
+                      <a:extLst>
+                        <a:ext uri="{28A0092B-C50C-407E-A947-70E740481C1C}">
+                          <a14:useLocalDpi xmlns:a14="http://schemas.microsoft.com/office/drawing/2010/main" val="0"/>
+                        </a:ext>
+                      </a:extLst>
+                    </a:blip>
+                    <a:stretch>
+                      <a:fillRect/>
+                    </a:stretch>
+                  </pic:blipFill>
+                  <pic:spPr>
+                    <a:xfrm>
+                      <a:off x="0" y="0"/>
+                      <a:ext cx="5041900" cy="2047240"/>
+                    </a:xfrm>
+                    <a:prstGeom prst="rect">
+                      <a:avLst/>
+                    </a:prstGeom>
+                  </pic:spPr>
+                </pic:pic>
+              </a:graphicData>
+            </a:graphic>
+            <wp14:sizeRelH relativeFrom="page">
+              <wp14:pctWidth>0</wp14:pctWidth>
+            </wp14:sizeRelH>
+            <wp14:sizeRelV relativeFrom="page">
+              <wp14:pctHeight>0</wp14:pctHeight>
+            </wp14:sizeRelV>
+          </wp:anchor>
+        </w:drawing>
+      </w:r>
+      <w:r>
+        <w:rPr>
+          <w:rFonts w:ascii="Times New Roman" w:eastAsia="Times New Roman" w:hAnsi="Times New Roman" w:cs="Times New Roman"/>
+          <w:sz w:val="24"/>
+          <w:szCs w:val="24"/>
+        </w:rPr>
+        <w:tab/>
+      </w:r>
+      <w:r>
+        <w:rPr>
+          <w:rFonts w:ascii="Times New Roman" w:eastAsia="Times New Roman" w:hAnsi="Times New Roman" w:cs="Times New Roman"/>
+          <w:sz w:val="24"/>
+          <w:szCs w:val="24"/>
+        </w:rPr>
+        <w:t xml:space="preserve">Tahap pertama dalam penelitian ini adalah pengumpulan dataset yang akan digunakan sebagai sumber data penelitian. Dataset yang digunakan berisi informasi mengenai faktor akademik, gaya hidup, dan kondisi psikologis mahasiswa yang berkaitan dengan tingkat </w:t>
+      </w:r>
+      <w:r>
+        <w:rPr>
+          <w:rFonts w:ascii="Times New Roman" w:eastAsia="Times New Roman" w:hAnsi="Times New Roman" w:cs="Times New Roman"/>
+          <w:i/>
+          <w:iCs/>
+          <w:sz w:val="24"/>
+          <w:szCs w:val="24"/>
+        </w:rPr>
+        <w:t>academic burnout</w:t>
+      </w:r>
+      <w:r>
+        <w:rPr>
+          <w:rFonts w:ascii="Times New Roman" w:eastAsia="Times New Roman" w:hAnsi="Times New Roman" w:cs="Times New Roman"/>
+          <w:sz w:val="24"/>
+          <w:szCs w:val="24"/>
+        </w:rPr>
+        <w:t>. Dataset diperoleh dari sumber dataset publik yang relevan dengan topik penelitian. Selanjutnya, dataset tersebut disesuaikan dan dipersiapkan agar sesuai dengan kebutuhan penelitian sebelum digunakan dalam proses pembangunan model prediksi menggunakan algoritma Random Forest.</w:t>
+      </w:r>
+    </w:p>
+    <w:p>
+      <w:pPr>
+        <w:pStyle w:val="ListParagraph"/>
+        <w:tabs>
+          <w:tab w:val="left" w:pos="1276"/>
+          <w:tab w:val="right" w:leader="dot" w:pos="9072"/>
+        </w:tabs>
+        <w:ind w:left="993"/>
+        <w:jc w:val="both"/>
+        <w:rPr>
+          <w:rFonts w:ascii="Times New Roman" w:eastAsia="Times New Roman" w:hAnsi="Times New Roman" w:cs="Times New Roman"/>
+          <w:sz w:val="24"/>
+          <w:szCs w:val="24"/>
+        </w:rPr>
+      </w:pPr>
+    </w:p>
+    <w:p>
+      <w:pPr>
+        <w:pStyle w:val="ListParagraph"/>
+        <w:tabs>
+          <w:tab w:val="left" w:pos="1276"/>
+          <w:tab w:val="right" w:leader="dot" w:pos="9072"/>
+        </w:tabs>
+        <w:ind w:left="993"/>
+        <w:jc w:val="both"/>
+        <w:rPr>
+          <w:rFonts w:ascii="Times New Roman" w:eastAsia="Times New Roman" w:hAnsi="Times New Roman" w:cs="Times New Roman"/>
+          <w:sz w:val="24"/>
+          <w:szCs w:val="24"/>
+        </w:rPr>
+      </w:pPr>
+    </w:p>
+    <w:p>
+      <w:pPr>
+        <w:pStyle w:val="ListParagraph"/>
+        <w:tabs>
+          <w:tab w:val="left" w:pos="1276"/>
+          <w:tab w:val="right" w:leader="dot" w:pos="9072"/>
+        </w:tabs>
+        <w:ind w:left="993"/>
+        <w:jc w:val="center"/>
+        <w:rPr>
+          <w:rFonts w:ascii="Times New Roman" w:eastAsia="Times New Roman" w:hAnsi="Times New Roman" w:cs="Times New Roman"/>
+          <w:sz w:val="24"/>
+          <w:szCs w:val="24"/>
+        </w:rPr>
+      </w:pPr>
+      <w:r>
+        <w:rPr>
+          <w:rFonts w:ascii="Times New Roman" w:eastAsia="Times New Roman" w:hAnsi="Times New Roman" w:cs="Times New Roman"/>
+          <w:sz w:val="24"/>
+          <w:szCs w:val="24"/>
+        </w:rPr>
+        <w:t xml:space="preserve">Gambar 3.2 </w:t>
+      </w:r>
+      <w:r>
+        <w:rPr>
+          <w:rFonts w:ascii="Times New Roman" w:eastAsia="Times New Roman" w:hAnsi="Times New Roman" w:cs="Times New Roman"/>
+          <w:sz w:val="24"/>
+          <w:szCs w:val="24"/>
+        </w:rPr>
+        <w:t>Dataset Penelitian</w:t>
+      </w:r>
+    </w:p>
+    <w:p>
+      <w:pPr>
+        <w:tabs>
+          <w:tab w:val="left" w:pos="1276"/>
+          <w:tab w:val="right" w:leader="dot" w:pos="9072"/>
+        </w:tabs>
+        <w:ind w:left="426"/>
+        <w:jc w:val="both"/>
+        <w:rPr>
+          <w:rFonts w:ascii="Times New Roman" w:eastAsia="Times New Roman" w:hAnsi="Times New Roman" w:cs="Times New Roman"/>
+          <w:sz w:val="24"/>
+          <w:szCs w:val="24"/>
+        </w:rPr>
+      </w:pPr>
+      <w:r>
+        <w:rPr>
+          <w:rFonts w:ascii="Times New Roman" w:eastAsia="Times New Roman" w:hAnsi="Times New Roman" w:cs="Times New Roman"/>
+          <w:sz w:val="24"/>
+          <w:szCs w:val="24"/>
+        </w:rPr>
+        <w:t xml:space="preserve">3.1.2 Analisis Dataset </w:t>
+      </w:r>
+    </w:p>
+    <w:p>
+      <w:pPr>
+        <w:tabs>
+          <w:tab w:val="left" w:pos="1276"/>
+          <w:tab w:val="right" w:leader="dot" w:pos="9072"/>
+        </w:tabs>
+        <w:ind w:left="993" w:firstLine="141"/>
+        <w:jc w:val="both"/>
+        <w:rPr>
+          <w:rFonts w:ascii="Times New Roman" w:eastAsia="Times New Roman" w:hAnsi="Times New Roman" w:cs="Times New Roman"/>
+          <w:sz w:val="24"/>
+          <w:szCs w:val="24"/>
+        </w:rPr>
+      </w:pPr>
+      <w:r>
+        <w:rPr>
+          <w:rFonts w:ascii="Times New Roman" w:eastAsia="Times New Roman" w:hAnsi="Times New Roman" w:cs="Times New Roman"/>
+          <w:sz w:val="24"/>
+          <w:szCs w:val="24"/>
+        </w:rPr>
+        <w:tab/>
+      </w:r>
+      <w:r>
+        <w:rPr>
+          <w:rFonts w:ascii="Times New Roman" w:eastAsia="Times New Roman" w:hAnsi="Times New Roman" w:cs="Times New Roman"/>
+          <w:sz w:val="24"/>
+          <w:szCs w:val="24"/>
+        </w:rPr>
+        <w:t>Setelah dataset diperoleh, dilakukan analisis awal untuk memahami karakteristik data. Tahap ini meliputi identifikasi jumlah data, jumlah atribut, tipe data setiap variabel, statistik deskriptif, serta distribusi variabel target (</w:t>
+      </w:r>
+      <w:r>
+        <w:rPr>
+          <w:rFonts w:ascii="Times New Roman" w:eastAsia="Times New Roman" w:hAnsi="Times New Roman" w:cs="Times New Roman"/>
+          <w:i/>
+          <w:iCs/>
+          <w:sz w:val="24"/>
+          <w:szCs w:val="24"/>
+        </w:rPr>
+        <w:t>burnout_level</w:t>
+      </w:r>
+      <w:r>
+        <w:rPr>
+          <w:rFonts w:ascii="Times New Roman" w:eastAsia="Times New Roman" w:hAnsi="Times New Roman" w:cs="Times New Roman"/>
+          <w:sz w:val="24"/>
+          <w:szCs w:val="24"/>
+        </w:rPr>
+        <w:t xml:space="preserve">) yang digunakan dalam proses klasifikasi. Selain itu, dilakukan analisis terhadap struktur dataset untuk memastikan kualitas data sebelum memasuki tahap </w:t>
+      </w:r>
+      <w:r>
+        <w:rPr>
+          <w:rFonts w:ascii="Times New Roman" w:eastAsia="Times New Roman" w:hAnsi="Times New Roman" w:cs="Times New Roman"/>
+          <w:i/>
+          <w:iCs/>
+          <w:sz w:val="24"/>
+          <w:szCs w:val="24"/>
+        </w:rPr>
+        <w:t>data preprocessing</w:t>
+      </w:r>
+      <w:r>
+        <w:rPr>
+          <w:rFonts w:ascii="Times New Roman" w:eastAsia="Times New Roman" w:hAnsi="Times New Roman" w:cs="Times New Roman"/>
+          <w:sz w:val="24"/>
+          <w:szCs w:val="24"/>
+        </w:rPr>
+        <w:t xml:space="preserve">. Analisis </w:t>
+      </w:r>
+      <w:r>
+        <w:rPr>
+          <w:rFonts w:ascii="Times New Roman" w:eastAsia="Times New Roman" w:hAnsi="Times New Roman" w:cs="Times New Roman"/>
+          <w:sz w:val="24"/>
+          <w:szCs w:val="24"/>
+        </w:rPr>
+        <w:lastRenderedPageBreak/>
+        <w:t xml:space="preserve">dataset bertujuan untuk memberikan pemahaman mengenai karakteristik data sehingga langkah </w:t>
+      </w:r>
+      <w:r>
+        <w:rPr>
+          <w:rFonts w:ascii="Times New Roman" w:eastAsia="Times New Roman" w:hAnsi="Times New Roman" w:cs="Times New Roman"/>
+          <w:i/>
+          <w:iCs/>
+          <w:sz w:val="24"/>
+          <w:szCs w:val="24"/>
+        </w:rPr>
+        <w:t>preprocessing</w:t>
+      </w:r>
+      <w:r>
+        <w:rPr>
+          <w:rFonts w:ascii="Times New Roman" w:eastAsia="Times New Roman" w:hAnsi="Times New Roman" w:cs="Times New Roman"/>
+          <w:sz w:val="24"/>
+          <w:szCs w:val="24"/>
+        </w:rPr>
+        <w:t xml:space="preserve"> yang diterapkan dapat dilakukan secara tepat sesuai dengan kebutuhan penelitian.</w:t>
+      </w:r>
+    </w:p>
+    <w:p>
+      <w:pPr>
+        <w:tabs>
+          <w:tab w:val="left" w:pos="1276"/>
+          <w:tab w:val="right" w:leader="dot" w:pos="9072"/>
+        </w:tabs>
+        <w:ind w:left="993" w:firstLine="141"/>
+        <w:jc w:val="both"/>
+        <w:rPr>
+          <w:rFonts w:ascii="Times New Roman" w:eastAsia="Times New Roman" w:hAnsi="Times New Roman" w:cs="Times New Roman"/>
+          <w:sz w:val="24"/>
+          <w:szCs w:val="24"/>
+        </w:rPr>
+      </w:pPr>
+      <w:r>
+        <w:rPr>
+          <w:rFonts w:ascii="Times New Roman" w:eastAsia="Times New Roman" w:hAnsi="Times New Roman" w:cs="Times New Roman"/>
+          <w:noProof/>
+          <w:sz w:val="24"/>
+          <w:szCs w:val="24"/>
+        </w:rPr>
+        <w:drawing>
+          <wp:anchor distT="0" distB="0" distL="114300" distR="114300" simplePos="0" relativeHeight="251666432" behindDoc="0" locked="0" layoutInCell="1" allowOverlap="1" wp14:anchorId="285729A7" wp14:editId="4CF51F86">
+            <wp:simplePos x="0" y="0"/>
+            <wp:positionH relativeFrom="margin">
+              <wp:posOffset>306070</wp:posOffset>
+            </wp:positionH>
+            <wp:positionV relativeFrom="paragraph">
+              <wp:posOffset>277495</wp:posOffset>
+            </wp:positionV>
+            <wp:extent cx="5041900" cy="3683000"/>
+            <wp:effectExtent l="0" t="0" r="6350" b="0"/>
+            <wp:wrapTopAndBottom/>
+            <wp:docPr id="1326790410" name="Picture 4"/>
+            <wp:cNvGraphicFramePr>
+              <a:graphicFrameLocks xmlns:a="http://schemas.openxmlformats.org/drawingml/2006/main" noChangeAspect="1"/>
+            </wp:cNvGraphicFramePr>
+            <a:graphic xmlns:a="http://schemas.openxmlformats.org/drawingml/2006/main">
+              <a:graphicData uri="http://schemas.openxmlformats.org/drawingml/2006/picture">
+                <pic:pic xmlns:pic="http://schemas.openxmlformats.org/drawingml/2006/picture">
+                  <pic:nvPicPr>
+                    <pic:cNvPr id="1326790410" name="Picture 1326790410"/>
+                    <pic:cNvPicPr/>
+                  </pic:nvPicPr>
+                  <pic:blipFill>
+                    <a:blip r:embed="rId11">
+                      <a:extLst>
+                        <a:ext uri="{28A0092B-C50C-407E-A947-70E740481C1C}">
+                          <a14:useLocalDpi xmlns:a14="http://schemas.microsoft.com/office/drawing/2010/main" val="0"/>
+                        </a:ext>
+                      </a:extLst>
+                    </a:blip>
+                    <a:stretch>
+                      <a:fillRect/>
+                    </a:stretch>
+                  </pic:blipFill>
+                  <pic:spPr>
+                    <a:xfrm>
+                      <a:off x="0" y="0"/>
+                      <a:ext cx="5041900" cy="3683000"/>
+                    </a:xfrm>
+                    <a:prstGeom prst="rect">
+                      <a:avLst/>
+                    </a:prstGeom>
+                  </pic:spPr>
+                </pic:pic>
+              </a:graphicData>
+            </a:graphic>
+            <wp14:sizeRelH relativeFrom="page">
+              <wp14:pctWidth>0</wp14:pctWidth>
+            </wp14:sizeRelH>
+            <wp14:sizeRelV relativeFrom="page">
+              <wp14:pctHeight>0</wp14:pctHeight>
+            </wp14:sizeRelV>
+          </wp:anchor>
+        </w:drawing>
+      </w:r>
+    </w:p>
+    <w:p>
+      <w:pPr>
+        <w:tabs>
+          <w:tab w:val="left" w:pos="1276"/>
+          <w:tab w:val="right" w:leader="dot" w:pos="9072"/>
+        </w:tabs>
+        <w:ind w:left="993" w:firstLine="141"/>
+        <w:jc w:val="both"/>
+        <w:rPr>
+          <w:rFonts w:ascii="Times New Roman" w:eastAsia="Times New Roman" w:hAnsi="Times New Roman" w:cs="Times New Roman"/>
+          <w:sz w:val="24"/>
+          <w:szCs w:val="24"/>
+        </w:rPr>
+      </w:pPr>
+    </w:p>
+    <w:p>
+      <w:pPr>
+        <w:tabs>
+          <w:tab w:val="left" w:pos="1276"/>
+          <w:tab w:val="right" w:leader="dot" w:pos="9072"/>
+        </w:tabs>
+        <w:ind w:left="993" w:firstLine="141"/>
+        <w:jc w:val="center"/>
+        <w:rPr>
+          <w:rFonts w:ascii="Times New Roman" w:eastAsia="Times New Roman" w:hAnsi="Times New Roman" w:cs="Times New Roman"/>
+          <w:sz w:val="24"/>
+          <w:szCs w:val="24"/>
+        </w:rPr>
+      </w:pPr>
+      <w:r>
+        <w:rPr>
+          <w:rFonts w:ascii="Times New Roman" w:eastAsia="Times New Roman" w:hAnsi="Times New Roman" w:cs="Times New Roman"/>
+          <w:sz w:val="24"/>
+          <w:szCs w:val="24"/>
+        </w:rPr>
+        <w:t>Gambar 3.3 Informasi Dataset</w:t>
+      </w:r>
+    </w:p>
+    <w:p>
+      <w:pPr>
+        <w:tabs>
+          <w:tab w:val="left" w:pos="1276"/>
+          <w:tab w:val="right" w:leader="dot" w:pos="9072"/>
+        </w:tabs>
+        <w:ind w:left="426"/>
+        <w:jc w:val="both"/>
+        <w:rPr>
+          <w:rFonts w:ascii="Times New Roman" w:eastAsia="Times New Roman" w:hAnsi="Times New Roman" w:cs="Times New Roman"/>
+          <w:sz w:val="24"/>
+          <w:szCs w:val="24"/>
+        </w:rPr>
+      </w:pPr>
+      <w:r>
+        <w:rPr>
+          <w:rFonts w:ascii="Times New Roman" w:eastAsia="Times New Roman" w:hAnsi="Times New Roman" w:cs="Times New Roman"/>
+          <w:sz w:val="24"/>
+          <w:szCs w:val="24"/>
+        </w:rPr>
+        <w:t>3.1.3 Data Processing</w:t>
+      </w:r>
+    </w:p>
+    <w:p>
+      <w:pPr>
+        <w:tabs>
+          <w:tab w:val="left" w:pos="1276"/>
+          <w:tab w:val="right" w:leader="dot" w:pos="9072"/>
+        </w:tabs>
+        <w:ind w:left="993"/>
+        <w:jc w:val="both"/>
+        <w:rPr>
+          <w:rFonts w:ascii="Times New Roman" w:eastAsia="Times New Roman" w:hAnsi="Times New Roman" w:cs="Times New Roman"/>
+          <w:sz w:val="24"/>
+          <w:szCs w:val="24"/>
+        </w:rPr>
+      </w:pPr>
+      <w:r>
+        <w:rPr>
+          <w:rFonts w:ascii="Times New Roman" w:eastAsia="Times New Roman" w:hAnsi="Times New Roman" w:cs="Times New Roman"/>
+          <w:sz w:val="24"/>
+          <w:szCs w:val="24"/>
+        </w:rPr>
+        <w:tab/>
+      </w:r>
+      <w:r>
+        <w:rPr>
+          <w:rFonts w:ascii="Times New Roman" w:eastAsia="Times New Roman" w:hAnsi="Times New Roman" w:cs="Times New Roman"/>
+          <w:sz w:val="24"/>
+          <w:szCs w:val="24"/>
+        </w:rPr>
+        <w:t xml:space="preserve">Tahap </w:t>
+      </w:r>
+      <w:r>
+        <w:rPr>
+          <w:rFonts w:ascii="Times New Roman" w:eastAsia="Times New Roman" w:hAnsi="Times New Roman" w:cs="Times New Roman"/>
+          <w:i/>
+          <w:iCs/>
+          <w:sz w:val="24"/>
+          <w:szCs w:val="24"/>
+        </w:rPr>
+        <w:t>data preprocessing</w:t>
+      </w:r>
+      <w:r>
+        <w:rPr>
+          <w:rFonts w:ascii="Times New Roman" w:eastAsia="Times New Roman" w:hAnsi="Times New Roman" w:cs="Times New Roman"/>
+          <w:sz w:val="24"/>
+          <w:szCs w:val="24"/>
+        </w:rPr>
+        <w:t xml:space="preserve"> dilakukan untuk meningkatkan kualitas data sebelum digunakan dalam proses pelatihan model. Proses ini meliputi pemeriksaan nilai yang hilang (</w:t>
+      </w:r>
+      <w:r>
+        <w:rPr>
+          <w:rFonts w:ascii="Times New Roman" w:eastAsia="Times New Roman" w:hAnsi="Times New Roman" w:cs="Times New Roman"/>
+          <w:i/>
+          <w:iCs/>
+          <w:sz w:val="24"/>
+          <w:szCs w:val="24"/>
+        </w:rPr>
+        <w:t>missing value</w:t>
+      </w:r>
+      <w:r>
+        <w:rPr>
+          <w:rFonts w:ascii="Times New Roman" w:eastAsia="Times New Roman" w:hAnsi="Times New Roman" w:cs="Times New Roman"/>
+          <w:sz w:val="24"/>
+          <w:szCs w:val="24"/>
+        </w:rPr>
+        <w:t xml:space="preserve">), pengecekan data duplikat, transformasi data, </w:t>
+      </w:r>
+      <w:r>
+        <w:rPr>
+          <w:rFonts w:ascii="Times New Roman" w:eastAsia="Times New Roman" w:hAnsi="Times New Roman" w:cs="Times New Roman"/>
+          <w:i/>
+          <w:iCs/>
+          <w:sz w:val="24"/>
+          <w:szCs w:val="24"/>
+        </w:rPr>
+        <w:t>encoding</w:t>
+      </w:r>
+      <w:r>
+        <w:rPr>
+          <w:rFonts w:ascii="Times New Roman" w:eastAsia="Times New Roman" w:hAnsi="Times New Roman" w:cs="Times New Roman"/>
+          <w:sz w:val="24"/>
+          <w:szCs w:val="24"/>
+        </w:rPr>
+        <w:t xml:space="preserve"> pada variabel kategorikal, serta pemisahan variabel fitur (</w:t>
+      </w:r>
+      <w:r>
+        <w:rPr>
+          <w:rFonts w:ascii="Times New Roman" w:eastAsia="Times New Roman" w:hAnsi="Times New Roman" w:cs="Times New Roman"/>
+          <w:i/>
+          <w:iCs/>
+          <w:sz w:val="24"/>
+          <w:szCs w:val="24"/>
+        </w:rPr>
+        <w:t>feature</w:t>
+      </w:r>
+      <w:r>
+        <w:rPr>
+          <w:rFonts w:ascii="Times New Roman" w:eastAsia="Times New Roman" w:hAnsi="Times New Roman" w:cs="Times New Roman"/>
+          <w:sz w:val="24"/>
+          <w:szCs w:val="24"/>
+        </w:rPr>
+        <w:t>) dan variabel target (</w:t>
+      </w:r>
+      <w:r>
+        <w:rPr>
+          <w:rFonts w:ascii="Times New Roman" w:eastAsia="Times New Roman" w:hAnsi="Times New Roman" w:cs="Times New Roman"/>
+          <w:i/>
+          <w:iCs/>
+          <w:sz w:val="24"/>
+          <w:szCs w:val="24"/>
+        </w:rPr>
+        <w:t>target</w:t>
+      </w:r>
+      <w:r>
+        <w:rPr>
+          <w:rFonts w:ascii="Times New Roman" w:eastAsia="Times New Roman" w:hAnsi="Times New Roman" w:cs="Times New Roman"/>
+          <w:sz w:val="24"/>
+          <w:szCs w:val="24"/>
+        </w:rPr>
+        <w:t>) sehingga dataset siap digunakan dalam proses pelatihan menggunakan algoritma Random Forest.</w:t>
+      </w:r>
+    </w:p>
+    <w:p>
+      <w:pPr>
+        <w:tabs>
+          <w:tab w:val="left" w:pos="1276"/>
+          <w:tab w:val="right" w:leader="dot" w:pos="9072"/>
+        </w:tabs>
+        <w:ind w:left="993"/>
+        <w:jc w:val="both"/>
+        <w:rPr>
+          <w:rFonts w:ascii="Times New Roman" w:eastAsia="Times New Roman" w:hAnsi="Times New Roman" w:cs="Times New Roman"/>
+          <w:sz w:val="24"/>
+          <w:szCs w:val="24"/>
+        </w:rPr>
+      </w:pPr>
+    </w:p>
+    <w:p>
+      <w:pPr>
+        <w:tabs>
+          <w:tab w:val="left" w:pos="1276"/>
+          <w:tab w:val="right" w:leader="dot" w:pos="9072"/>
+        </w:tabs>
+        <w:ind w:left="993"/>
+        <w:jc w:val="both"/>
+        <w:rPr>
+          <w:rFonts w:ascii="Times New Roman" w:eastAsia="Times New Roman" w:hAnsi="Times New Roman" w:cs="Times New Roman"/>
+          <w:sz w:val="24"/>
+          <w:szCs w:val="24"/>
+        </w:rPr>
+      </w:pPr>
+    </w:p>
+    <w:p>
+      <w:pPr>
+        <w:tabs>
+          <w:tab w:val="left" w:pos="1276"/>
+          <w:tab w:val="right" w:leader="dot" w:pos="9072"/>
+        </w:tabs>
+        <w:ind w:left="993"/>
+        <w:jc w:val="center"/>
+        <w:rPr>
+          <w:rFonts w:ascii="Times New Roman" w:eastAsia="Times New Roman" w:hAnsi="Times New Roman" w:cs="Times New Roman"/>
+          <w:sz w:val="24"/>
+          <w:szCs w:val="24"/>
+        </w:rPr>
+      </w:pPr>
+    </w:p>
+    <w:p>
+      <w:pPr>
+        <w:tabs>
+          <w:tab w:val="left" w:pos="1276"/>
+          <w:tab w:val="right" w:leader="dot" w:pos="9072"/>
+        </w:tabs>
+        <w:ind w:left="993"/>
+        <w:jc w:val="center"/>
+        <w:rPr>
+          <w:rFonts w:ascii="Times New Roman" w:eastAsia="Times New Roman" w:hAnsi="Times New Roman" w:cs="Times New Roman"/>
+          <w:sz w:val="24"/>
+          <w:szCs w:val="24"/>
+        </w:rPr>
+      </w:pPr>
+    </w:p>
+    <w:p>
+      <w:pPr>
+        <w:tabs>
+          <w:tab w:val="left" w:pos="1276"/>
+          <w:tab w:val="right" w:leader="dot" w:pos="9072"/>
+        </w:tabs>
+        <w:jc w:val="center"/>
+        <w:rPr>
+          <w:rFonts w:ascii="Times New Roman" w:eastAsia="Times New Roman" w:hAnsi="Times New Roman" w:cs="Times New Roman"/>
+          <w:sz w:val="24"/>
+          <w:szCs w:val="24"/>
+        </w:rPr>
+      </w:pPr>
+      <w:r>
+        <w:rPr>
+          <w:rFonts w:ascii="Times New Roman" w:eastAsia="Times New Roman" w:hAnsi="Times New Roman" w:cs="Times New Roman"/>
+          <w:noProof/>
+          <w:sz w:val="24"/>
+          <w:szCs w:val="24"/>
+        </w:rPr>
+        <w:lastRenderedPageBreak/>
+        <w:drawing>
+          <wp:inline distT="0" distB="0" distL="0" distR="0" wp14:anchorId="432332A7" wp14:editId="1A13335B">
+            <wp:extent cx="3795089" cy="5486875"/>
+            <wp:effectExtent l="0" t="0" r="0" b="0"/>
+            <wp:docPr id="1456742216" name="Picture 6"/>
+            <wp:cNvGraphicFramePr>
+              <a:graphicFrameLocks xmlns:a="http://schemas.openxmlformats.org/drawingml/2006/main" noChangeAspect="1"/>
+            </wp:cNvGraphicFramePr>
+            <a:graphic xmlns:a="http://schemas.openxmlformats.org/drawingml/2006/main">
+              <a:graphicData uri="http://schemas.openxmlformats.org/drawingml/2006/picture">
+                <pic:pic xmlns:pic="http://schemas.openxmlformats.org/drawingml/2006/picture">
+                  <pic:nvPicPr>
+                    <pic:cNvPr id="1456742216" name="Picture 1456742216"/>
+                    <pic:cNvPicPr/>
+                  </pic:nvPicPr>
+                  <pic:blipFill>
+                    <a:blip r:embed="rId12">
+                      <a:extLst>
+                        <a:ext uri="{28A0092B-C50C-407E-A947-70E740481C1C}">
+                          <a14:useLocalDpi xmlns:a14="http://schemas.microsoft.com/office/drawing/2010/main" val="0"/>
+                        </a:ext>
+                      </a:extLst>
+                    </a:blip>
+                    <a:stretch>
+                      <a:fillRect/>
+                    </a:stretch>
+                  </pic:blipFill>
+                  <pic:spPr>
+                    <a:xfrm>
+                      <a:off x="0" y="0"/>
+                      <a:ext cx="3795089" cy="5486875"/>
+                    </a:xfrm>
+                    <a:prstGeom prst="rect">
+                      <a:avLst/>
+                    </a:prstGeom>
+                  </pic:spPr>
+                </pic:pic>
+              </a:graphicData>
+            </a:graphic>
+          </wp:inline>
+        </w:drawing>
+      </w:r>
+    </w:p>
+    <w:p>
+      <w:pPr>
+        <w:tabs>
+          <w:tab w:val="left" w:pos="1276"/>
+          <w:tab w:val="right" w:leader="dot" w:pos="9072"/>
+        </w:tabs>
+        <w:ind w:firstLine="426"/>
+        <w:jc w:val="center"/>
+        <w:rPr>
+          <w:rFonts w:ascii="Times New Roman" w:eastAsia="Times New Roman" w:hAnsi="Times New Roman" w:cs="Times New Roman"/>
+          <w:sz w:val="24"/>
+          <w:szCs w:val="24"/>
+        </w:rPr>
+      </w:pPr>
+      <w:r>
+        <w:rPr>
+          <w:rFonts w:ascii="Times New Roman" w:eastAsia="Times New Roman" w:hAnsi="Times New Roman" w:cs="Times New Roman"/>
+          <w:sz w:val="24"/>
+          <w:szCs w:val="24"/>
+        </w:rPr>
+        <w:t>Gambar 3.4 Data Preprocessing</w:t>
+      </w:r>
+    </w:p>
+    <w:p>
+      <w:pPr>
+        <w:tabs>
+          <w:tab w:val="left" w:pos="1276"/>
+          <w:tab w:val="right" w:leader="dot" w:pos="9072"/>
+        </w:tabs>
+        <w:ind w:firstLine="426"/>
+        <w:jc w:val="both"/>
+        <w:rPr>
+          <w:rFonts w:ascii="Times New Roman" w:eastAsia="Times New Roman" w:hAnsi="Times New Roman" w:cs="Times New Roman"/>
+          <w:sz w:val="24"/>
+          <w:szCs w:val="24"/>
+        </w:rPr>
+      </w:pPr>
+      <w:r>
+        <w:rPr>
+          <w:rFonts w:ascii="Times New Roman" w:eastAsia="Times New Roman" w:hAnsi="Times New Roman" w:cs="Times New Roman"/>
+          <w:sz w:val="24"/>
+          <w:szCs w:val="24"/>
+        </w:rPr>
+        <w:t>3.1.4 Pembagian Dataset</w:t>
+      </w:r>
+    </w:p>
+    <w:p>
+      <w:pPr>
+        <w:tabs>
+          <w:tab w:val="left" w:pos="1276"/>
+          <w:tab w:val="right" w:leader="dot" w:pos="9072"/>
+        </w:tabs>
+        <w:ind w:left="993" w:firstLine="283"/>
+        <w:jc w:val="both"/>
+        <w:rPr>
+          <w:rFonts w:ascii="Times New Roman" w:eastAsia="Times New Roman" w:hAnsi="Times New Roman" w:cs="Times New Roman"/>
+          <w:sz w:val="24"/>
+          <w:szCs w:val="24"/>
+        </w:rPr>
+      </w:pPr>
+      <w:r>
+        <w:rPr>
+          <w:rFonts w:ascii="Times New Roman" w:eastAsia="Times New Roman" w:hAnsi="Times New Roman" w:cs="Times New Roman"/>
+          <w:sz w:val="24"/>
+          <w:szCs w:val="24"/>
+        </w:rPr>
+        <w:t xml:space="preserve">Dataset yang telah melalui proses </w:t>
+      </w:r>
+      <w:r>
+        <w:rPr>
+          <w:rFonts w:ascii="Times New Roman" w:eastAsia="Times New Roman" w:hAnsi="Times New Roman" w:cs="Times New Roman"/>
+          <w:i/>
+          <w:iCs/>
+          <w:sz w:val="24"/>
+          <w:szCs w:val="24"/>
+        </w:rPr>
+        <w:t>data preprocessing</w:t>
+      </w:r>
+      <w:r>
+        <w:rPr>
+          <w:rFonts w:ascii="Times New Roman" w:eastAsia="Times New Roman" w:hAnsi="Times New Roman" w:cs="Times New Roman"/>
+          <w:sz w:val="24"/>
+          <w:szCs w:val="24"/>
+        </w:rPr>
+        <w:t xml:space="preserve"> kemudian dibagi menjadi data pelatihan (</w:t>
+      </w:r>
+      <w:r>
+        <w:rPr>
+          <w:rFonts w:ascii="Times New Roman" w:eastAsia="Times New Roman" w:hAnsi="Times New Roman" w:cs="Times New Roman"/>
+          <w:i/>
+          <w:iCs/>
+          <w:sz w:val="24"/>
+          <w:szCs w:val="24"/>
+        </w:rPr>
+        <w:t>training data</w:t>
+      </w:r>
+      <w:r>
+        <w:rPr>
+          <w:rFonts w:ascii="Times New Roman" w:eastAsia="Times New Roman" w:hAnsi="Times New Roman" w:cs="Times New Roman"/>
+          <w:sz w:val="24"/>
+          <w:szCs w:val="24"/>
+        </w:rPr>
+        <w:t>) dan data pengujian (</w:t>
+      </w:r>
+      <w:r>
+        <w:rPr>
+          <w:rFonts w:ascii="Times New Roman" w:eastAsia="Times New Roman" w:hAnsi="Times New Roman" w:cs="Times New Roman"/>
+          <w:i/>
+          <w:iCs/>
+          <w:sz w:val="24"/>
+          <w:szCs w:val="24"/>
+        </w:rPr>
+        <w:t>testing data</w:t>
+      </w:r>
+      <w:r>
+        <w:rPr>
+          <w:rFonts w:ascii="Times New Roman" w:eastAsia="Times New Roman" w:hAnsi="Times New Roman" w:cs="Times New Roman"/>
+          <w:sz w:val="24"/>
+          <w:szCs w:val="24"/>
+        </w:rPr>
+        <w:t xml:space="preserve">). Pembagian dataset dilakukan menggunakan metode </w:t>
+      </w:r>
+      <w:r>
+        <w:rPr>
+          <w:rFonts w:ascii="Times New Roman" w:eastAsia="Times New Roman" w:hAnsi="Times New Roman" w:cs="Times New Roman"/>
+          <w:i/>
+          <w:iCs/>
+          <w:sz w:val="24"/>
+          <w:szCs w:val="24"/>
+        </w:rPr>
+        <w:t>train-test split</w:t>
+      </w:r>
+      <w:r>
+        <w:rPr>
+          <w:rFonts w:ascii="Times New Roman" w:eastAsia="Times New Roman" w:hAnsi="Times New Roman" w:cs="Times New Roman"/>
+          <w:sz w:val="24"/>
+          <w:szCs w:val="24"/>
+        </w:rPr>
+        <w:t xml:space="preserve"> dengan proporsi </w:t>
+      </w:r>
+      <w:r>
+        <w:rPr>
+          <w:rFonts w:ascii="Times New Roman" w:eastAsia="Times New Roman" w:hAnsi="Times New Roman" w:cs="Times New Roman"/>
+          <w:b/>
+          <w:bCs/>
+          <w:sz w:val="24"/>
+          <w:szCs w:val="24"/>
+        </w:rPr>
+        <w:t>80% data pelatihan</w:t>
+      </w:r>
+      <w:r>
+        <w:rPr>
+          <w:rFonts w:ascii="Times New Roman" w:eastAsia="Times New Roman" w:hAnsi="Times New Roman" w:cs="Times New Roman"/>
+          <w:sz w:val="24"/>
+          <w:szCs w:val="24"/>
+        </w:rPr>
+        <w:t xml:space="preserve"> dan </w:t>
+      </w:r>
+      <w:r>
+        <w:rPr>
+          <w:rFonts w:ascii="Times New Roman" w:eastAsia="Times New Roman" w:hAnsi="Times New Roman" w:cs="Times New Roman"/>
+          <w:b/>
+          <w:bCs/>
+          <w:sz w:val="24"/>
+          <w:szCs w:val="24"/>
+        </w:rPr>
+        <w:t>20% data pengujian</w:t>
+      </w:r>
+      <w:r>
+        <w:rPr>
+          <w:rFonts w:ascii="Times New Roman" w:eastAsia="Times New Roman" w:hAnsi="Times New Roman" w:cs="Times New Roman"/>
+          <w:sz w:val="24"/>
+          <w:szCs w:val="24"/>
+        </w:rPr>
+        <w:t>. Data pelatihan digunakan untuk membangun model Random Forest, sedangkan data pengujian digunakan untuk mengukur kemampuan model dalam melakukan prediksi terhadap data yang belum pernah dipelajari sebelumnya. Tahap ini bertujuan untuk mengevaluasi kemampuan model dalam melakukan klasifikasi secara objektif terhadap data baru.</w:t>
+      </w:r>
+    </w:p>
+    <w:p>
+      <w:pPr>
+        <w:tabs>
+          <w:tab w:val="left" w:pos="1276"/>
+          <w:tab w:val="right" w:leader="dot" w:pos="9072"/>
+        </w:tabs>
+        <w:ind w:left="426"/>
+        <w:jc w:val="both"/>
+        <w:rPr>
+          <w:rFonts w:ascii="Times New Roman" w:eastAsia="Times New Roman" w:hAnsi="Times New Roman" w:cs="Times New Roman"/>
+          <w:sz w:val="24"/>
+          <w:szCs w:val="24"/>
+        </w:rPr>
+      </w:pPr>
+      <w:r>
+        <w:rPr>
+          <w:rFonts w:ascii="Times New Roman" w:eastAsia="Times New Roman" w:hAnsi="Times New Roman" w:cs="Times New Roman"/>
+          <w:sz w:val="24"/>
+          <w:szCs w:val="24"/>
+        </w:rPr>
+        <w:t>3.1.5 Pengembangan Model Random Forest</w:t>
+      </w:r>
+    </w:p>
+    <w:p>
+      <w:pPr>
+        <w:tabs>
+          <w:tab w:val="left" w:pos="1276"/>
+          <w:tab w:val="right" w:leader="dot" w:pos="9072"/>
+        </w:tabs>
+        <w:ind w:left="993"/>
+        <w:jc w:val="both"/>
+        <w:rPr>
+          <w:rFonts w:ascii="Times New Roman" w:eastAsia="Times New Roman" w:hAnsi="Times New Roman" w:cs="Times New Roman"/>
+          <w:sz w:val="24"/>
+          <w:szCs w:val="24"/>
+        </w:rPr>
+      </w:pPr>
+      <w:r>
+        <w:rPr>
+          <w:rFonts w:ascii="Times New Roman" w:eastAsia="Times New Roman" w:hAnsi="Times New Roman" w:cs="Times New Roman"/>
+          <w:sz w:val="24"/>
+          <w:szCs w:val="24"/>
+        </w:rPr>
+        <w:tab/>
+      </w:r>
+      <w:r>
+        <w:rPr>
+          <w:rFonts w:ascii="Times New Roman" w:eastAsia="Times New Roman" w:hAnsi="Times New Roman" w:cs="Times New Roman"/>
+          <w:sz w:val="24"/>
+          <w:szCs w:val="24"/>
+        </w:rPr>
+        <w:t xml:space="preserve">Pada tahap ini dilakukan pembangunan model klasifikasi menggunakan algoritma Random Forest. Model dilatih menggunakan </w:t>
+      </w:r>
+      <w:r>
+        <w:rPr>
+          <w:rFonts w:ascii="Times New Roman" w:eastAsia="Times New Roman" w:hAnsi="Times New Roman" w:cs="Times New Roman"/>
+          <w:sz w:val="24"/>
+          <w:szCs w:val="24"/>
+        </w:rPr>
+        <w:lastRenderedPageBreak/>
+        <w:t>data pelatihan (</w:t>
+      </w:r>
+      <w:r>
+        <w:rPr>
+          <w:rFonts w:ascii="Times New Roman" w:eastAsia="Times New Roman" w:hAnsi="Times New Roman" w:cs="Times New Roman"/>
+          <w:i/>
+          <w:iCs/>
+          <w:sz w:val="24"/>
+          <w:szCs w:val="24"/>
+        </w:rPr>
+        <w:t>training data</w:t>
+      </w:r>
+      <w:r>
+        <w:rPr>
+          <w:rFonts w:ascii="Times New Roman" w:eastAsia="Times New Roman" w:hAnsi="Times New Roman" w:cs="Times New Roman"/>
+          <w:sz w:val="24"/>
+          <w:szCs w:val="24"/>
+        </w:rPr>
+        <w:t xml:space="preserve">) untuk mempelajari hubungan antara faktor akademik, gaya hidup, dan kondisi psikologis mahasiswa terhadap tingkat </w:t>
+      </w:r>
+      <w:r>
+        <w:rPr>
+          <w:rFonts w:ascii="Times New Roman" w:eastAsia="Times New Roman" w:hAnsi="Times New Roman" w:cs="Times New Roman"/>
+          <w:i/>
+          <w:iCs/>
+          <w:sz w:val="24"/>
+          <w:szCs w:val="24"/>
+        </w:rPr>
+        <w:t>academic burnout</w:t>
+      </w:r>
+      <w:r>
+        <w:rPr>
+          <w:rFonts w:ascii="Times New Roman" w:eastAsia="Times New Roman" w:hAnsi="Times New Roman" w:cs="Times New Roman"/>
+          <w:sz w:val="24"/>
+          <w:szCs w:val="24"/>
+        </w:rPr>
+        <w:t>. Setelah proses pelatihan selesai, model digunakan untuk melakukan prediksi terhadap data pengujian (</w:t>
+      </w:r>
+      <w:r>
+        <w:rPr>
+          <w:rFonts w:ascii="Times New Roman" w:eastAsia="Times New Roman" w:hAnsi="Times New Roman" w:cs="Times New Roman"/>
+          <w:i/>
+          <w:iCs/>
+          <w:sz w:val="24"/>
+          <w:szCs w:val="24"/>
+        </w:rPr>
+        <w:t>testing data</w:t>
+      </w:r>
+      <w:r>
+        <w:rPr>
+          <w:rFonts w:ascii="Times New Roman" w:eastAsia="Times New Roman" w:hAnsi="Times New Roman" w:cs="Times New Roman"/>
+          <w:sz w:val="24"/>
+          <w:szCs w:val="24"/>
+        </w:rPr>
+        <w:t xml:space="preserve">). Selanjutnya, hasil prediksi dibandingkan dengan data aktual untuk mengetahui kemampuan model dalam mengklasifikasikan tingkat </w:t>
+      </w:r>
+      <w:r>
+        <w:rPr>
+          <w:rFonts w:ascii="Times New Roman" w:eastAsia="Times New Roman" w:hAnsi="Times New Roman" w:cs="Times New Roman"/>
+          <w:i/>
+          <w:iCs/>
+          <w:sz w:val="24"/>
+          <w:szCs w:val="24"/>
+        </w:rPr>
+        <w:t>academic burnout</w:t>
+      </w:r>
+      <w:r>
+        <w:rPr>
+          <w:rFonts w:ascii="Times New Roman" w:eastAsia="Times New Roman" w:hAnsi="Times New Roman" w:cs="Times New Roman"/>
+          <w:sz w:val="24"/>
+          <w:szCs w:val="24"/>
+        </w:rPr>
+        <w:t xml:space="preserve"> mahasiswa.</w:t>
+      </w:r>
+    </w:p>
+    <w:p>
+      <w:pPr>
+        <w:tabs>
+          <w:tab w:val="left" w:pos="1276"/>
+          <w:tab w:val="right" w:leader="dot" w:pos="9072"/>
+        </w:tabs>
+        <w:ind w:left="426"/>
+        <w:jc w:val="both"/>
+        <w:rPr>
+          <w:rFonts w:ascii="Times New Roman" w:eastAsia="Times New Roman" w:hAnsi="Times New Roman" w:cs="Times New Roman"/>
+          <w:sz w:val="24"/>
+          <w:szCs w:val="24"/>
+        </w:rPr>
+      </w:pPr>
+      <w:r>
+        <w:rPr>
+          <w:rFonts w:ascii="Times New Roman" w:eastAsia="Times New Roman" w:hAnsi="Times New Roman" w:cs="Times New Roman"/>
+          <w:sz w:val="24"/>
+          <w:szCs w:val="24"/>
+        </w:rPr>
+        <w:t xml:space="preserve">3.1.6 Evaluasi Model </w:t>
+      </w:r>
+    </w:p>
+    <w:p>
+      <w:pPr>
+        <w:tabs>
+          <w:tab w:val="left" w:pos="1276"/>
+          <w:tab w:val="right" w:leader="dot" w:pos="9072"/>
+        </w:tabs>
+        <w:ind w:left="993" w:firstLine="141"/>
+        <w:jc w:val="both"/>
+        <w:rPr>
+          <w:rFonts w:ascii="Times New Roman" w:eastAsia="Times New Roman" w:hAnsi="Times New Roman" w:cs="Times New Roman"/>
+          <w:sz w:val="24"/>
+          <w:szCs w:val="24"/>
+        </w:rPr>
+      </w:pPr>
+      <w:r>
+        <w:rPr>
+          <w:rFonts w:ascii="Times New Roman" w:eastAsia="Times New Roman" w:hAnsi="Times New Roman" w:cs="Times New Roman"/>
+          <w:sz w:val="24"/>
+          <w:szCs w:val="24"/>
+        </w:rPr>
+        <w:tab/>
+      </w:r>
+      <w:r>
+        <w:rPr>
+          <w:rFonts w:ascii="Times New Roman" w:eastAsia="Times New Roman" w:hAnsi="Times New Roman" w:cs="Times New Roman"/>
+          <w:sz w:val="24"/>
+          <w:szCs w:val="24"/>
+        </w:rPr>
+        <w:tab/>
+      </w:r>
+      <w:r>
+        <w:rPr>
+          <w:rFonts w:ascii="Times New Roman" w:eastAsia="Times New Roman" w:hAnsi="Times New Roman" w:cs="Times New Roman"/>
+          <w:sz w:val="24"/>
+          <w:szCs w:val="24"/>
+        </w:rPr>
+        <w:t xml:space="preserve">Model yang telah dibangun kemudian dievaluasi untuk mengetahui tingkat kinerjanya. Evaluasi dilakukan menggunakan metrik </w:t>
+      </w:r>
+      <w:r>
+        <w:rPr>
+          <w:rFonts w:ascii="Times New Roman" w:eastAsia="Times New Roman" w:hAnsi="Times New Roman" w:cs="Times New Roman"/>
+          <w:i/>
+          <w:iCs/>
+          <w:sz w:val="24"/>
+          <w:szCs w:val="24"/>
+        </w:rPr>
+        <w:t>accuracy</w:t>
+      </w:r>
+      <w:r>
+        <w:rPr>
+          <w:rFonts w:ascii="Times New Roman" w:eastAsia="Times New Roman" w:hAnsi="Times New Roman" w:cs="Times New Roman"/>
+          <w:sz w:val="24"/>
+          <w:szCs w:val="24"/>
+        </w:rPr>
+        <w:t xml:space="preserve">, </w:t>
+      </w:r>
+      <w:r>
+        <w:rPr>
+          <w:rFonts w:ascii="Times New Roman" w:eastAsia="Times New Roman" w:hAnsi="Times New Roman" w:cs="Times New Roman"/>
+          <w:i/>
+          <w:iCs/>
+          <w:sz w:val="24"/>
+          <w:szCs w:val="24"/>
+        </w:rPr>
+        <w:t>precision</w:t>
+      </w:r>
+      <w:r>
+        <w:rPr>
+          <w:rFonts w:ascii="Times New Roman" w:eastAsia="Times New Roman" w:hAnsi="Times New Roman" w:cs="Times New Roman"/>
+          <w:sz w:val="24"/>
+          <w:szCs w:val="24"/>
+        </w:rPr>
+        <w:t xml:space="preserve">, </w:t>
+      </w:r>
+      <w:r>
+        <w:rPr>
+          <w:rFonts w:ascii="Times New Roman" w:eastAsia="Times New Roman" w:hAnsi="Times New Roman" w:cs="Times New Roman"/>
+          <w:i/>
+          <w:iCs/>
+          <w:sz w:val="24"/>
+          <w:szCs w:val="24"/>
+        </w:rPr>
+        <w:t>recall</w:t>
+      </w:r>
+      <w:r>
+        <w:rPr>
+          <w:rFonts w:ascii="Times New Roman" w:eastAsia="Times New Roman" w:hAnsi="Times New Roman" w:cs="Times New Roman"/>
+          <w:sz w:val="24"/>
+          <w:szCs w:val="24"/>
+        </w:rPr>
+        <w:t xml:space="preserve">, dan </w:t>
+      </w:r>
+      <w:r>
+        <w:rPr>
+          <w:rFonts w:ascii="Times New Roman" w:eastAsia="Times New Roman" w:hAnsi="Times New Roman" w:cs="Times New Roman"/>
+          <w:i/>
+          <w:iCs/>
+          <w:sz w:val="24"/>
+          <w:szCs w:val="24"/>
+        </w:rPr>
+        <w:t>F1-score</w:t>
+      </w:r>
+      <w:r>
+        <w:rPr>
+          <w:rFonts w:ascii="Times New Roman" w:eastAsia="Times New Roman" w:hAnsi="Times New Roman" w:cs="Times New Roman"/>
+          <w:sz w:val="24"/>
+          <w:szCs w:val="24"/>
+        </w:rPr>
+        <w:t xml:space="preserve">. Hasil evaluasi digunakan untuk menilai kemampuan model dalam mengklasifikasikan tingkat </w:t>
+      </w:r>
+      <w:r>
+        <w:rPr>
+          <w:rFonts w:ascii="Times New Roman" w:eastAsia="Times New Roman" w:hAnsi="Times New Roman" w:cs="Times New Roman"/>
+          <w:i/>
+          <w:iCs/>
+          <w:sz w:val="24"/>
+          <w:szCs w:val="24"/>
+        </w:rPr>
+        <w:t>academic burnout</w:t>
+      </w:r>
+      <w:r>
+        <w:rPr>
+          <w:rFonts w:ascii="Times New Roman" w:eastAsia="Times New Roman" w:hAnsi="Times New Roman" w:cs="Times New Roman"/>
+          <w:sz w:val="24"/>
+          <w:szCs w:val="24"/>
+        </w:rPr>
+        <w:t xml:space="preserve"> mahasiswa secara akurat.</w:t>
+      </w:r>
+    </w:p>
+    <w:p>
+      <w:pPr>
+        <w:tabs>
+          <w:tab w:val="left" w:pos="1276"/>
+          <w:tab w:val="right" w:leader="dot" w:pos="9072"/>
+        </w:tabs>
+        <w:ind w:left="426"/>
+        <w:jc w:val="both"/>
+        <w:rPr>
+          <w:rFonts w:ascii="Times New Roman" w:eastAsia="Times New Roman" w:hAnsi="Times New Roman" w:cs="Times New Roman"/>
+          <w:sz w:val="24"/>
+          <w:szCs w:val="24"/>
+        </w:rPr>
+      </w:pPr>
+      <w:r>
+        <w:rPr>
+          <w:rFonts w:ascii="Times New Roman" w:eastAsia="Times New Roman" w:hAnsi="Times New Roman" w:cs="Times New Roman"/>
+          <w:sz w:val="24"/>
+          <w:szCs w:val="24"/>
+        </w:rPr>
+        <w:t>3.1.7 Implementasi Aplikasi Menggunakan Streamlit</w:t>
+      </w:r>
+    </w:p>
+    <w:p>
+      <w:pPr>
+        <w:ind w:left="993" w:firstLine="283"/>
+        <w:rPr>
+          <w:rFonts w:ascii="Times New Roman" w:eastAsia="Times New Roman" w:hAnsi="Times New Roman" w:cs="Times New Roman"/>
+          <w:sz w:val="24"/>
+          <w:szCs w:val="24"/>
+        </w:rPr>
+      </w:pPr>
+      <w:r>
+        <w:rPr>
+          <w:rFonts w:ascii="Times New Roman" w:eastAsia="Times New Roman" w:hAnsi="Times New Roman" w:cs="Times New Roman"/>
+          <w:sz w:val="24"/>
+          <w:szCs w:val="24"/>
+        </w:rPr>
+        <w:t xml:space="preserve">Tahap terakhir dalam penelitian ini adalah mengimplementasikan model Random Forest ke dalam aplikasi berbasis web menggunakan Streamlit. Aplikasi ini dirancang agar pengguna dapat memasukkan data akademik, gaya hidup, dan kondisi psikologis mahasiswa melalui antarmuka yang interaktif. Selanjutnya, sistem akan memproses data masukan menggunakan model Random Forest yang telah dilatih dan menampilkan hasil prediksi tingkat </w:t>
+      </w:r>
+      <w:r>
+        <w:rPr>
+          <w:rFonts w:ascii="Times New Roman" w:eastAsia="Times New Roman" w:hAnsi="Times New Roman" w:cs="Times New Roman"/>
+          <w:i/>
+          <w:iCs/>
+          <w:sz w:val="24"/>
+          <w:szCs w:val="24"/>
+        </w:rPr>
+        <w:t>academic burnout</w:t>
+      </w:r>
+      <w:r>
+        <w:rPr>
+          <w:rFonts w:ascii="Times New Roman" w:eastAsia="Times New Roman" w:hAnsi="Times New Roman" w:cs="Times New Roman"/>
+          <w:sz w:val="24"/>
+          <w:szCs w:val="24"/>
+        </w:rPr>
+        <w:t xml:space="preserve"> mahasiswa secara otomatis.</w:t>
+      </w:r>
+      <w:r>
+        <w:rPr>
+          <w:rFonts w:ascii="Times New Roman" w:eastAsia="Times New Roman" w:hAnsi="Times New Roman" w:cs="Times New Roman"/>
+          <w:sz w:val="24"/>
+          <w:szCs w:val="24"/>
+        </w:rPr>
+        <w:br w:type="page"/>
       </w:r>
     </w:p>
     <w:sectPr>
@@ -36549,6 +38731,56 @@
     </w:sectPr>
   </w:body>
 </w:document>
+</file>
+
+<file path=word/endnotes.xml><?xml version="1.0" encoding="utf-8"?>
+<w:endnotes xmlns:wpc="http://schemas.microsoft.com/office/word/2010/wordprocessingCanvas" xmlns:cx="http://schemas.microsoft.com/office/drawing/2014/chartex" xmlns:cx1="http://schemas.microsoft.com/office/drawing/2015/9/8/chartex" xmlns:cx2="http://schemas.microsoft.com/office/drawing/2015/10/21/chartex" xmlns:cx3="http://schemas.microsoft.com/office/drawing/2016/5/9/chartex" xmlns:cx4="http://schemas.microsoft.com/office/drawing/2016/5/10/chartex" xmlns:cx5="http://schemas.microsoft.com/office/drawing/2016/5/11/chartex" xmlns:cx6="http://schemas.microsoft.com/office/drawing/2016/5/12/chartex" xmlns:cx7="http://schemas.microsoft.com/office/drawing/2016/5/13/chartex" xmlns:cx8="http://schemas.microsoft.com/office/drawing/2016/5/14/chartex" xmlns:mc="http://schemas.openxmlformats.org/markup-compatibility/2006" xmlns:aink="http://schemas.microsoft.com/office/drawing/2016/ink" xmlns:am3d="http://schemas.microsoft.com/office/drawing/2017/model3d" xmlns:o="urn:schemas-microsoft-com:office:office" xmlns:oel="http://schemas.microsoft.com/office/2019/extlst" xmlns:r="http://schemas.openxmlformats.org/officeDocument/2006/relationships" xmlns:m="http://schemas.openxmlformats.org/officeDocument/2006/math" xmlns:v="urn:schemas-microsoft-com:vml" xmlns:wp14="http://schemas.microsoft.com/office/word/2010/wordprocessingDrawing" xmlns:wp="http://schemas.openxmlformats.org/drawingml/2006/wordprocessingDrawing" xmlns:w10="urn:schemas-microsoft-com:office:word" xmlns:w="http://schemas.openxmlformats.org/wordprocessingml/2006/main" xmlns:w14="http://schemas.microsoft.com/office/word/2010/wordml" xmlns:w15="http://schemas.microsoft.com/office/word/2012/wordml" xmlns:w16cex="http://schemas.microsoft.com/office/word/2018/wordml/cex" xmlns:w16cid="http://schemas.microsoft.com/office/word/2016/wordml/cid" xmlns:w16="http://schemas.microsoft.com/office/word/2018/wordml" xmlns:w16du="http://schemas.microsoft.com/office/word/2023/wordml/word16du" xmlns:w16sdtdh="http://schemas.microsoft.com/office/word/2020/wordml/sdtdatahash" xmlns:w16sdtfl="http://schemas.microsoft.com/office/word/2024/wordml/sdtformatlock" xmlns:w16se="http://schemas.microsoft.com/office/word/2015/wordml/symex" xmlns:wpg="http://schemas.microsoft.com/office/word/2010/wordprocessingGroup" xmlns:wpi="http://schemas.microsoft.com/office/word/2010/wordprocessingInk" xmlns:wne="http://schemas.microsoft.com/office/word/2006/wordml" xmlns:wps="http://schemas.microsoft.com/office/word/2010/wordprocessingShape" mc:Ignorable="w14 w15 w16se w16cid w16 w16cex w16sdtdh w16sdtfl w16du wp14">
+  <w:endnote w:type="separator" w:id="-1">
+    <w:p>
+      <w:pPr>
+        <w:spacing w:line="240" w:lineRule="auto"/>
+      </w:pPr>
+      <w:r>
+        <w:separator/>
+      </w:r>
+    </w:p>
+  </w:endnote>
+  <w:endnote w:type="continuationSeparator" w:id="0">
+    <w:p>
+      <w:pPr>
+        <w:spacing w:line="240" w:lineRule="auto"/>
+      </w:pPr>
+      <w:r>
+        <w:continuationSeparator/>
+      </w:r>
+    </w:p>
+  </w:endnote>
+</w:endnotes>
+</file>
+
+<file path=word/footnotes.xml><?xml version="1.0" encoding="utf-8"?>
+<w:footnotes xmlns:wpc="http://schemas.microsoft.com/office/word/2010/wordprocessingCanvas" xmlns:cx="http://schemas.microsoft.com/office/drawing/2014/chartex" xmlns:cx1="http://schemas.microsoft.com/office/drawing/2015/9/8/chartex" xmlns:cx2="http://schemas.microsoft.com/office/drawing/2015/10/21/chartex" xmlns:cx3="http://schemas.microsoft.com/office/drawing/2016/5/9/chartex" xmlns:cx4="http://schemas.microsoft.com/office/drawing/2016/5/10/chartex" xmlns:cx5="http://schemas.microsoft.com/office/drawing/2016/5/11/chartex" xmlns:cx6="http://schemas.microsoft.com/office/drawing/2016/5/12/chartex" xmlns:cx7="http://schemas.microsoft.com/office/drawing/2016/5/13/chartex" xmlns:cx8="http://schemas.microsoft.com/office/drawing/2016/5/14/chartex" xmlns:mc="http://schemas.openxmlformats.org/markup-compatibility/2006" xmlns:aink="http://schemas.microsoft.com/office/drawing/2016/ink" xmlns:am3d="http://schemas.microsoft.com/office/drawing/2017/model3d" xmlns:o="urn:schemas-microsoft-com:office:office" xmlns:oel="http://schemas.microsoft.com/office/2019/extlst" xmlns:r="http://schemas.openxmlformats.org/officeDocument/2006/relationships" xmlns:m="http://schemas.openxmlformats.org/officeDocument/2006/math" xmlns:v="urn:schemas-microsoft-com:vml" xmlns:wp14="http://schemas.microsoft.com/office/word/2010/wordprocessingDrawing" xmlns:wp="http://schemas.openxmlformats.org/drawingml/2006/wordprocessingDrawing" xmlns:w10="urn:schemas-microsoft-com:office:word" xmlns:w="http://schemas.openxmlformats.org/wordprocessingml/2006/main" xmlns:w14="http://schemas.microsoft.com/office/word/2010/wordml" xmlns:w15="http://schemas.microsoft.com/office/word/2012/wordml" xmlns:w16cex="http://schemas.microsoft.com/office/word/2018/wordml/cex" xmlns:w16cid="http://schemas.microsoft.com/office/word/2016/wordml/cid" xmlns:w16="http://schemas.microsoft.com/office/word/2018/wordml" xmlns:w16du="http://schemas.microsoft.com/office/word/2023/wordml/word16du" xmlns:w16sdtdh="http://schemas.microsoft.com/office/word/2020/wordml/sdtdatahash" xmlns:w16sdtfl="http://schemas.microsoft.com/office/word/2024/wordml/sdtformatlock" xmlns:w16se="http://schemas.microsoft.com/office/word/2015/wordml/symex" xmlns:wpg="http://schemas.microsoft.com/office/word/2010/wordprocessingGroup" xmlns:wpi="http://schemas.microsoft.com/office/word/2010/wordprocessingInk" xmlns:wne="http://schemas.microsoft.com/office/word/2006/wordml" xmlns:wps="http://schemas.microsoft.com/office/word/2010/wordprocessingShape" mc:Ignorable="w14 w15 w16se w16cid w16 w16cex w16sdtdh w16sdtfl w16du wp14">
+  <w:footnote w:type="separator" w:id="-1">
+    <w:p>
+      <w:pPr>
+        <w:spacing w:line="240" w:lineRule="auto"/>
+      </w:pPr>
+      <w:r>
+        <w:separator/>
+      </w:r>
+    </w:p>
+  </w:footnote>
+  <w:footnote w:type="continuationSeparator" w:id="0">
+    <w:p>
+      <w:pPr>
+        <w:spacing w:line="240" w:lineRule="auto"/>
+      </w:pPr>
+      <w:r>
+        <w:continuationSeparator/>
+      </w:r>
+    </w:p>
+  </w:footnote>
+</w:footnotes>
 </file>
 
 <file path=word/numbering.xml><?xml version="1.0" encoding="utf-8"?>
@@ -36756,6 +38988,119 @@
     </w:lvl>
   </w:abstractNum>
   <w:abstractNum w:abstractNumId="2" w15:restartNumberingAfterBreak="0">
+    <w:nsid w:val="0DB749B1"/>
+    <w:multiLevelType w:val="multilevel"/>
+    <w:tmpl w:val="C1101200"/>
+    <w:lvl w:ilvl="0">
+      <w:start w:val="1"/>
+      <w:numFmt w:val="decimal"/>
+      <w:lvlText w:val="%1."/>
+      <w:lvlJc w:val="left"/>
+      <w:pPr>
+        <w:tabs>
+          <w:tab w:val="num" w:pos="720"/>
+        </w:tabs>
+        <w:ind w:left="720" w:hanging="360"/>
+      </w:pPr>
+    </w:lvl>
+    <w:lvl w:ilvl="1" w:tentative="1">
+      <w:start w:val="1"/>
+      <w:numFmt w:val="decimal"/>
+      <w:lvlText w:val="%2."/>
+      <w:lvlJc w:val="left"/>
+      <w:pPr>
+        <w:tabs>
+          <w:tab w:val="num" w:pos="1440"/>
+        </w:tabs>
+        <w:ind w:left="1440" w:hanging="360"/>
+      </w:pPr>
+    </w:lvl>
+    <w:lvl w:ilvl="2" w:tentative="1">
+      <w:start w:val="1"/>
+      <w:numFmt w:val="decimal"/>
+      <w:lvlText w:val="%3."/>
+      <w:lvlJc w:val="left"/>
+      <w:pPr>
+        <w:tabs>
+          <w:tab w:val="num" w:pos="2160"/>
+        </w:tabs>
+        <w:ind w:left="2160" w:hanging="360"/>
+      </w:pPr>
+    </w:lvl>
+    <w:lvl w:ilvl="3" w:tentative="1">
+      <w:start w:val="1"/>
+      <w:numFmt w:val="decimal"/>
+      <w:lvlText w:val="%4."/>
+      <w:lvlJc w:val="left"/>
+      <w:pPr>
+        <w:tabs>
+          <w:tab w:val="num" w:pos="2880"/>
+        </w:tabs>
+        <w:ind w:left="2880" w:hanging="360"/>
+      </w:pPr>
+    </w:lvl>
+    <w:lvl w:ilvl="4" w:tentative="1">
+      <w:start w:val="1"/>
+      <w:numFmt w:val="decimal"/>
+      <w:lvlText w:val="%5."/>
+      <w:lvlJc w:val="left"/>
+      <w:pPr>
+        <w:tabs>
+          <w:tab w:val="num" w:pos="3600"/>
+        </w:tabs>
+        <w:ind w:left="3600" w:hanging="360"/>
+      </w:pPr>
+    </w:lvl>
+    <w:lvl w:ilvl="5" w:tentative="1">
+      <w:start w:val="1"/>
+      <w:numFmt w:val="decimal"/>
+      <w:lvlText w:val="%6."/>
+      <w:lvlJc w:val="left"/>
+      <w:pPr>
+        <w:tabs>
+          <w:tab w:val="num" w:pos="4320"/>
+        </w:tabs>
+        <w:ind w:left="4320" w:hanging="360"/>
+      </w:pPr>
+    </w:lvl>
+    <w:lvl w:ilvl="6" w:tentative="1">
+      <w:start w:val="1"/>
+      <w:numFmt w:val="decimal"/>
+      <w:lvlText w:val="%7."/>
+      <w:lvlJc w:val="left"/>
+      <w:pPr>
+        <w:tabs>
+          <w:tab w:val="num" w:pos="5040"/>
+        </w:tabs>
+        <w:ind w:left="5040" w:hanging="360"/>
+      </w:pPr>
+    </w:lvl>
+    <w:lvl w:ilvl="7" w:tentative="1">
+      <w:start w:val="1"/>
+      <w:numFmt w:val="decimal"/>
+      <w:lvlText w:val="%8."/>
+      <w:lvlJc w:val="left"/>
+      <w:pPr>
+        <w:tabs>
+          <w:tab w:val="num" w:pos="5760"/>
+        </w:tabs>
+        <w:ind w:left="5760" w:hanging="360"/>
+      </w:pPr>
+    </w:lvl>
+    <w:lvl w:ilvl="8" w:tentative="1">
+      <w:start w:val="1"/>
+      <w:numFmt w:val="decimal"/>
+      <w:lvlText w:val="%9."/>
+      <w:lvlJc w:val="left"/>
+      <w:pPr>
+        <w:tabs>
+          <w:tab w:val="num" w:pos="6480"/>
+        </w:tabs>
+        <w:ind w:left="6480" w:hanging="360"/>
+      </w:pPr>
+    </w:lvl>
+  </w:abstractNum>
+  <w:abstractNum w:abstractNumId="3" w15:restartNumberingAfterBreak="0">
     <w:nsid w:val="14553272"/>
     <w:multiLevelType w:val="hybridMultilevel"/>
     <w:tmpl w:val="C4B26A56"/>
@@ -36844,7 +39189,7 @@
       </w:pPr>
     </w:lvl>
   </w:abstractNum>
-  <w:abstractNum w:abstractNumId="3" w15:restartNumberingAfterBreak="0">
+  <w:abstractNum w:abstractNumId="4" w15:restartNumberingAfterBreak="0">
     <w:nsid w:val="1A347C84"/>
     <w:multiLevelType w:val="multilevel"/>
     <w:tmpl w:val="6A20BAB4"/>
@@ -36957,7 +39302,7 @@
       </w:pPr>
     </w:lvl>
   </w:abstractNum>
-  <w:abstractNum w:abstractNumId="4" w15:restartNumberingAfterBreak="0">
+  <w:abstractNum w:abstractNumId="5" w15:restartNumberingAfterBreak="0">
     <w:nsid w:val="1FC86D94"/>
     <w:multiLevelType w:val="multilevel"/>
     <w:tmpl w:val="3809001F"/>
@@ -37043,7 +39388,93 @@
       </w:pPr>
     </w:lvl>
   </w:abstractNum>
-  <w:abstractNum w:abstractNumId="5" w15:restartNumberingAfterBreak="0">
+  <w:abstractNum w:abstractNumId="6" w15:restartNumberingAfterBreak="0">
+    <w:nsid w:val="22DA3031"/>
+    <w:multiLevelType w:val="hybridMultilevel"/>
+    <w:tmpl w:val="2872E6F8"/>
+    <w:lvl w:ilvl="0" w:tplc="3809000F">
+      <w:start w:val="1"/>
+      <w:numFmt w:val="decimal"/>
+      <w:lvlText w:val="%1."/>
+      <w:lvlJc w:val="left"/>
+      <w:pPr>
+        <w:ind w:left="1152" w:hanging="360"/>
+      </w:pPr>
+    </w:lvl>
+    <w:lvl w:ilvl="1" w:tplc="38090019" w:tentative="1">
+      <w:start w:val="1"/>
+      <w:numFmt w:val="lowerLetter"/>
+      <w:lvlText w:val="%2."/>
+      <w:lvlJc w:val="left"/>
+      <w:pPr>
+        <w:ind w:left="1872" w:hanging="360"/>
+      </w:pPr>
+    </w:lvl>
+    <w:lvl w:ilvl="2" w:tplc="3809001B" w:tentative="1">
+      <w:start w:val="1"/>
+      <w:numFmt w:val="lowerRoman"/>
+      <w:lvlText w:val="%3."/>
+      <w:lvlJc w:val="right"/>
+      <w:pPr>
+        <w:ind w:left="2592" w:hanging="180"/>
+      </w:pPr>
+    </w:lvl>
+    <w:lvl w:ilvl="3" w:tplc="3809000F" w:tentative="1">
+      <w:start w:val="1"/>
+      <w:numFmt w:val="decimal"/>
+      <w:lvlText w:val="%4."/>
+      <w:lvlJc w:val="left"/>
+      <w:pPr>
+        <w:ind w:left="3312" w:hanging="360"/>
+      </w:pPr>
+    </w:lvl>
+    <w:lvl w:ilvl="4" w:tplc="38090019" w:tentative="1">
+      <w:start w:val="1"/>
+      <w:numFmt w:val="lowerLetter"/>
+      <w:lvlText w:val="%5."/>
+      <w:lvlJc w:val="left"/>
+      <w:pPr>
+        <w:ind w:left="4032" w:hanging="360"/>
+      </w:pPr>
+    </w:lvl>
+    <w:lvl w:ilvl="5" w:tplc="3809001B" w:tentative="1">
+      <w:start w:val="1"/>
+      <w:numFmt w:val="lowerRoman"/>
+      <w:lvlText w:val="%6."/>
+      <w:lvlJc w:val="right"/>
+      <w:pPr>
+        <w:ind w:left="4752" w:hanging="180"/>
+      </w:pPr>
+    </w:lvl>
+    <w:lvl w:ilvl="6" w:tplc="3809000F" w:tentative="1">
+      <w:start w:val="1"/>
+      <w:numFmt w:val="decimal"/>
+      <w:lvlText w:val="%7."/>
+      <w:lvlJc w:val="left"/>
+      <w:pPr>
+        <w:ind w:left="5472" w:hanging="360"/>
+      </w:pPr>
+    </w:lvl>
+    <w:lvl w:ilvl="7" w:tplc="38090019" w:tentative="1">
+      <w:start w:val="1"/>
+      <w:numFmt w:val="lowerLetter"/>
+      <w:lvlText w:val="%8."/>
+      <w:lvlJc w:val="left"/>
+      <w:pPr>
+        <w:ind w:left="6192" w:hanging="360"/>
+      </w:pPr>
+    </w:lvl>
+    <w:lvl w:ilvl="8" w:tplc="3809001B" w:tentative="1">
+      <w:start w:val="1"/>
+      <w:numFmt w:val="lowerRoman"/>
+      <w:lvlText w:val="%9."/>
+      <w:lvlJc w:val="right"/>
+      <w:pPr>
+        <w:ind w:left="6912" w:hanging="180"/>
+      </w:pPr>
+    </w:lvl>
+  </w:abstractNum>
+  <w:abstractNum w:abstractNumId="7" w15:restartNumberingAfterBreak="0">
     <w:nsid w:val="2D332FEA"/>
     <w:multiLevelType w:val="multilevel"/>
     <w:tmpl w:val="CE484686"/>
@@ -37156,7 +39587,7 @@
       </w:rPr>
     </w:lvl>
   </w:abstractNum>
-  <w:abstractNum w:abstractNumId="6" w15:restartNumberingAfterBreak="0">
+  <w:abstractNum w:abstractNumId="8" w15:restartNumberingAfterBreak="0">
     <w:nsid w:val="377C4DEE"/>
     <w:multiLevelType w:val="multilevel"/>
     <w:tmpl w:val="B41649BE"/>
@@ -37269,7 +39700,7 @@
       </w:pPr>
     </w:lvl>
   </w:abstractNum>
-  <w:abstractNum w:abstractNumId="7" w15:restartNumberingAfterBreak="0">
+  <w:abstractNum w:abstractNumId="9" w15:restartNumberingAfterBreak="0">
     <w:nsid w:val="44437543"/>
     <w:multiLevelType w:val="hybridMultilevel"/>
     <w:tmpl w:val="4C46AC78"/>
@@ -37358,7 +39789,93 @@
       </w:pPr>
     </w:lvl>
   </w:abstractNum>
-  <w:abstractNum w:abstractNumId="8" w15:restartNumberingAfterBreak="0">
+  <w:abstractNum w:abstractNumId="10" w15:restartNumberingAfterBreak="0">
+    <w:nsid w:val="45FB7F42"/>
+    <w:multiLevelType w:val="multilevel"/>
+    <w:tmpl w:val="3809001F"/>
+    <w:lvl w:ilvl="0">
+      <w:start w:val="1"/>
+      <w:numFmt w:val="decimal"/>
+      <w:lvlText w:val="%1."/>
+      <w:lvlJc w:val="left"/>
+      <w:pPr>
+        <w:ind w:left="360" w:hanging="360"/>
+      </w:pPr>
+    </w:lvl>
+    <w:lvl w:ilvl="1">
+      <w:start w:val="1"/>
+      <w:numFmt w:val="decimal"/>
+      <w:lvlText w:val="%1.%2."/>
+      <w:lvlJc w:val="left"/>
+      <w:pPr>
+        <w:ind w:left="792" w:hanging="432"/>
+      </w:pPr>
+    </w:lvl>
+    <w:lvl w:ilvl="2">
+      <w:start w:val="1"/>
+      <w:numFmt w:val="decimal"/>
+      <w:lvlText w:val="%1.%2.%3."/>
+      <w:lvlJc w:val="left"/>
+      <w:pPr>
+        <w:ind w:left="1224" w:hanging="504"/>
+      </w:pPr>
+    </w:lvl>
+    <w:lvl w:ilvl="3">
+      <w:start w:val="1"/>
+      <w:numFmt w:val="decimal"/>
+      <w:lvlText w:val="%1.%2.%3.%4."/>
+      <w:lvlJc w:val="left"/>
+      <w:pPr>
+        <w:ind w:left="1728" w:hanging="648"/>
+      </w:pPr>
+    </w:lvl>
+    <w:lvl w:ilvl="4">
+      <w:start w:val="1"/>
+      <w:numFmt w:val="decimal"/>
+      <w:lvlText w:val="%1.%2.%3.%4.%5."/>
+      <w:lvlJc w:val="left"/>
+      <w:pPr>
+        <w:ind w:left="2232" w:hanging="792"/>
+      </w:pPr>
+    </w:lvl>
+    <w:lvl w:ilvl="5">
+      <w:start w:val="1"/>
+      <w:numFmt w:val="decimal"/>
+      <w:lvlText w:val="%1.%2.%3.%4.%5.%6."/>
+      <w:lvlJc w:val="left"/>
+      <w:pPr>
+        <w:ind w:left="2736" w:hanging="936"/>
+      </w:pPr>
+    </w:lvl>
+    <w:lvl w:ilvl="6">
+      <w:start w:val="1"/>
+      <w:numFmt w:val="decimal"/>
+      <w:lvlText w:val="%1.%2.%3.%4.%5.%6.%7."/>
+      <w:lvlJc w:val="left"/>
+      <w:pPr>
+        <w:ind w:left="3240" w:hanging="1080"/>
+      </w:pPr>
+    </w:lvl>
+    <w:lvl w:ilvl="7">
+      <w:start w:val="1"/>
+      <w:numFmt w:val="decimal"/>
+      <w:lvlText w:val="%1.%2.%3.%4.%5.%6.%7.%8."/>
+      <w:lvlJc w:val="left"/>
+      <w:pPr>
+        <w:ind w:left="3744" w:hanging="1224"/>
+      </w:pPr>
+    </w:lvl>
+    <w:lvl w:ilvl="8">
+      <w:start w:val="1"/>
+      <w:numFmt w:val="decimal"/>
+      <w:lvlText w:val="%1.%2.%3.%4.%5.%6.%7.%8.%9."/>
+      <w:lvlJc w:val="left"/>
+      <w:pPr>
+        <w:ind w:left="4320" w:hanging="1440"/>
+      </w:pPr>
+    </w:lvl>
+  </w:abstractNum>
+  <w:abstractNum w:abstractNumId="11" w15:restartNumberingAfterBreak="0">
     <w:nsid w:val="51223952"/>
     <w:multiLevelType w:val="multilevel"/>
     <w:tmpl w:val="7CCAF82C"/>
@@ -37471,7 +39988,7 @@
       </w:pPr>
     </w:lvl>
   </w:abstractNum>
-  <w:abstractNum w:abstractNumId="9" w15:restartNumberingAfterBreak="0">
+  <w:abstractNum w:abstractNumId="12" w15:restartNumberingAfterBreak="0">
     <w:nsid w:val="7AB54C68"/>
     <w:multiLevelType w:val="multilevel"/>
     <w:tmpl w:val="D2C8D2B4"/>
@@ -37585,22 +40102,22 @@
     </w:lvl>
   </w:abstractNum>
   <w:num w:numId="1" w16cid:durableId="634331181">
-    <w:abstractNumId w:val="6"/>
+    <w:abstractNumId w:val="8"/>
   </w:num>
   <w:num w:numId="2" w16cid:durableId="61803012">
-    <w:abstractNumId w:val="5"/>
+    <w:abstractNumId w:val="7"/>
   </w:num>
   <w:num w:numId="3" w16cid:durableId="1046294824">
-    <w:abstractNumId w:val="8"/>
+    <w:abstractNumId w:val="11"/>
   </w:num>
   <w:num w:numId="4" w16cid:durableId="135340792">
-    <w:abstractNumId w:val="3"/>
+    <w:abstractNumId w:val="4"/>
   </w:num>
   <w:num w:numId="5" w16cid:durableId="1558204017">
-    <w:abstractNumId w:val="9"/>
+    <w:abstractNumId w:val="12"/>
   </w:num>
   <w:num w:numId="6" w16cid:durableId="1271627481">
-    <w:abstractNumId w:val="4"/>
+    <w:abstractNumId w:val="5"/>
   </w:num>
   <w:num w:numId="7" w16cid:durableId="1239633781">
     <w:abstractNumId w:val="0"/>
@@ -37609,10 +40126,19 @@
     <w:abstractNumId w:val="1"/>
   </w:num>
   <w:num w:numId="9" w16cid:durableId="1172523128">
-    <w:abstractNumId w:val="2"/>
+    <w:abstractNumId w:val="3"/>
   </w:num>
   <w:num w:numId="10" w16cid:durableId="700279749">
-    <w:abstractNumId w:val="7"/>
+    <w:abstractNumId w:val="9"/>
+  </w:num>
+  <w:num w:numId="11" w16cid:durableId="812793363">
+    <w:abstractNumId w:val="6"/>
+  </w:num>
+  <w:num w:numId="12" w16cid:durableId="52044426">
+    <w:abstractNumId w:val="10"/>
+  </w:num>
+  <w:num w:numId="13" w16cid:durableId="1858889777">
+    <w:abstractNumId w:val="2"/>
   </w:num>
 </w:numbering>
 </file>
@@ -38133,7 +40659,6 @@
   <w:style w:type="character" w:default="1" w:styleId="DefaultParagraphFont">
     <w:name w:val="Default Paragraph Font"/>
     <w:uiPriority w:val="1"/>
-    <w:semiHidden/>
     <w:unhideWhenUsed/>
   </w:style>
   <w:style w:type="table" w:default="1" w:styleId="TableNormal">
@@ -38265,6 +40790,50 @@
         <w:insideV w:val="single" w:sz="4" w:space="0" w:color="auto"/>
       </w:tblBorders>
     </w:tblPr>
+  </w:style>
+  <w:style w:type="paragraph" w:styleId="Header">
+    <w:name w:val="header"/>
+    <w:basedOn w:val="Normal"/>
+    <w:link w:val="HeaderChar"/>
+    <w:uiPriority w:val="99"/>
+    <w:unhideWhenUsed/>
+    <w:rsid w:val="000300F0"/>
+    <w:pPr>
+      <w:tabs>
+        <w:tab w:val="center" w:pos="4513"/>
+        <w:tab w:val="right" w:pos="9026"/>
+      </w:tabs>
+      <w:spacing w:line="240" w:lineRule="auto"/>
+    </w:pPr>
+  </w:style>
+  <w:style w:type="character" w:customStyle="1" w:styleId="HeaderChar">
+    <w:name w:val="Header Char"/>
+    <w:basedOn w:val="DefaultParagraphFont"/>
+    <w:link w:val="Header"/>
+    <w:uiPriority w:val="99"/>
+    <w:rsid w:val="000300F0"/>
+  </w:style>
+  <w:style w:type="paragraph" w:styleId="Footer">
+    <w:name w:val="footer"/>
+    <w:basedOn w:val="Normal"/>
+    <w:link w:val="FooterChar"/>
+    <w:uiPriority w:val="99"/>
+    <w:unhideWhenUsed/>
+    <w:rsid w:val="000300F0"/>
+    <w:pPr>
+      <w:tabs>
+        <w:tab w:val="center" w:pos="4513"/>
+        <w:tab w:val="right" w:pos="9026"/>
+      </w:tabs>
+      <w:spacing w:line="240" w:lineRule="auto"/>
+    </w:pPr>
+  </w:style>
+  <w:style w:type="character" w:customStyle="1" w:styleId="FooterChar">
+    <w:name w:val="Footer Char"/>
+    <w:basedOn w:val="DefaultParagraphFont"/>
+    <w:link w:val="Footer"/>
+    <w:uiPriority w:val="99"/>
+    <w:rsid w:val="000300F0"/>
   </w:style>
 </w:styles>
 </file>

</xml_diff>